<commit_message>
Reorganiza la documentacion segun la estructura del Capitulo III (3.1-3.9): capitulo completo con Figura 3.1 y Tablas 3.1-3.5 (incluye cross-dataset congelado y robustez), anexos tecnicos renumerados a 3.3-3.6 y README con el mapa de secciones
Co-Authored-By: Claude Opus 5.5 <noreply@anthropic.com>
Claude-Session: https://claude.ai/code/session_0153ECmVtHffrApi7B7wry8e
</commit_message>
<xml_diff>
--- a/6_documentacion/Flujo_Metodologico_Capitulo_III.docx
+++ b/6_documentacion/Flujo_Metodologico_Capitulo_III.docx
@@ -4,34 +4,18 @@
   <w:body>
     <w:p>
       <w:pPr>
-        <w:jc w:val="center"/>
+        <w:pStyle w:val="Heading1"/>
       </w:pPr>
       <w:r>
-        <w:rPr>
-          <w:b/>
-          <w:sz w:val="32"/>
-        </w:rPr>
-        <w:t>FLUJO METODOLÓGICO</w:t>
-      </w:r>
-    </w:p>
-    <w:p>
-      <w:pPr>
-        <w:jc w:val="center"/>
-      </w:pPr>
-      <w:r>
-        <w:rPr>
-          <w:b/>
-          <w:sz w:val="26"/>
-        </w:rPr>
         <w:t>Capítulo III: Evaluación de Modelos Base</w:t>
       </w:r>
     </w:p>
     <w:p>
       <w:pPr>
-        <w:pStyle w:val="Heading1"/>
+        <w:pStyle w:val="Heading2"/>
       </w:pPr>
       <w:r>
-        <w:t>1. Propósito del flujo metodológico</w:t>
+        <w:t>3.1. Introducción</w:t>
       </w:r>
     </w:p>
     <w:p>
@@ -39,7 +23,7 @@
         <w:jc w:val="both"/>
       </w:pPr>
       <w:r>
-        <w:t>El flujo metodológico establece la secuencia de actividades para evaluar y comparar los diez modelos base y seleccionar aquellos que serán utilizados como modelos de referencia en las fases posteriores de la investigación. Para garantizar una comparación consistente, todos los modelos son sometidos a un procedimiento común que comprende la preparación y partición de los datos, el entrenamiento, la validación, la evaluación sobre datos de prueba y la consolidación de los resultados.</w:t>
+        <w:t>El presente capítulo tiene como propósito identificar los modelos de Machine Learning con mejor desempeño en la clasificación de la frescura del pescado a partir de imágenes oculares y determinar en qué medida dicho desempeño se ve afectado por la variabilidad visual existente entre distintos conjuntos de datos. De esta manera, el capítulo da respuesta al primer y segundo objetivo específico de la investigación y establece la línea base experimental frente a la cual se comparará el modelo propuesto.</w:t>
       </w:r>
     </w:p>
     <w:p>
@@ -47,7 +31,7 @@
         <w:jc w:val="both"/>
       </w:pPr>
       <w:r>
-        <w:t>La evaluación se realiza mediante validación cruzada estratificada de cinco folds, permitiendo analizar el desempeño de cada arquitectura sobre diferentes particiones del conjunto de datos. En cada fold, el entrenamiento se realiza de manera independiente, utilizando el conjunto de validación para seleccionar el mejor checkpoint y reservando el conjunto de prueba exclusivamente para la evaluación final del modelo correspondiente.</w:t>
+        <w:t>En relación con el método de investigación (sección 2.4.2), el capítulo desarrolla sus dos primeras fases. La Fase 1 (línea base), asociada al Objetivo Específico 1, se ejecuta en las secciones 3.2 a 3.6 y concluye con la selección de los modelos de referencia a partir de su desempeño intra-dataset. La Fase 2 (diagnóstico), asociada al Objetivo Específico 2, se ejecuta en las secciones 3.7 y 3.8 y trabaja únicamente con los modelos seleccionados. Finalmente, la sección 3.9 consolida los productos de ambas fases. Cabe precisar que en las secciones 3.2 y 3.3 se preparan también los conjuntos de datos de los dominios objetivo y se define el esquema cross-dataset, insumos que se emplean posteriormente en la Fase 2.</w:t>
       </w:r>
     </w:p>
     <w:p>
@@ -55,7 +39,7 @@
         <w:jc w:val="both"/>
       </w:pPr>
       <w:r>
-        <w:t>Posteriormente, las predicciones obtenidas en los cinco conjuntos de prueba se integran como predicciones out-of-fold (OOF), de modo que cada imagen dispone de una predicción generada por un modelo que no la utilizó durante su entrenamiento. Sobre estas predicciones se calculan métricas globales (pooled) como resumen complementario del desempeño. En paralelo, los resultados obtenidos en cada fold permiten caracterizar la variabilidad y estabilidad del modelo entre particiones.</w:t>
+        <w:t>El capítulo se organiza en cinco etapas secuenciales. En la primera etapa (preparación) se describen los conjuntos de datos y su procesamiento común, que comprende la depuración, el recorte de la región ocular, la homologación de las categorías de frescura entre dominios y la normalización; en esta etapa no se entrena ningún modelo, y se diferencia el conjunto fuente, que se particiona para el entrenamiento, de los conjuntos objetivo, que se reservan hasta la evaluación cross-dataset. Asimismo, se define el diseño experimental común que se aplicará a todos los modelos candidatos. En la segunda etapa (implementación y evaluación intra-dataset) se entrenan los modelos candidatos en el dominio fuente y se compara su desempeño. En la tercera etapa (selección) se eligen los modelos de referencia que conforman la línea base experimental. En la cuarta etapa (evaluación cross-dataset y análisis) se evalúan los modelos de referencia sobre los dominios objetivo y se cuantifica el efecto de la variabilidad visual sobre su desempeño y su robustez. Finalmente, en la quinta etapa (consolidación) se sintetizan los resultados en la línea base experimental, que constituye el insumo para el desarrollo del modelo propuesto en el Capítulo IV y para su validación en el Capítulo V.</w:t>
       </w:r>
     </w:p>
     <w:p>
@@ -63,15 +47,23 @@
         <w:jc w:val="both"/>
       </w:pPr>
       <w:r>
-        <w:t>Finalmente, la evidencia obtenida permite seleccionar los modelos de referencia que continuarán en las siguientes fases experimentales. De esta manera, el flujo asegura que la selección no dependa de un único resultado o de una sola partición de los datos, sino de un proceso sistemático, documentado y sustentado en criterios cuantitativos de evaluación.</w:t>
+        <w:t>En la Figura 3.1 se presenta el flujo del capítulo, en el que se resume para cada sección qué se busca y el resultado esperado.</w:t>
       </w:r>
     </w:p>
     <w:p>
-      <w:pPr>
-        <w:pStyle w:val="Heading1"/>
-      </w:pPr>
       <w:r>
-        <w:t>2. Flujo metodológico</w:t>
+        <w:rPr>
+          <w:b/>
+        </w:rPr>
+        <w:t>Figura 3.1</w:t>
+      </w:r>
+    </w:p>
+    <w:p>
+      <w:r>
+        <w:rPr>
+          <w:i/>
+        </w:rPr>
+        <w:t>Flujo del Capítulo III: Evaluación de Modelos Base</w:t>
       </w:r>
     </w:p>
     <w:p>
@@ -81,7 +73,7 @@
       <w:r>
         <w:drawing>
           <wp:inline xmlns:a="http://schemas.openxmlformats.org/drawingml/2006/main" xmlns:pic="http://schemas.openxmlformats.org/drawingml/2006/picture">
-            <wp:extent cx="5220000" cy="7251447"/>
+            <wp:extent cx="5580000" cy="11139101"/>
             <wp:docPr id="1" name="Picture 1"/>
             <wp:cNvGraphicFramePr>
               <a:graphicFrameLocks noChangeAspect="1"/>
@@ -102,7 +94,7 @@
                   <pic:spPr>
                     <a:xfrm>
                       <a:off x="0" y="0"/>
-                      <a:ext cx="5220000" cy="7251447"/>
+                      <a:ext cx="5580000" cy="11139101"/>
                     </a:xfrm>
                     <a:prstGeom prst="rect"/>
                   </pic:spPr>
@@ -114,20 +106,11 @@
       </w:r>
     </w:p>
     <w:p>
-      <w:pPr>
-        <w:jc w:val="center"/>
-      </w:pPr>
       <w:r>
         <w:rPr>
-          <w:b/>
+          <w:sz w:val="18"/>
         </w:rPr>
-        <w:t xml:space="preserve">Figura 1. </w:t>
-      </w:r>
-      <w:r>
-        <w:rPr>
-          <w:i/>
-        </w:rPr>
-        <w:t>Flujo metodológico para la evaluación y selección de los modelos base. Fuente: elaboración propia.</w:t>
+        <w:t>Fuente: Elaboración propia.</w:t>
       </w:r>
     </w:p>
     <w:p>
@@ -135,15 +118,420 @@
         <w:jc w:val="both"/>
       </w:pPr>
       <w:r>
-        <w:t>La lectura del flujo es secuencial. Cada etapa recibe la salida de la etapa anterior y agrega un control metodológico específico. Primero se fija el conjunto de datos; después se construyen particiones comparables; luego se someten los diez modelos al mismo principio de entrenamiento y selección del checkpoint; posteriormente se evalúan sobre datos de prueba independientes y se consolidan los resultados de los cinco folds; finalmente, esos resultados se comparan con varios criterios y se seleccionan los modelos de referencia.</w:t>
+        <w:t>En la Tabla 3.1 se muestra la correspondencia entre las secciones del capítulo y las fases y actividades del método de investigación.</w:t>
       </w:r>
     </w:p>
     <w:p>
-      <w:pPr>
-        <w:pStyle w:val="Heading1"/>
-      </w:pPr>
       <w:r>
-        <w:t>3. Explicación detallada del flujo metodológico</w:t>
+        <w:rPr>
+          <w:b/>
+        </w:rPr>
+        <w:t>Tabla 3.1</w:t>
+      </w:r>
+    </w:p>
+    <w:p>
+      <w:r>
+        <w:rPr>
+          <w:i/>
+        </w:rPr>
+        <w:t>Correspondencia entre las secciones del Capítulo III y el método de investigación</w:t>
+      </w:r>
+    </w:p>
+    <w:tbl>
+      <w:tblPr>
+        <w:tblStyle w:val="TableGrid"/>
+        <w:tblW w:type="auto" w:w="0"/>
+        <w:jc w:val="center"/>
+        <w:tblLayout w:type="fixed"/>
+        <w:tblLook w:firstColumn="1" w:firstRow="1" w:lastColumn="0" w:lastRow="0" w:noHBand="0" w:noVBand="1" w:val="04A0"/>
+      </w:tblPr>
+      <w:tblGrid>
+        <w:gridCol w:w="907"/>
+        <w:gridCol w:w="1587"/>
+        <w:gridCol w:w="6576"/>
+      </w:tblGrid>
+      <w:tr>
+        <w:tc>
+          <w:tcPr>
+            <w:tcW w:type="dxa" w:w="907"/>
+            <w:shd w:val="clear" w:color="auto" w:fill="D9E2F3"/>
+          </w:tcPr>
+          <w:p>
+            <w:r>
+              <w:rPr>
+                <w:b/>
+                <w:sz w:val="19"/>
+              </w:rPr>
+              <w:t>Sección</w:t>
+            </w:r>
+          </w:p>
+        </w:tc>
+        <w:tc>
+          <w:tcPr>
+            <w:tcW w:type="dxa" w:w="1587"/>
+            <w:shd w:val="clear" w:color="auto" w:fill="D9E2F3"/>
+          </w:tcPr>
+          <w:p>
+            <w:r>
+              <w:rPr>
+                <w:b/>
+                <w:sz w:val="19"/>
+              </w:rPr>
+              <w:t>Fase del método</w:t>
+            </w:r>
+          </w:p>
+        </w:tc>
+        <w:tc>
+          <w:tcPr>
+            <w:tcW w:type="dxa" w:w="6576"/>
+            <w:shd w:val="clear" w:color="auto" w:fill="D9E2F3"/>
+          </w:tcPr>
+          <w:p>
+            <w:r>
+              <w:rPr>
+                <w:b/>
+                <w:sz w:val="19"/>
+              </w:rPr>
+              <w:t>Actividad del método de investigación que se desarrolla</w:t>
+            </w:r>
+          </w:p>
+        </w:tc>
+      </w:tr>
+      <w:tr>
+        <w:tc>
+          <w:tcPr>
+            <w:tcW w:type="dxa" w:w="907"/>
+          </w:tcPr>
+          <w:p>
+            <w:r>
+              <w:rPr>
+                <w:sz w:val="19"/>
+              </w:rPr>
+              <w:t>3.2</w:t>
+            </w:r>
+          </w:p>
+        </w:tc>
+        <w:tc>
+          <w:tcPr>
+            <w:tcW w:type="dxa" w:w="1587"/>
+          </w:tcPr>
+          <w:p>
+            <w:r>
+              <w:rPr>
+                <w:sz w:val="19"/>
+              </w:rPr>
+              <w:t>Fase 1 y Fase 2</w:t>
+            </w:r>
+          </w:p>
+        </w:tc>
+        <w:tc>
+          <w:tcPr>
+            <w:tcW w:type="dxa" w:w="6576"/>
+          </w:tcPr>
+          <w:p>
+            <w:r>
+              <w:rPr>
+                <w:sz w:val="19"/>
+              </w:rPr>
+              <w:t>Seleccionar y preparar el conjunto de datos base para el entrenamiento de los modelos (Fase 1). Seleccionar los conjuntos de datos experimentales con diferencias visuales representativas en iluminación, fondo y condiciones de adquisición (Fase 2).</w:t>
+            </w:r>
+          </w:p>
+        </w:tc>
+      </w:tr>
+      <w:tr>
+        <w:tc>
+          <w:tcPr>
+            <w:tcW w:type="dxa" w:w="907"/>
+          </w:tcPr>
+          <w:p>
+            <w:r>
+              <w:rPr>
+                <w:sz w:val="19"/>
+              </w:rPr>
+              <w:t>3.3</w:t>
+            </w:r>
+          </w:p>
+        </w:tc>
+        <w:tc>
+          <w:tcPr>
+            <w:tcW w:type="dxa" w:w="1587"/>
+          </w:tcPr>
+          <w:p>
+            <w:r>
+              <w:rPr>
+                <w:sz w:val="19"/>
+              </w:rPr>
+              <w:t>Fase 1 y Fase 2</w:t>
+            </w:r>
+          </w:p>
+        </w:tc>
+        <w:tc>
+          <w:tcPr>
+            <w:tcW w:type="dxa" w:w="6576"/>
+          </w:tcPr>
+          <w:p>
+            <w:r>
+              <w:rPr>
+                <w:sz w:val="19"/>
+              </w:rPr>
+              <w:t>Identificar y seleccionar los algoritmos con mejor respaldo en la literatura científica para su evaluación comparativa (Fase 1). Diseñar el esquema experimental de transferencia entre conjuntos de datos (cross-dataset) (Fase 2).</w:t>
+            </w:r>
+          </w:p>
+        </w:tc>
+      </w:tr>
+      <w:tr>
+        <w:tc>
+          <w:tcPr>
+            <w:tcW w:type="dxa" w:w="907"/>
+          </w:tcPr>
+          <w:p>
+            <w:r>
+              <w:rPr>
+                <w:sz w:val="19"/>
+              </w:rPr>
+              <w:t>3.4</w:t>
+            </w:r>
+          </w:p>
+        </w:tc>
+        <w:tc>
+          <w:tcPr>
+            <w:tcW w:type="dxa" w:w="1587"/>
+          </w:tcPr>
+          <w:p>
+            <w:r>
+              <w:rPr>
+                <w:sz w:val="19"/>
+              </w:rPr>
+              <w:t>Fase 1</w:t>
+            </w:r>
+          </w:p>
+        </w:tc>
+        <w:tc>
+          <w:tcPr>
+            <w:tcW w:type="dxa" w:w="6576"/>
+          </w:tcPr>
+          <w:p>
+            <w:r>
+              <w:rPr>
+                <w:sz w:val="19"/>
+              </w:rPr>
+              <w:t>Entrenar los modelos seleccionados bajo condiciones homogéneas de evaluación.</w:t>
+            </w:r>
+          </w:p>
+        </w:tc>
+      </w:tr>
+      <w:tr>
+        <w:tc>
+          <w:tcPr>
+            <w:tcW w:type="dxa" w:w="907"/>
+          </w:tcPr>
+          <w:p>
+            <w:r>
+              <w:rPr>
+                <w:sz w:val="19"/>
+              </w:rPr>
+              <w:t>3.5</w:t>
+            </w:r>
+          </w:p>
+        </w:tc>
+        <w:tc>
+          <w:tcPr>
+            <w:tcW w:type="dxa" w:w="1587"/>
+          </w:tcPr>
+          <w:p>
+            <w:r>
+              <w:rPr>
+                <w:sz w:val="19"/>
+              </w:rPr>
+              <w:t>Fase 1</w:t>
+            </w:r>
+          </w:p>
+        </w:tc>
+        <w:tc>
+          <w:tcPr>
+            <w:tcW w:type="dxa" w:w="6576"/>
+          </w:tcPr>
+          <w:p>
+            <w:r>
+              <w:rPr>
+                <w:sz w:val="19"/>
+              </w:rPr>
+              <w:t>Comparar el desempeño de los modelos entrenados mediante métricas de clasificación.</w:t>
+            </w:r>
+          </w:p>
+        </w:tc>
+      </w:tr>
+      <w:tr>
+        <w:tc>
+          <w:tcPr>
+            <w:tcW w:type="dxa" w:w="907"/>
+          </w:tcPr>
+          <w:p>
+            <w:r>
+              <w:rPr>
+                <w:sz w:val="19"/>
+              </w:rPr>
+              <w:t>3.6</w:t>
+            </w:r>
+          </w:p>
+        </w:tc>
+        <w:tc>
+          <w:tcPr>
+            <w:tcW w:type="dxa" w:w="1587"/>
+          </w:tcPr>
+          <w:p>
+            <w:r>
+              <w:rPr>
+                <w:sz w:val="19"/>
+              </w:rPr>
+              <w:t>Fase 1</w:t>
+            </w:r>
+          </w:p>
+        </w:tc>
+        <w:tc>
+          <w:tcPr>
+            <w:tcW w:type="dxa" w:w="6576"/>
+          </w:tcPr>
+          <w:p>
+            <w:r>
+              <w:rPr>
+                <w:sz w:val="19"/>
+              </w:rPr>
+              <w:t>Seleccionar los modelos con mejor desempeño para establecer la línea base experimental de las fases posteriores.</w:t>
+            </w:r>
+          </w:p>
+        </w:tc>
+      </w:tr>
+      <w:tr>
+        <w:tc>
+          <w:tcPr>
+            <w:tcW w:type="dxa" w:w="907"/>
+          </w:tcPr>
+          <w:p>
+            <w:r>
+              <w:rPr>
+                <w:sz w:val="19"/>
+              </w:rPr>
+              <w:t>3.7</w:t>
+            </w:r>
+          </w:p>
+        </w:tc>
+        <w:tc>
+          <w:tcPr>
+            <w:tcW w:type="dxa" w:w="1587"/>
+          </w:tcPr>
+          <w:p>
+            <w:r>
+              <w:rPr>
+                <w:sz w:val="19"/>
+              </w:rPr>
+              <w:t>Fase 2</w:t>
+            </w:r>
+          </w:p>
+        </w:tc>
+        <w:tc>
+          <w:tcPr>
+            <w:tcW w:type="dxa" w:w="6576"/>
+          </w:tcPr>
+          <w:p>
+            <w:r>
+              <w:rPr>
+                <w:sz w:val="19"/>
+              </w:rPr>
+              <w:t>Ejecutar los modelos de referencia identificados bajo las dos configuraciones cross-dataset resultantes.</w:t>
+            </w:r>
+          </w:p>
+        </w:tc>
+      </w:tr>
+      <w:tr>
+        <w:tc>
+          <w:tcPr>
+            <w:tcW w:type="dxa" w:w="907"/>
+          </w:tcPr>
+          <w:p>
+            <w:r>
+              <w:rPr>
+                <w:sz w:val="19"/>
+              </w:rPr>
+              <w:t>3.8</w:t>
+            </w:r>
+          </w:p>
+        </w:tc>
+        <w:tc>
+          <w:tcPr>
+            <w:tcW w:type="dxa" w:w="1587"/>
+          </w:tcPr>
+          <w:p>
+            <w:r>
+              <w:rPr>
+                <w:sz w:val="19"/>
+              </w:rPr>
+              <w:t>Fase 2</w:t>
+            </w:r>
+          </w:p>
+        </w:tc>
+        <w:tc>
+          <w:tcPr>
+            <w:tcW w:type="dxa" w:w="6576"/>
+          </w:tcPr>
+          <w:p>
+            <w:r>
+              <w:rPr>
+                <w:sz w:val="19"/>
+              </w:rPr>
+              <w:t>Medir la degradación del desempeño mediante métricas de clasificación y métricas de robustez asociadas a la generalización. Analizar el impacto de la variabilidad visual sobre el comportamiento de los modelos seleccionados.</w:t>
+            </w:r>
+          </w:p>
+        </w:tc>
+      </w:tr>
+      <w:tr>
+        <w:tc>
+          <w:tcPr>
+            <w:tcW w:type="dxa" w:w="907"/>
+          </w:tcPr>
+          <w:p>
+            <w:r>
+              <w:rPr>
+                <w:sz w:val="19"/>
+              </w:rPr>
+              <w:t>3.9</w:t>
+            </w:r>
+          </w:p>
+        </w:tc>
+        <w:tc>
+          <w:tcPr>
+            <w:tcW w:type="dxa" w:w="1587"/>
+          </w:tcPr>
+          <w:p>
+            <w:r>
+              <w:rPr>
+                <w:sz w:val="19"/>
+              </w:rPr>
+              <w:t>Fase 1 y Fase 2</w:t>
+            </w:r>
+          </w:p>
+        </w:tc>
+        <w:tc>
+          <w:tcPr>
+            <w:tcW w:type="dxa" w:w="6576"/>
+          </w:tcPr>
+          <w:p>
+            <w:r>
+              <w:rPr>
+                <w:sz w:val="19"/>
+              </w:rPr>
+              <w:t>No incorpora una actividad nueva: consolida los productos de ambas fases, es decir, la línea base experimental (Fase 1) y el diagnóstico del efecto de la variabilidad visual (Fase 2).</w:t>
+            </w:r>
+          </w:p>
+        </w:tc>
+      </w:tr>
+    </w:tbl>
+    <w:p>
+      <w:r>
+        <w:rPr>
+          <w:sz w:val="18"/>
+        </w:rPr>
+        <w:t>Nota. La actividad de revisión de la literatura científica de la Fase 1 se desarrolla en el Capítulo II (Marco Referencial). Fuente: Elaboración propia.</w:t>
       </w:r>
     </w:p>
     <w:p>
@@ -151,7 +539,7 @@
         <w:pStyle w:val="Heading2"/>
       </w:pPr>
       <w:r>
-        <w:t>Etapa 1. Preparación y delimitación del conjunto de datos de evaluación</w:t>
+        <w:t>3.2. Conjuntos de datos y preparación de datos</w:t>
       </w:r>
     </w:p>
     <w:p>
@@ -159,7 +547,52 @@
         <w:jc w:val="both"/>
       </w:pPr>
       <w:r>
-        <w:t>El punto de partida de la evaluación es el dataset DNC (DataSetNotClean), compuesto por 8,000 imágenes. El conjunto está balanceado: 4,000 imágenes pertenecen a la clase «fresco» y 4,000 a la clase «no_fresco». Este balance es relevante porque establece una base equivalente para ambas clases y permite que la comparación de los modelos no quede dominada, en este experimento, por una clase mayoritaria.</w:t>
+        <w:t>La investigación trabaja con tres repositorios de imágenes oculares de pescado. Mendeley Data (DataSetNotClean, DNC) es el dominio fuente: con él se entrenan y comparan los modelos candidatos. OneDrive (trucha, Perú) y Kaggle (rohu, India) son los dominios objetivo: provienen de otras especies, cámaras e iluminación, y se reservan para medir la generalización de los modelos de referencia.</w:t>
+      </w:r>
+    </w:p>
+    <w:p>
+      <w:pPr>
+        <w:pStyle w:val="ListBullet"/>
+        <w:jc w:val="both"/>
+      </w:pPr>
+      <w:r>
+        <w:rPr>
+          <w:b/>
+        </w:rPr>
+        <w:t xml:space="preserve">Mendeley (fuente): </w:t>
+      </w:r>
+      <w:r>
+        <w:t>8,000 imágenes balanceadas, 4,000 fresco y 4,000 no_fresco, de 8 especies, ya recortadas al ojo (aprox. 300×300 a 440×440 px).</w:t>
+      </w:r>
+    </w:p>
+    <w:p>
+      <w:pPr>
+        <w:pStyle w:val="ListBullet"/>
+        <w:jc w:val="both"/>
+      </w:pPr>
+      <w:r>
+        <w:rPr>
+          <w:b/>
+        </w:rPr>
+        <w:t xml:space="preserve">OneDrive – Trucha (objetivo 1): </w:t>
+      </w:r>
+      <w:r>
+        <w:t>1,150 imágenes tras la depuración; fotos originales de cabeza completa a resolución de cámara (aprox. 4160×3120 px).</w:t>
+      </w:r>
+    </w:p>
+    <w:p>
+      <w:pPr>
+        <w:pStyle w:val="ListBullet"/>
+        <w:jc w:val="both"/>
+      </w:pPr>
+      <w:r>
+        <w:rPr>
+          <w:b/>
+        </w:rPr>
+        <w:t xml:space="preserve">Kaggle – Rohu (objetivo 2): </w:t>
+      </w:r>
+      <w:r>
+        <w:t>1,261 imágenes tras la depuración; fotos originales de cabeza completa (aprox. 4032×3024 px).</w:t>
       </w:r>
     </w:p>
     <w:p>
@@ -167,7 +600,67 @@
         <w:jc w:val="both"/>
       </w:pPr>
       <w:r>
-        <w:t>En esta etapa todavía no se entrena ningún modelo. Su función es fijar el universo experimental que será recorrido por la validación cruzada. Las 8,000 imágenes constituyen el conjunto sobre el cual se generarán las particiones de entrenamiento, validación y prueba. Asimismo, se deja establecido que las métricas finales se expresan en un problema binario y que las métricas por clase se calculan tratando cada clase como positiva por turno; posteriormente se obtiene el promedio macro.</w:t>
+        <w:t>Los tres repositorios reciben un procesamiento común de cuatro pasos, para que las diferencias entre dominios se deban a las condiciones visuales y no al encuadre de las imágenes:</w:t>
+      </w:r>
+    </w:p>
+    <w:p>
+      <w:pPr>
+        <w:pStyle w:val="ListBullet"/>
+        <w:jc w:val="both"/>
+      </w:pPr>
+      <w:r>
+        <w:rPr>
+          <w:b/>
+        </w:rPr>
+        <w:t xml:space="preserve">Depuración: </w:t>
+      </w:r>
+      <w:r>
+        <w:t>en OneDrive y Kaggle se conservan las detecciones del ojo con estado «ok» y las rescatadas en revisión manual; en Kaggle se excluyen además los falsos positivos confirmados (escama, aleta o imagen borrosa).</w:t>
+      </w:r>
+    </w:p>
+    <w:p>
+      <w:pPr>
+        <w:pStyle w:val="ListBullet"/>
+        <w:jc w:val="both"/>
+      </w:pPr>
+      <w:r>
+        <w:rPr>
+          <w:b/>
+        </w:rPr>
+        <w:t xml:space="preserve">Recorte de la región ocular: </w:t>
+      </w:r>
+      <w:r>
+        <w:t>el ojo se detecta con Fast Radial Symmetry Transform y se recorta un cuadrado centrado en él, con el mismo encuadre que Mendeley.</w:t>
+      </w:r>
+    </w:p>
+    <w:p>
+      <w:pPr>
+        <w:pStyle w:val="ListBullet"/>
+        <w:jc w:val="both"/>
+      </w:pPr>
+      <w:r>
+        <w:rPr>
+          <w:b/>
+        </w:rPr>
+        <w:t xml:space="preserve">Homologación de categorías: </w:t>
+      </w:r>
+      <w:r>
+        <w:t>todas las etiquetas se llevan a un problema binario: fresco (Mendeley: «Highly Fresh» y «Fresh»; OneDrive: días 1 y 3; Kaggle: Fresh_Eyes) y no_fresco (Mendeley: «Not Fresh»; OneDrive: días 5, 7 y 9; Kaggle: Nonfresh_Eyes).</w:t>
+      </w:r>
+    </w:p>
+    <w:p>
+      <w:pPr>
+        <w:pStyle w:val="ListBullet"/>
+        <w:jc w:val="both"/>
+      </w:pPr>
+      <w:r>
+        <w:rPr>
+          <w:b/>
+        </w:rPr>
+        <w:t xml:space="preserve">Normalización: </w:t>
+      </w:r>
+      <w:r>
+        <w:t>brillo y contraste con CLAHE en los dominios objetivo, redimensionado a 330×330 px y, al ingresar al modelo, normalización con la media y desviación de ImageNet.</w:t>
       </w:r>
     </w:p>
     <w:p>
@@ -175,7 +668,159 @@
         <w:jc w:val="both"/>
       </w:pPr>
       <w:r>
-        <w:t>La métrica F1 se interpreta como F1 macro. Para cada clase, el F1 corresponde a la media armónica entre Precisión y Recall; posteriormente, el F1 macro se obtiene como el promedio no ponderado del F1 de «fresco» y del F1 de «no_fresco». De esta forma, ambas clases tienen el mismo peso en el resultado. El F1 macro se utiliza durante la validación para seleccionar el checkpoint y también como una de las métricas principales para comparar los modelos.</w:t>
+        <w:t>En esta sección no se entrena ningún modelo. Mendeley se particiona para el entrenamiento (sección 3.3) y solo su conjunto de entrenamiento recibe data augmentation. OneDrive y Kaggle no intervienen en el entrenamiento ni en la selección de los modelos base: se reservan hasta la evaluación cross-dataset (sección 3.7).</w:t>
+      </w:r>
+    </w:p>
+    <w:p>
+      <w:pPr>
+        <w:jc w:val="both"/>
+      </w:pPr>
+      <w:r>
+        <w:rPr>
+          <w:b/>
+        </w:rPr>
+        <w:t xml:space="preserve">Resultado de la sección. </w:t>
+      </w:r>
+      <w:r>
+        <w:t>conjuntos de datos comparables entre dominios, sin entrenamiento previo.</w:t>
+      </w:r>
+    </w:p>
+    <w:p>
+      <w:pPr>
+        <w:pStyle w:val="Heading2"/>
+      </w:pPr>
+      <w:r>
+        <w:t>3.3. Diseño experimental de los modelos candidatos</w:t>
+      </w:r>
+    </w:p>
+    <w:p>
+      <w:pPr>
+        <w:jc w:val="both"/>
+      </w:pPr>
+      <w:r>
+        <w:t>A partir de la revisión de la literatura (Capítulo II) se seleccionan diez modelos candidatos que cubren las dos familias de arquitecturas usadas en clasificación de imágenes: Transformer (ViT-Base/16, Swin-Base y DINOv2-Small) y redes convolucionales, CNN (DenseNet-121, EfficientNet-B0, EfficientNet-Lite0, MobileNetV3-Small, ResNet-50, MobileNetV2 y MobileNetV1). Así, la selección posterior no depende de una sola familia.</w:t>
+      </w:r>
+    </w:p>
+    <w:p>
+      <w:pPr>
+        <w:pStyle w:val="Heading3"/>
+      </w:pPr>
+      <w:r>
+        <w:t>Partición de los datos</w:t>
+      </w:r>
+    </w:p>
+    <w:p>
+      <w:pPr>
+        <w:jc w:val="both"/>
+      </w:pPr>
+      <w:r>
+        <w:t>Las 8,000 imágenes de Mendeley se dividen con StratifiedKFold (n_splits=5, shuffle=True, random_state=42) en cinco bloques de 1,600 imágenes. En cada una de las cinco corridas, un bloque se reserva como prueba (20%) y del 80% restante se separa un 15% para validación con train_test_split estratificado y la misma semilla. La distribución efectiva es 68% entrenamiento (5,440 imágenes), 12% validación (960) y 20% prueba (1,600). Al terminar las cinco corridas, cada imagen fue prueba exactamente una vez.</w:t>
+      </w:r>
+    </w:p>
+    <w:p>
+      <w:pPr>
+        <w:pStyle w:val="ListBullet"/>
+        <w:jc w:val="both"/>
+      </w:pPr>
+      <w:r>
+        <w:rPr>
+          <w:b/>
+        </w:rPr>
+        <w:t xml:space="preserve">Entrenamiento (68%): </w:t>
+      </w:r>
+      <w:r>
+        <w:t>actualiza los pesos del modelo.</w:t>
+      </w:r>
+    </w:p>
+    <w:p>
+      <w:pPr>
+        <w:pStyle w:val="ListBullet"/>
+        <w:jc w:val="both"/>
+      </w:pPr>
+      <w:r>
+        <w:rPr>
+          <w:b/>
+        </w:rPr>
+        <w:t xml:space="preserve">Validación (12%): </w:t>
+      </w:r>
+      <w:r>
+        <w:t>calcula val_F1 en cada epoch y elige el mejor checkpoint; no actualiza pesos.</w:t>
+      </w:r>
+    </w:p>
+    <w:p>
+      <w:pPr>
+        <w:pStyle w:val="ListBullet"/>
+        <w:jc w:val="both"/>
+      </w:pPr>
+      <w:r>
+        <w:rPr>
+          <w:b/>
+        </w:rPr>
+        <w:t xml:space="preserve">Prueba (20%): </w:t>
+      </w:r>
+      <w:r>
+        <w:t>solo mide el checkpoint ya elegido; nunca se usa para tomar decisiones.</w:t>
+      </w:r>
+    </w:p>
+    <w:p>
+      <w:pPr>
+        <w:jc w:val="both"/>
+      </w:pPr>
+      <w:r>
+        <w:t>Limitación: la partición se hace a nivel de imagen individual, sin agrupar imágenes de una misma captura o ejemplar. Si el conjunto contiene varias imágenes de una misma captura, pueden quedar en conjuntos distintos y elevar las métricas de prueba.</w:t>
+      </w:r>
+    </w:p>
+    <w:p>
+      <w:pPr>
+        <w:pStyle w:val="Heading3"/>
+      </w:pPr>
+      <w:r>
+        <w:t>Hiperparámetros</w:t>
+      </w:r>
+    </w:p>
+    <w:p>
+      <w:pPr>
+        <w:pStyle w:val="ListBullet"/>
+        <w:jc w:val="both"/>
+      </w:pPr>
+      <w:r>
+        <w:rPr>
+          <w:b/>
+        </w:rPr>
+        <w:t xml:space="preserve">Inicialización: </w:t>
+      </w:r>
+      <w:r>
+        <w:t>pesos preentrenados (ImageNet; en DINOv2-Small, pesos auto-supervisados de DINOv2) y fine-tuning completo de toda la arquitectura.</w:t>
+      </w:r>
+    </w:p>
+    <w:p>
+      <w:pPr>
+        <w:pStyle w:val="ListBullet"/>
+        <w:jc w:val="both"/>
+      </w:pPr>
+      <w:r>
+        <w:rPr>
+          <w:b/>
+        </w:rPr>
+        <w:t xml:space="preserve">Optimización: </w:t>
+      </w:r>
+      <w:r>
+        <w:t>AdamW (learning rate 1e-4, weight decay 0.05); 3 epochs de warmup lineal y luego scheduler coseno; en los Transformer, el backbone usa un learning rate 10 veces menor que la cabeza.</w:t>
+      </w:r>
+    </w:p>
+    <w:p>
+      <w:pPr>
+        <w:pStyle w:val="ListBullet"/>
+        <w:jc w:val="both"/>
+      </w:pPr>
+      <w:r>
+        <w:rPr>
+          <w:b/>
+        </w:rPr>
+        <w:t xml:space="preserve">Pérdida: </w:t>
+      </w:r>
+      <w:r>
+        <w:t>Focal Loss (γ = 2) con label smoothing 0.1; gradient clipping con norma máxima 1.0.</w:t>
       </w:r>
     </w:p>
     <w:p>
@@ -190,7 +835,7 @@
         <w:t xml:space="preserve">Entrada: </w:t>
       </w:r>
       <w:r>
-        <w:t>8,000 imágenes del dataset DNC.</w:t>
+        <w:t>CNN: 256×256 px, batch size 16. Transformer: 224×224 px, batch size 8.</w:t>
       </w:r>
     </w:p>
     <w:p>
@@ -202,10 +847,10 @@
         <w:rPr>
           <w:b/>
         </w:rPr>
-        <w:t xml:space="preserve">Clases: </w:t>
+        <w:t xml:space="preserve">Duración: </w:t>
       </w:r>
       <w:r>
-        <w:t>4,000 fresco y 4,000 no_fresco.</w:t>
+        <w:t>máximo 30 epochs con early stopping de paciencia 7.</w:t>
       </w:r>
     </w:p>
     <w:p>
@@ -217,10 +862,10 @@
         <w:rPr>
           <w:b/>
         </w:rPr>
-        <w:t xml:space="preserve">Unidad que continúa al flujo: </w:t>
+        <w:t xml:space="preserve">Data augmentation (solo entrenamiento): </w:t>
       </w:r>
       <w:r>
-        <w:t>Cada imagen individual con su etiqueta de clase.</w:t>
+        <w:t>recorte aleatorio, volteos, variación de color, escala de grises, desenfoque, rotación de ±15° y borrado aleatorio.</w:t>
       </w:r>
     </w:p>
     <w:p>
@@ -232,10 +877,18 @@
         <w:rPr>
           <w:b/>
         </w:rPr>
-        <w:t xml:space="preserve">Métrica central: </w:t>
+        <w:t xml:space="preserve">Semilla: </w:t>
       </w:r>
       <w:r>
-        <w:t>F1 macro, complementada con Accuracy, Precisión, Recall, Especificidad y AUC; adicionalmente, la variabilidad entre folds se caracteriza mediante la desviación estándar del F1.</w:t>
+        <w:t>42 en todas las particiones y entrenamientos. Algunas operaciones en MPS (Apple M2) no son deterministas, por lo que un reentrenamiento puede variar en décimas.</w:t>
+      </w:r>
+    </w:p>
+    <w:p>
+      <w:pPr>
+        <w:pStyle w:val="Heading3"/>
+      </w:pPr>
+      <w:r>
+        <w:t>Métricas</w:t>
       </w:r>
     </w:p>
     <w:p>
@@ -243,61 +896,15 @@
         <w:jc w:val="both"/>
       </w:pPr>
       <w:r>
-        <w:rPr>
-          <w:b/>
-        </w:rPr>
-        <w:t xml:space="preserve">Alineación dentro del flujo. </w:t>
-      </w:r>
-      <w:r>
-        <w:t>Esta etapa define exactamente qué datos entran al experimento y bajo qué formulación de clasificación. Sin esta delimitación, las métricas de los modelos no serían directamente comparables.</w:t>
+        <w:t>A partir de la matriz de confusión se calculan exactitud (Accuracy), precisión, sensibilidad (Recall), especificidad y F1-score. Las métricas por clase se calculan tomando cada clase como positiva por turno y se promedian (macro), de modo que fresco y no_fresco pesan igual. La métrica central es el F1 macro. Con las probabilidades de salida se construye la curva ROC y se calcula el AUC. La estabilidad entre particiones se mide con la desviación estándar del F1 de los cinco folds.</w:t>
       </w:r>
     </w:p>
     <w:p>
       <w:pPr>
-        <w:pStyle w:val="Heading2"/>
+        <w:pStyle w:val="Heading3"/>
       </w:pPr>
       <w:r>
-        <w:t>Etapa 2. Construcción de la validación cruzada estratificada de cinco folds</w:t>
-      </w:r>
-    </w:p>
-    <w:p>
-      <w:pPr>
-        <w:jc w:val="both"/>
-      </w:pPr>
-      <w:r>
-        <w:t>Una vez definido el conjunto de 8,000 imágenes, se aplica StratifiedKFold con n_splits=5, shuffle=True y random_state=42. La función de la estratificación es conservar la proporción de las dos clases dentro de las particiones. Al utilizar cinco folds, el conjunto completo se divide en cinco bloques de 20%, equivalentes a 1,600 imágenes por fold, sin solape entre esos bloques.</w:t>
-      </w:r>
-    </w:p>
-    <w:p>
-      <w:pPr>
-        <w:jc w:val="both"/>
-      </w:pPr>
-      <w:r>
-        <w:t>La partición se realizó a nivel de imagen individual, sin agrupar las imágenes derivadas de una misma captura o ejemplar. En consecuencia, si el conjunto contiene varias imágenes de una misma captura, estas pueden quedar distribuidas entre entrenamiento, validación y prueba, por lo que no se descarta cierta correlación entre conjuntos que podría elevar las métricas de prueba. Esta condición se reconoce como una limitación del estudio.</w:t>
-      </w:r>
-    </w:p>
-    <w:p>
-      <w:pPr>
-        <w:jc w:val="both"/>
-      </w:pPr>
-      <w:r>
-        <w:t>El procedimiento se repite cinco veces. En cada corrida, uno de los cinco folds se reserva como conjunto de prueba. Ese test representa el 20% de las 8,000 imágenes y permanece fuera del entrenamiento y de la validación de esa corrida. Sobre el 80% restante se aplica una separación adicional mediante train_test_split (test_size=0.15) con estratificación y la misma semilla. De esta forma, la distribución efectiva es 68% para entrenamiento (5,440 imágenes), 12% para validación (960) y 20% para prueba (1,600).</w:t>
-      </w:r>
-    </w:p>
-    <w:p>
-      <w:pPr>
-        <w:jc w:val="both"/>
-      </w:pPr>
-      <w:r>
-        <w:t>La rotación es esencial para entender la metodología. En la primera corrida un fold actúa como test; en las siguientes corridas esa función pasa a los demás folds. Por tanto, al terminar las cinco corridas, cada imagen habrá formado parte del conjunto de prueba exactamente una vez. Dentro de una misma corrida, los conjuntos de entrenamiento, validación y prueba mantienen funciones diferenciadas y no se mezclan entre sí.</w:t>
-      </w:r>
-    </w:p>
-    <w:p>
-      <w:pPr>
-        <w:jc w:val="both"/>
-      </w:pPr>
-      <w:r>
-        <w:t>El conjunto de entrenamiento sirve para actualizar los pesos del modelo. El conjunto de validación no actualiza los pesos: se utiliza para observar el comportamiento del modelo durante los epochs y decidir cuál checkpoint es el mejor. El conjunto de prueba queda reservado hasta que termina el entrenamiento de ese fold y se utiliza solo para medir el desempeño del checkpoint seleccionado.</w:t>
+        <w:t>Escenarios</w:t>
       </w:r>
     </w:p>
     <w:p>
@@ -309,10 +916,10 @@
         <w:rPr>
           <w:b/>
         </w:rPr>
-        <w:t xml:space="preserve">Train = 68%: </w:t>
+        <w:t xml:space="preserve">Intra-dataset: </w:t>
       </w:r>
       <w:r>
-        <w:t>Se utiliza para aprender y actualizar los pesos.</w:t>
+        <w:t>entrenamiento y prueba en Mendeley (secciones 3.4 a 3.6), con los diez candidatos.</w:t>
       </w:r>
     </w:p>
     <w:p>
@@ -324,10 +931,56 @@
         <w:rPr>
           <w:b/>
         </w:rPr>
-        <w:t xml:space="preserve">Validation = 12%: </w:t>
+        <w:t xml:space="preserve">Cross-dataset: </w:t>
       </w:r>
       <w:r>
-        <w:t>Se utiliza para calcular val_F1 y seleccionar el mejor checkpoint.</w:t>
+        <w:t>Mendeley → OneDrive (Trucha) y Mendeley → Kaggle (Rohu), solo con los modelos de referencia (secciones 3.7 y 3.8).</w:t>
+      </w:r>
+    </w:p>
+    <w:p>
+      <w:pPr>
+        <w:jc w:val="both"/>
+      </w:pPr>
+      <w:r>
+        <w:rPr>
+          <w:b/>
+        </w:rPr>
+        <w:t xml:space="preserve">Resultado de la sección. </w:t>
+      </w:r>
+      <w:r>
+        <w:t>protocolo experimental común para los diez candidatos.</w:t>
+      </w:r>
+    </w:p>
+    <w:p>
+      <w:pPr>
+        <w:pStyle w:val="Heading2"/>
+      </w:pPr>
+      <w:r>
+        <w:t>3.4. Implementación de los modelos candidatos</w:t>
+      </w:r>
+    </w:p>
+    <w:p>
+      <w:pPr>
+        <w:jc w:val="both"/>
+      </w:pPr>
+      <w:r>
+        <w:t>Cada uno de los diez modelos se entrena en cada uno de los cinco folds: 50 entrenamientos modelo–fold, todos bajo el protocolo de la sección 3.3. La implementación usa Python con PyTorch y torchvision, timm como repositorio de arquitecturas, scikit-learn para la partición y las métricas, y pandas, numpy y matplotlib para el tratamiento de resultados. El entorno de ejecución es una MacBook con chip Apple M2 y aceleración Metal Performance Shaders (MPS).</w:t>
+      </w:r>
+    </w:p>
+    <w:p>
+      <w:pPr>
+        <w:jc w:val="both"/>
+      </w:pPr>
+      <w:r>
+        <w:t>En cada epoch se calcula val_F1. Si supera el mejor valor registrado en ese fold, el checkpoint se guarda como el nuevo mejor modelo. Si se acumulan siete epochs sin mejora, el entrenamiento se detiene antes de los 30 epochs (early stopping). Al terminar, se recarga el mejor checkpoint, que no es necesariamente el del último epoch.</w:t>
+      </w:r>
+    </w:p>
+    <w:p>
+      <w:pPr>
+        <w:jc w:val="both"/>
+      </w:pPr>
+      <w:r>
+        <w:t>Los pesos se aprenden con entrenamiento, el checkpoint se elige con validación y el desempeño se mide con prueba. Esta separación evita usar la prueba para tomar decisiones durante el entrenamiento.</w:t>
       </w:r>
     </w:p>
     <w:p>
@@ -339,10 +992,10 @@
         <w:rPr>
           <w:b/>
         </w:rPr>
-        <w:t xml:space="preserve">Test = 20%: </w:t>
+        <w:t xml:space="preserve">Entrenamientos: </w:t>
       </w:r>
       <w:r>
-        <w:t>Permanece sin uso durante el ajuste y se emplea solo al final del fold.</w:t>
+        <w:t>10 modelos × 5 folds = 50.</w:t>
       </w:r>
     </w:p>
     <w:p>
@@ -354,72 +1007,10 @@
         <w:rPr>
           <w:b/>
         </w:rPr>
-        <w:t xml:space="preserve">Número de rotaciones: </w:t>
+        <w:t xml:space="preserve">Checkpoint que pasa a prueba: </w:t>
       </w:r>
       <w:r>
-        <w:t>Cinco; cada fold ocupa una vez el papel de test.</w:t>
-      </w:r>
-    </w:p>
-    <w:p>
-      <w:pPr>
-        <w:jc w:val="both"/>
-      </w:pPr>
-      <w:r>
-        <w:rPr>
-          <w:b/>
-        </w:rPr>
-        <w:t xml:space="preserve">Alineación dentro del flujo. </w:t>
-      </w:r>
-      <w:r>
-        <w:t>La salida de esta etapa no es una sola división train/test, sino cinco escenarios de evaluación equivalentes. Esto permite observar tanto el desempeño global como la variabilidad del modelo frente a diferentes particiones.</w:t>
-      </w:r>
-    </w:p>
-    <w:p>
-      <w:pPr>
-        <w:pStyle w:val="Heading2"/>
-      </w:pPr>
-      <w:r>
-        <w:t>Etapa 3. Configuración homogénea de los diez modelos candidatos</w:t>
-      </w:r>
-    </w:p>
-    <w:p>
-      <w:pPr>
-        <w:jc w:val="both"/>
-      </w:pPr>
-      <w:r>
-        <w:t>Con las particiones ya definidas, el flujo incorpora los diez modelos candidatos que serán sometidos al mismo principio experimental. Los modelos evaluados son: ViT-Base/16, DenseNet-121, Swin-Base, DINOv2-Small, EfficientNet-B0, EfficientNet-Lite0, MobileNetV3-Small, ResNet-50, MobileNetV2 y MobileNetV1. El conjunto incluye arquitecturas Transformer y arquitecturas convolucionales, lo que posteriormente permitirá realizar una selección que no dependa de una sola familia.</w:t>
-      </w:r>
-    </w:p>
-    <w:p>
-      <w:pPr>
-        <w:jc w:val="both"/>
-      </w:pPr>
-      <w:r>
-        <w:t>Todos los modelos parten de pesos preentrenados (ImageNet; en DINOv2-Small, pesos auto-supervisados de DINOv2) y se someten a fine-tuning completo. Esto significa que el entrenamiento no se limita a reemplazar y ajustar únicamente la capa de clasificación final; los pesos de toda la arquitectura se actualizan durante el entrenamiento para adaptarse a la tarea de clasificación de frescura. En los modelos Transformer, el backbone se actualiza con una tasa de aprendizaje diez veces menor que la de la cabeza de clasificación.</w:t>
-      </w:r>
-    </w:p>
-    <w:p>
-      <w:pPr>
-        <w:jc w:val="both"/>
-      </w:pPr>
-      <w:r>
-        <w:t>Se consideran además diferencias operativas asociadas a las familias arquitectónicas. Para las CNN se utilizó un tamaño de imagen de 256×256 y batch size de 16, mientras que los modelos Transformer (ViT-Base/16, Swin-Base y DINOv2-Small) utilizaron 224×224 y batch size de 8 durante el entrenamiento. Estas diferencias forman parte de la configuración real de ejecución y deben entenderse como parámetros operativos de las arquitecturas, no como cambios en el criterio con el que se decide qué modelo es mejor.</w:t>
-      </w:r>
-    </w:p>
-    <w:p>
-      <w:pPr>
-        <w:jc w:val="both"/>
-      </w:pPr>
-      <w:r>
-        <w:t>El resto de la configuración de entrenamiento es común a los diez modelos: optimizador AdamW con tasa de aprendizaje de 1e-4 y weight decay de 0.05; tres epochs de calentamiento (warmup) lineal seguidos de un scheduler coseno; función de pérdida Focal Loss (γ = 2) con label smoothing de 0.1; y gradient clipping con norma máxima de 1.0. El data augmentation (recorte aleatorio, volteos, variación de color, desenfoque, rotación de ±15° y borrado aleatorio) se aplica solo al conjunto de entrenamiento; validación y prueba usan únicamente redimensionado y normalización.</w:t>
-      </w:r>
-    </w:p>
-    <w:p>
-      <w:pPr>
-        <w:jc w:val="both"/>
-      </w:pPr>
-      <w:r>
-        <w:t>La implementación se realizó con Python y PyTorch/torchvision para entrenamiento y transformaciones; timm como repositorio de arquitecturas; scikit-learn para StratifiedKFold, train_test_split, matrices de confusión, ROC y AUC; pandas/numpy para tratamiento de resultados; y matplotlib para las visualizaciones. El entorno de ejecución fue una MacBook con chip Apple M2 y aceleración mediante Metal Performance Shaders (MPS). Las semillas se fijaron en 42; no obstante, algunas operaciones en MPS no son deterministas, por lo que un reentrenamiento puede producir diferencias del orden de décimas en las métricas.</w:t>
+        <w:t>el de mejor val_F1 macro del fold.</w:t>
       </w:r>
     </w:p>
     <w:p>
@@ -431,70 +1022,10 @@
         <w:rPr>
           <w:b/>
         </w:rPr>
-        <w:t xml:space="preserve">Modelos basados en arquitecturas Transformer: </w:t>
+        <w:t xml:space="preserve">Detalle por modelo: </w:t>
       </w:r>
       <w:r>
-        <w:t>ViT-Base/16, Swin-Base y DINOv2-Small.</w:t>
-      </w:r>
-    </w:p>
-    <w:p>
-      <w:pPr>
-        <w:pStyle w:val="ListBullet"/>
-        <w:jc w:val="both"/>
-      </w:pPr>
-      <w:r>
-        <w:rPr>
-          <w:b/>
-        </w:rPr>
-        <w:t xml:space="preserve">CNN evaluadas: </w:t>
-      </w:r>
-      <w:r>
-        <w:t>DenseNet-121, EfficientNet-B0, EfficientNet-Lite0, MobileNetV3-Small, ResNet-50, MobileNetV2 y MobileNetV1.</w:t>
-      </w:r>
-    </w:p>
-    <w:p>
-      <w:pPr>
-        <w:pStyle w:val="ListBullet"/>
-        <w:jc w:val="both"/>
-      </w:pPr>
-      <w:r>
-        <w:rPr>
-          <w:b/>
-        </w:rPr>
-        <w:t xml:space="preserve">Inicialización: </w:t>
-      </w:r>
-      <w:r>
-        <w:t>Pesos preentrenados.</w:t>
-      </w:r>
-    </w:p>
-    <w:p>
-      <w:pPr>
-        <w:pStyle w:val="ListBullet"/>
-        <w:jc w:val="both"/>
-      </w:pPr>
-      <w:r>
-        <w:rPr>
-          <w:b/>
-        </w:rPr>
-        <w:t xml:space="preserve">Ajuste: </w:t>
-      </w:r>
-      <w:r>
-        <w:t>Fine-tuning completo.</w:t>
-      </w:r>
-    </w:p>
-    <w:p>
-      <w:pPr>
-        <w:pStyle w:val="ListBullet"/>
-        <w:jc w:val="both"/>
-      </w:pPr>
-      <w:r>
-        <w:rPr>
-          <w:b/>
-        </w:rPr>
-        <w:t xml:space="preserve">Entrenamiento: </w:t>
-      </w:r>
-      <w:r>
-        <w:t>AdamW (lr 1e-4, weight decay 0.05), warmup + coseno, Focal Loss (γ = 2) con label smoothing 0.1.</w:t>
+        <w:t>curvas de val_F1 por epoch y resultados por fold en Documentacion_Tecnica_10_Modelos.docx, sección 3.4.</w:t>
       </w:r>
     </w:p>
     <w:p>
@@ -505,10 +1036,10 @@
         <w:rPr>
           <w:b/>
         </w:rPr>
-        <w:t xml:space="preserve">Alineación dentro del flujo. </w:t>
+        <w:t xml:space="preserve">Resultado de la sección. </w:t>
       </w:r>
       <w:r>
-        <w:t>Esta etapa asegura que la comparación posterior tenga diversidad arquitectónica. El flujo no parte de un modelo previamente elegido: primero genera evidencia para diez candidatos y recién después aplica criterios de selección.</w:t>
+        <w:t>50 checkpoints entrenados, cinco por modelo candidato.</w:t>
       </w:r>
     </w:p>
     <w:p>
@@ -516,7 +1047,7 @@
         <w:pStyle w:val="Heading2"/>
       </w:pPr>
       <w:r>
-        <w:t>Etapa 4. Entrenamiento por fold y selección del mejor checkpoint</w:t>
+        <w:t>3.5. Evaluación intra-dataset de los modelos candidatos</w:t>
       </w:r>
     </w:p>
     <w:p>
@@ -524,7 +1055,1264 @@
         <w:jc w:val="both"/>
       </w:pPr>
       <w:r>
-        <w:t>Esta es la etapa central de generación de modelos entrenados. Cada uno de los diez modelos se entrena en cada uno de los cinco folds, lo que produce 50 combinaciones modelo–fold. Para cada combinación se permite un máximo de 30 epochs. Sin embargo, el objetivo no es obligar a que todos los entrenamientos lleguen al epoch 30, sino conservar el estado del modelo que muestre el mejor comportamiento sobre el conjunto de validación.</w:t>
+        <w:t>Cada checkpoint se evalúa una sola vez sobre la prueba de su fold. Como los cinco conjuntos de prueba son disjuntos y cubren las 8,000 imágenes, sus predicciones se concatenan en 8,000 predicciones out-of-fold (OOF): cada imagen se predice con un modelo que no la vio en el entrenamiento. Sobre ellas se recalculan las métricas globales (pooled); la matriz de confusión pooled es la suma de las cinco matrices de prueba. Además, se reporta el F1 de los cinco folds como media ± desviación estándar.</w:t>
+      </w:r>
+    </w:p>
+    <w:p>
+      <w:r>
+        <w:rPr>
+          <w:b/>
+        </w:rPr>
+        <w:t>Tabla 3.2</w:t>
+      </w:r>
+    </w:p>
+    <w:p>
+      <w:r>
+        <w:rPr>
+          <w:i/>
+        </w:rPr>
+        <w:t>Desempeño intra-dataset de los diez modelos candidatos en Mendeley (pooled, 8,000 predicciones OOF)</w:t>
+      </w:r>
+    </w:p>
+    <w:tbl>
+      <w:tblPr>
+        <w:tblStyle w:val="TableGrid"/>
+        <w:tblW w:type="auto" w:w="0"/>
+        <w:jc w:val="center"/>
+        <w:tblLayout w:type="fixed"/>
+        <w:tblLook w:firstColumn="1" w:firstRow="1" w:lastColumn="0" w:lastRow="0" w:noHBand="0" w:noVBand="1" w:val="04A0"/>
+      </w:tblPr>
+      <w:tblGrid>
+        <w:gridCol w:w="1871"/>
+        <w:gridCol w:w="964"/>
+        <w:gridCol w:w="964"/>
+        <w:gridCol w:w="1134"/>
+        <w:gridCol w:w="907"/>
+        <w:gridCol w:w="1191"/>
+        <w:gridCol w:w="850"/>
+        <w:gridCol w:w="1191"/>
+      </w:tblGrid>
+      <w:tr>
+        <w:tc>
+          <w:tcPr>
+            <w:tcW w:type="dxa" w:w="1871"/>
+            <w:shd w:val="clear" w:color="auto" w:fill="D9E2F3"/>
+          </w:tcPr>
+          <w:p>
+            <w:r>
+              <w:rPr>
+                <w:b/>
+                <w:sz w:val="19"/>
+              </w:rPr>
+              <w:t>Modelo</w:t>
+            </w:r>
+          </w:p>
+        </w:tc>
+        <w:tc>
+          <w:tcPr>
+            <w:tcW w:type="dxa" w:w="964"/>
+            <w:shd w:val="clear" w:color="auto" w:fill="D9E2F3"/>
+          </w:tcPr>
+          <w:p>
+            <w:r>
+              <w:rPr>
+                <w:b/>
+                <w:sz w:val="19"/>
+              </w:rPr>
+              <w:t>Exactitud (%)</w:t>
+            </w:r>
+          </w:p>
+        </w:tc>
+        <w:tc>
+          <w:tcPr>
+            <w:tcW w:type="dxa" w:w="964"/>
+            <w:shd w:val="clear" w:color="auto" w:fill="D9E2F3"/>
+          </w:tcPr>
+          <w:p>
+            <w:r>
+              <w:rPr>
+                <w:b/>
+                <w:sz w:val="19"/>
+              </w:rPr>
+              <w:t>Precisión (%)</w:t>
+            </w:r>
+          </w:p>
+        </w:tc>
+        <w:tc>
+          <w:tcPr>
+            <w:tcW w:type="dxa" w:w="1134"/>
+            <w:shd w:val="clear" w:color="auto" w:fill="D9E2F3"/>
+          </w:tcPr>
+          <w:p>
+            <w:r>
+              <w:rPr>
+                <w:b/>
+                <w:sz w:val="19"/>
+              </w:rPr>
+              <w:t>Sensibilidad (%)</w:t>
+            </w:r>
+          </w:p>
+        </w:tc>
+        <w:tc>
+          <w:tcPr>
+            <w:tcW w:type="dxa" w:w="907"/>
+            <w:shd w:val="clear" w:color="auto" w:fill="D9E2F3"/>
+          </w:tcPr>
+          <w:p>
+            <w:r>
+              <w:rPr>
+                <w:b/>
+                <w:sz w:val="19"/>
+              </w:rPr>
+              <w:t>F1 macro (%)</w:t>
+            </w:r>
+          </w:p>
+        </w:tc>
+        <w:tc>
+          <w:tcPr>
+            <w:tcW w:type="dxa" w:w="1191"/>
+            <w:shd w:val="clear" w:color="auto" w:fill="D9E2F3"/>
+          </w:tcPr>
+          <w:p>
+            <w:r>
+              <w:rPr>
+                <w:b/>
+                <w:sz w:val="19"/>
+              </w:rPr>
+              <w:t>Especificidad (%)</w:t>
+            </w:r>
+          </w:p>
+        </w:tc>
+        <w:tc>
+          <w:tcPr>
+            <w:tcW w:type="dxa" w:w="850"/>
+            <w:shd w:val="clear" w:color="auto" w:fill="D9E2F3"/>
+          </w:tcPr>
+          <w:p>
+            <w:r>
+              <w:rPr>
+                <w:b/>
+                <w:sz w:val="19"/>
+              </w:rPr>
+              <w:t>AUC</w:t>
+            </w:r>
+          </w:p>
+        </w:tc>
+        <w:tc>
+          <w:tcPr>
+            <w:tcW w:type="dxa" w:w="1191"/>
+            <w:shd w:val="clear" w:color="auto" w:fill="D9E2F3"/>
+          </w:tcPr>
+          <w:p>
+            <w:r>
+              <w:rPr>
+                <w:b/>
+                <w:sz w:val="19"/>
+              </w:rPr>
+              <w:t>F1 por fold (%)</w:t>
+            </w:r>
+          </w:p>
+        </w:tc>
+      </w:tr>
+      <w:tr>
+        <w:tc>
+          <w:tcPr>
+            <w:tcW w:type="dxa" w:w="1871"/>
+            <w:shd w:val="clear" w:color="auto" w:fill="FFF2CC"/>
+          </w:tcPr>
+          <w:p>
+            <w:r>
+              <w:rPr>
+                <w:b/>
+                <w:sz w:val="19"/>
+              </w:rPr>
+              <w:t>ViT-Base/16</w:t>
+            </w:r>
+          </w:p>
+        </w:tc>
+        <w:tc>
+          <w:tcPr>
+            <w:tcW w:type="dxa" w:w="964"/>
+            <w:shd w:val="clear" w:color="auto" w:fill="FFF2CC"/>
+          </w:tcPr>
+          <w:p>
+            <w:r>
+              <w:rPr>
+                <w:b/>
+                <w:sz w:val="19"/>
+              </w:rPr>
+              <w:t>96.96</w:t>
+            </w:r>
+          </w:p>
+        </w:tc>
+        <w:tc>
+          <w:tcPr>
+            <w:tcW w:type="dxa" w:w="964"/>
+            <w:shd w:val="clear" w:color="auto" w:fill="FFF2CC"/>
+          </w:tcPr>
+          <w:p>
+            <w:r>
+              <w:rPr>
+                <w:b/>
+                <w:sz w:val="19"/>
+              </w:rPr>
+              <w:t>96.97</w:t>
+            </w:r>
+          </w:p>
+        </w:tc>
+        <w:tc>
+          <w:tcPr>
+            <w:tcW w:type="dxa" w:w="1134"/>
+            <w:shd w:val="clear" w:color="auto" w:fill="FFF2CC"/>
+          </w:tcPr>
+          <w:p>
+            <w:r>
+              <w:rPr>
+                <w:b/>
+                <w:sz w:val="19"/>
+              </w:rPr>
+              <w:t>96.96</w:t>
+            </w:r>
+          </w:p>
+        </w:tc>
+        <w:tc>
+          <w:tcPr>
+            <w:tcW w:type="dxa" w:w="907"/>
+            <w:shd w:val="clear" w:color="auto" w:fill="FFF2CC"/>
+          </w:tcPr>
+          <w:p>
+            <w:r>
+              <w:rPr>
+                <w:b/>
+                <w:sz w:val="19"/>
+              </w:rPr>
+              <w:t>96.96</w:t>
+            </w:r>
+          </w:p>
+        </w:tc>
+        <w:tc>
+          <w:tcPr>
+            <w:tcW w:type="dxa" w:w="1191"/>
+            <w:shd w:val="clear" w:color="auto" w:fill="FFF2CC"/>
+          </w:tcPr>
+          <w:p>
+            <w:r>
+              <w:rPr>
+                <w:b/>
+                <w:sz w:val="19"/>
+              </w:rPr>
+              <w:t>96.96</w:t>
+            </w:r>
+          </w:p>
+        </w:tc>
+        <w:tc>
+          <w:tcPr>
+            <w:tcW w:type="dxa" w:w="850"/>
+            <w:shd w:val="clear" w:color="auto" w:fill="FFF2CC"/>
+          </w:tcPr>
+          <w:p>
+            <w:r>
+              <w:rPr>
+                <w:b/>
+                <w:sz w:val="19"/>
+              </w:rPr>
+              <w:t>0.9900</w:t>
+            </w:r>
+          </w:p>
+        </w:tc>
+        <w:tc>
+          <w:tcPr>
+            <w:tcW w:type="dxa" w:w="1191"/>
+            <w:shd w:val="clear" w:color="auto" w:fill="FFF2CC"/>
+          </w:tcPr>
+          <w:p>
+            <w:r>
+              <w:rPr>
+                <w:b/>
+                <w:sz w:val="19"/>
+              </w:rPr>
+              <w:t>96.96 ± 0.28</w:t>
+            </w:r>
+          </w:p>
+        </w:tc>
+      </w:tr>
+      <w:tr>
+        <w:tc>
+          <w:tcPr>
+            <w:tcW w:type="dxa" w:w="1871"/>
+            <w:shd w:val="clear" w:color="auto" w:fill="FFF2CC"/>
+          </w:tcPr>
+          <w:p>
+            <w:r>
+              <w:rPr>
+                <w:b/>
+                <w:sz w:val="19"/>
+              </w:rPr>
+              <w:t>DenseNet-121</w:t>
+            </w:r>
+          </w:p>
+        </w:tc>
+        <w:tc>
+          <w:tcPr>
+            <w:tcW w:type="dxa" w:w="964"/>
+            <w:shd w:val="clear" w:color="auto" w:fill="FFF2CC"/>
+          </w:tcPr>
+          <w:p>
+            <w:r>
+              <w:rPr>
+                <w:b/>
+                <w:sz w:val="19"/>
+              </w:rPr>
+              <w:t>95.66</w:t>
+            </w:r>
+          </w:p>
+        </w:tc>
+        <w:tc>
+          <w:tcPr>
+            <w:tcW w:type="dxa" w:w="964"/>
+            <w:shd w:val="clear" w:color="auto" w:fill="FFF2CC"/>
+          </w:tcPr>
+          <w:p>
+            <w:r>
+              <w:rPr>
+                <w:b/>
+                <w:sz w:val="19"/>
+              </w:rPr>
+              <w:t>95.68</w:t>
+            </w:r>
+          </w:p>
+        </w:tc>
+        <w:tc>
+          <w:tcPr>
+            <w:tcW w:type="dxa" w:w="1134"/>
+            <w:shd w:val="clear" w:color="auto" w:fill="FFF2CC"/>
+          </w:tcPr>
+          <w:p>
+            <w:r>
+              <w:rPr>
+                <w:b/>
+                <w:sz w:val="19"/>
+              </w:rPr>
+              <w:t>95.66</w:t>
+            </w:r>
+          </w:p>
+        </w:tc>
+        <w:tc>
+          <w:tcPr>
+            <w:tcW w:type="dxa" w:w="907"/>
+            <w:shd w:val="clear" w:color="auto" w:fill="FFF2CC"/>
+          </w:tcPr>
+          <w:p>
+            <w:r>
+              <w:rPr>
+                <w:b/>
+                <w:sz w:val="19"/>
+              </w:rPr>
+              <w:t>95.66</w:t>
+            </w:r>
+          </w:p>
+        </w:tc>
+        <w:tc>
+          <w:tcPr>
+            <w:tcW w:type="dxa" w:w="1191"/>
+            <w:shd w:val="clear" w:color="auto" w:fill="FFF2CC"/>
+          </w:tcPr>
+          <w:p>
+            <w:r>
+              <w:rPr>
+                <w:b/>
+                <w:sz w:val="19"/>
+              </w:rPr>
+              <w:t>95.66</w:t>
+            </w:r>
+          </w:p>
+        </w:tc>
+        <w:tc>
+          <w:tcPr>
+            <w:tcW w:type="dxa" w:w="850"/>
+            <w:shd w:val="clear" w:color="auto" w:fill="FFF2CC"/>
+          </w:tcPr>
+          <w:p>
+            <w:r>
+              <w:rPr>
+                <w:b/>
+                <w:sz w:val="19"/>
+              </w:rPr>
+              <w:t>0.9906</w:t>
+            </w:r>
+          </w:p>
+        </w:tc>
+        <w:tc>
+          <w:tcPr>
+            <w:tcW w:type="dxa" w:w="1191"/>
+            <w:shd w:val="clear" w:color="auto" w:fill="FFF2CC"/>
+          </w:tcPr>
+          <w:p>
+            <w:r>
+              <w:rPr>
+                <w:b/>
+                <w:sz w:val="19"/>
+              </w:rPr>
+              <w:t>95.66 ± 0.79</w:t>
+            </w:r>
+          </w:p>
+        </w:tc>
+      </w:tr>
+      <w:tr>
+        <w:tc>
+          <w:tcPr>
+            <w:tcW w:type="dxa" w:w="1871"/>
+          </w:tcPr>
+          <w:p>
+            <w:r>
+              <w:rPr>
+                <w:sz w:val="19"/>
+              </w:rPr>
+              <w:t>Swin-Base</w:t>
+            </w:r>
+          </w:p>
+        </w:tc>
+        <w:tc>
+          <w:tcPr>
+            <w:tcW w:type="dxa" w:w="964"/>
+          </w:tcPr>
+          <w:p>
+            <w:r>
+              <w:rPr>
+                <w:sz w:val="19"/>
+              </w:rPr>
+              <w:t>95.56</w:t>
+            </w:r>
+          </w:p>
+        </w:tc>
+        <w:tc>
+          <w:tcPr>
+            <w:tcW w:type="dxa" w:w="964"/>
+          </w:tcPr>
+          <w:p>
+            <w:r>
+              <w:rPr>
+                <w:sz w:val="19"/>
+              </w:rPr>
+              <w:t>95.59</w:t>
+            </w:r>
+          </w:p>
+        </w:tc>
+        <w:tc>
+          <w:tcPr>
+            <w:tcW w:type="dxa" w:w="1134"/>
+          </w:tcPr>
+          <w:p>
+            <w:r>
+              <w:rPr>
+                <w:sz w:val="19"/>
+              </w:rPr>
+              <w:t>95.56</w:t>
+            </w:r>
+          </w:p>
+        </w:tc>
+        <w:tc>
+          <w:tcPr>
+            <w:tcW w:type="dxa" w:w="907"/>
+          </w:tcPr>
+          <w:p>
+            <w:r>
+              <w:rPr>
+                <w:sz w:val="19"/>
+              </w:rPr>
+              <w:t>95.56</w:t>
+            </w:r>
+          </w:p>
+        </w:tc>
+        <w:tc>
+          <w:tcPr>
+            <w:tcW w:type="dxa" w:w="1191"/>
+          </w:tcPr>
+          <w:p>
+            <w:r>
+              <w:rPr>
+                <w:sz w:val="19"/>
+              </w:rPr>
+              <w:t>95.56</w:t>
+            </w:r>
+          </w:p>
+        </w:tc>
+        <w:tc>
+          <w:tcPr>
+            <w:tcW w:type="dxa" w:w="850"/>
+          </w:tcPr>
+          <w:p>
+            <w:r>
+              <w:rPr>
+                <w:sz w:val="19"/>
+              </w:rPr>
+              <w:t>0.9889</w:t>
+            </w:r>
+          </w:p>
+        </w:tc>
+        <w:tc>
+          <w:tcPr>
+            <w:tcW w:type="dxa" w:w="1191"/>
+          </w:tcPr>
+          <w:p>
+            <w:r>
+              <w:rPr>
+                <w:sz w:val="19"/>
+              </w:rPr>
+              <w:t>95.56 ± 0.80</w:t>
+            </w:r>
+          </w:p>
+        </w:tc>
+      </w:tr>
+      <w:tr>
+        <w:tc>
+          <w:tcPr>
+            <w:tcW w:type="dxa" w:w="1871"/>
+          </w:tcPr>
+          <w:p>
+            <w:r>
+              <w:rPr>
+                <w:sz w:val="19"/>
+              </w:rPr>
+              <w:t>DINOv2-Small</w:t>
+            </w:r>
+          </w:p>
+        </w:tc>
+        <w:tc>
+          <w:tcPr>
+            <w:tcW w:type="dxa" w:w="964"/>
+          </w:tcPr>
+          <w:p>
+            <w:r>
+              <w:rPr>
+                <w:sz w:val="19"/>
+              </w:rPr>
+              <w:t>95.44</w:t>
+            </w:r>
+          </w:p>
+        </w:tc>
+        <w:tc>
+          <w:tcPr>
+            <w:tcW w:type="dxa" w:w="964"/>
+          </w:tcPr>
+          <w:p>
+            <w:r>
+              <w:rPr>
+                <w:sz w:val="19"/>
+              </w:rPr>
+              <w:t>95.44</w:t>
+            </w:r>
+          </w:p>
+        </w:tc>
+        <w:tc>
+          <w:tcPr>
+            <w:tcW w:type="dxa" w:w="1134"/>
+          </w:tcPr>
+          <w:p>
+            <w:r>
+              <w:rPr>
+                <w:sz w:val="19"/>
+              </w:rPr>
+              <w:t>95.44</w:t>
+            </w:r>
+          </w:p>
+        </w:tc>
+        <w:tc>
+          <w:tcPr>
+            <w:tcW w:type="dxa" w:w="907"/>
+          </w:tcPr>
+          <w:p>
+            <w:r>
+              <w:rPr>
+                <w:sz w:val="19"/>
+              </w:rPr>
+              <w:t>95.44</w:t>
+            </w:r>
+          </w:p>
+        </w:tc>
+        <w:tc>
+          <w:tcPr>
+            <w:tcW w:type="dxa" w:w="1191"/>
+          </w:tcPr>
+          <w:p>
+            <w:r>
+              <w:rPr>
+                <w:sz w:val="19"/>
+              </w:rPr>
+              <w:t>95.44</w:t>
+            </w:r>
+          </w:p>
+        </w:tc>
+        <w:tc>
+          <w:tcPr>
+            <w:tcW w:type="dxa" w:w="850"/>
+          </w:tcPr>
+          <w:p>
+            <w:r>
+              <w:rPr>
+                <w:sz w:val="19"/>
+              </w:rPr>
+              <w:t>0.9860</w:t>
+            </w:r>
+          </w:p>
+        </w:tc>
+        <w:tc>
+          <w:tcPr>
+            <w:tcW w:type="dxa" w:w="1191"/>
+          </w:tcPr>
+          <w:p>
+            <w:r>
+              <w:rPr>
+                <w:sz w:val="19"/>
+              </w:rPr>
+              <w:t>95.44 ± 0.74</w:t>
+            </w:r>
+          </w:p>
+        </w:tc>
+      </w:tr>
+      <w:tr>
+        <w:tc>
+          <w:tcPr>
+            <w:tcW w:type="dxa" w:w="1871"/>
+          </w:tcPr>
+          <w:p>
+            <w:r>
+              <w:rPr>
+                <w:sz w:val="19"/>
+              </w:rPr>
+              <w:t>EfficientNet-B0</w:t>
+            </w:r>
+          </w:p>
+        </w:tc>
+        <w:tc>
+          <w:tcPr>
+            <w:tcW w:type="dxa" w:w="964"/>
+          </w:tcPr>
+          <w:p>
+            <w:r>
+              <w:rPr>
+                <w:sz w:val="19"/>
+              </w:rPr>
+              <w:t>94.27</w:t>
+            </w:r>
+          </w:p>
+        </w:tc>
+        <w:tc>
+          <w:tcPr>
+            <w:tcW w:type="dxa" w:w="964"/>
+          </w:tcPr>
+          <w:p>
+            <w:r>
+              <w:rPr>
+                <w:sz w:val="19"/>
+              </w:rPr>
+              <w:t>94.28</w:t>
+            </w:r>
+          </w:p>
+        </w:tc>
+        <w:tc>
+          <w:tcPr>
+            <w:tcW w:type="dxa" w:w="1134"/>
+          </w:tcPr>
+          <w:p>
+            <w:r>
+              <w:rPr>
+                <w:sz w:val="19"/>
+              </w:rPr>
+              <w:t>94.27</w:t>
+            </w:r>
+          </w:p>
+        </w:tc>
+        <w:tc>
+          <w:tcPr>
+            <w:tcW w:type="dxa" w:w="907"/>
+          </w:tcPr>
+          <w:p>
+            <w:r>
+              <w:rPr>
+                <w:sz w:val="19"/>
+              </w:rPr>
+              <w:t>94.27</w:t>
+            </w:r>
+          </w:p>
+        </w:tc>
+        <w:tc>
+          <w:tcPr>
+            <w:tcW w:type="dxa" w:w="1191"/>
+          </w:tcPr>
+          <w:p>
+            <w:r>
+              <w:rPr>
+                <w:sz w:val="19"/>
+              </w:rPr>
+              <w:t>94.27</w:t>
+            </w:r>
+          </w:p>
+        </w:tc>
+        <w:tc>
+          <w:tcPr>
+            <w:tcW w:type="dxa" w:w="850"/>
+          </w:tcPr>
+          <w:p>
+            <w:r>
+              <w:rPr>
+                <w:sz w:val="19"/>
+              </w:rPr>
+              <w:t>0.9859</w:t>
+            </w:r>
+          </w:p>
+        </w:tc>
+        <w:tc>
+          <w:tcPr>
+            <w:tcW w:type="dxa" w:w="1191"/>
+          </w:tcPr>
+          <w:p>
+            <w:r>
+              <w:rPr>
+                <w:sz w:val="19"/>
+              </w:rPr>
+              <w:t>94.27 ± 0.59</w:t>
+            </w:r>
+          </w:p>
+        </w:tc>
+      </w:tr>
+      <w:tr>
+        <w:tc>
+          <w:tcPr>
+            <w:tcW w:type="dxa" w:w="1871"/>
+          </w:tcPr>
+          <w:p>
+            <w:r>
+              <w:rPr>
+                <w:sz w:val="19"/>
+              </w:rPr>
+              <w:t>EfficientNet-Lite0</w:t>
+            </w:r>
+          </w:p>
+        </w:tc>
+        <w:tc>
+          <w:tcPr>
+            <w:tcW w:type="dxa" w:w="964"/>
+          </w:tcPr>
+          <w:p>
+            <w:r>
+              <w:rPr>
+                <w:sz w:val="19"/>
+              </w:rPr>
+              <w:t>91.02</w:t>
+            </w:r>
+          </w:p>
+        </w:tc>
+        <w:tc>
+          <w:tcPr>
+            <w:tcW w:type="dxa" w:w="964"/>
+          </w:tcPr>
+          <w:p>
+            <w:r>
+              <w:rPr>
+                <w:sz w:val="19"/>
+              </w:rPr>
+              <w:t>91.03</w:t>
+            </w:r>
+          </w:p>
+        </w:tc>
+        <w:tc>
+          <w:tcPr>
+            <w:tcW w:type="dxa" w:w="1134"/>
+          </w:tcPr>
+          <w:p>
+            <w:r>
+              <w:rPr>
+                <w:sz w:val="19"/>
+              </w:rPr>
+              <w:t>91.02</w:t>
+            </w:r>
+          </w:p>
+        </w:tc>
+        <w:tc>
+          <w:tcPr>
+            <w:tcW w:type="dxa" w:w="907"/>
+          </w:tcPr>
+          <w:p>
+            <w:r>
+              <w:rPr>
+                <w:sz w:val="19"/>
+              </w:rPr>
+              <w:t>91.02</w:t>
+            </w:r>
+          </w:p>
+        </w:tc>
+        <w:tc>
+          <w:tcPr>
+            <w:tcW w:type="dxa" w:w="1191"/>
+          </w:tcPr>
+          <w:p>
+            <w:r>
+              <w:rPr>
+                <w:sz w:val="19"/>
+              </w:rPr>
+              <w:t>91.02</w:t>
+            </w:r>
+          </w:p>
+        </w:tc>
+        <w:tc>
+          <w:tcPr>
+            <w:tcW w:type="dxa" w:w="850"/>
+          </w:tcPr>
+          <w:p>
+            <w:r>
+              <w:rPr>
+                <w:sz w:val="19"/>
+              </w:rPr>
+              <w:t>0.9700</w:t>
+            </w:r>
+          </w:p>
+        </w:tc>
+        <w:tc>
+          <w:tcPr>
+            <w:tcW w:type="dxa" w:w="1191"/>
+          </w:tcPr>
+          <w:p>
+            <w:r>
+              <w:rPr>
+                <w:sz w:val="19"/>
+              </w:rPr>
+              <w:t>91.02 ± 1.38</w:t>
+            </w:r>
+          </w:p>
+        </w:tc>
+      </w:tr>
+      <w:tr>
+        <w:tc>
+          <w:tcPr>
+            <w:tcW w:type="dxa" w:w="1871"/>
+          </w:tcPr>
+          <w:p>
+            <w:r>
+              <w:rPr>
+                <w:sz w:val="19"/>
+              </w:rPr>
+              <w:t>MobileNetV3-Small</w:t>
+            </w:r>
+          </w:p>
+        </w:tc>
+        <w:tc>
+          <w:tcPr>
+            <w:tcW w:type="dxa" w:w="964"/>
+          </w:tcPr>
+          <w:p>
+            <w:r>
+              <w:rPr>
+                <w:sz w:val="19"/>
+              </w:rPr>
+              <w:t>90.66</w:t>
+            </w:r>
+          </w:p>
+        </w:tc>
+        <w:tc>
+          <w:tcPr>
+            <w:tcW w:type="dxa" w:w="964"/>
+          </w:tcPr>
+          <w:p>
+            <w:r>
+              <w:rPr>
+                <w:sz w:val="19"/>
+              </w:rPr>
+              <w:t>90.67</w:t>
+            </w:r>
+          </w:p>
+        </w:tc>
+        <w:tc>
+          <w:tcPr>
+            <w:tcW w:type="dxa" w:w="1134"/>
+          </w:tcPr>
+          <w:p>
+            <w:r>
+              <w:rPr>
+                <w:sz w:val="19"/>
+              </w:rPr>
+              <w:t>90.66</w:t>
+            </w:r>
+          </w:p>
+        </w:tc>
+        <w:tc>
+          <w:tcPr>
+            <w:tcW w:type="dxa" w:w="907"/>
+          </w:tcPr>
+          <w:p>
+            <w:r>
+              <w:rPr>
+                <w:sz w:val="19"/>
+              </w:rPr>
+              <w:t>90.66</w:t>
+            </w:r>
+          </w:p>
+        </w:tc>
+        <w:tc>
+          <w:tcPr>
+            <w:tcW w:type="dxa" w:w="1191"/>
+          </w:tcPr>
+          <w:p>
+            <w:r>
+              <w:rPr>
+                <w:sz w:val="19"/>
+              </w:rPr>
+              <w:t>90.66</w:t>
+            </w:r>
+          </w:p>
+        </w:tc>
+        <w:tc>
+          <w:tcPr>
+            <w:tcW w:type="dxa" w:w="850"/>
+          </w:tcPr>
+          <w:p>
+            <w:r>
+              <w:rPr>
+                <w:sz w:val="19"/>
+              </w:rPr>
+              <w:t>0.9706</w:t>
+            </w:r>
+          </w:p>
+        </w:tc>
+        <w:tc>
+          <w:tcPr>
+            <w:tcW w:type="dxa" w:w="1191"/>
+          </w:tcPr>
+          <w:p>
+            <w:r>
+              <w:rPr>
+                <w:sz w:val="19"/>
+              </w:rPr>
+              <w:t>90.66 ± 1.49</w:t>
+            </w:r>
+          </w:p>
+        </w:tc>
+      </w:tr>
+      <w:tr>
+        <w:tc>
+          <w:tcPr>
+            <w:tcW w:type="dxa" w:w="1871"/>
+          </w:tcPr>
+          <w:p>
+            <w:r>
+              <w:rPr>
+                <w:sz w:val="19"/>
+              </w:rPr>
+              <w:t>ResNet-50</w:t>
+            </w:r>
+          </w:p>
+        </w:tc>
+        <w:tc>
+          <w:tcPr>
+            <w:tcW w:type="dxa" w:w="964"/>
+          </w:tcPr>
+          <w:p>
+            <w:r>
+              <w:rPr>
+                <w:sz w:val="19"/>
+              </w:rPr>
+              <w:t>89.06</w:t>
+            </w:r>
+          </w:p>
+        </w:tc>
+        <w:tc>
+          <w:tcPr>
+            <w:tcW w:type="dxa" w:w="964"/>
+          </w:tcPr>
+          <w:p>
+            <w:r>
+              <w:rPr>
+                <w:sz w:val="19"/>
+              </w:rPr>
+              <w:t>89.06</w:t>
+            </w:r>
+          </w:p>
+        </w:tc>
+        <w:tc>
+          <w:tcPr>
+            <w:tcW w:type="dxa" w:w="1134"/>
+          </w:tcPr>
+          <w:p>
+            <w:r>
+              <w:rPr>
+                <w:sz w:val="19"/>
+              </w:rPr>
+              <w:t>89.06</w:t>
+            </w:r>
+          </w:p>
+        </w:tc>
+        <w:tc>
+          <w:tcPr>
+            <w:tcW w:type="dxa" w:w="907"/>
+          </w:tcPr>
+          <w:p>
+            <w:r>
+              <w:rPr>
+                <w:sz w:val="19"/>
+              </w:rPr>
+              <w:t>89.06</w:t>
+            </w:r>
+          </w:p>
+        </w:tc>
+        <w:tc>
+          <w:tcPr>
+            <w:tcW w:type="dxa" w:w="1191"/>
+          </w:tcPr>
+          <w:p>
+            <w:r>
+              <w:rPr>
+                <w:sz w:val="19"/>
+              </w:rPr>
+              <w:t>89.06</w:t>
+            </w:r>
+          </w:p>
+        </w:tc>
+        <w:tc>
+          <w:tcPr>
+            <w:tcW w:type="dxa" w:w="850"/>
+          </w:tcPr>
+          <w:p>
+            <w:r>
+              <w:rPr>
+                <w:sz w:val="19"/>
+              </w:rPr>
+              <w:t>0.9593</w:t>
+            </w:r>
+          </w:p>
+        </w:tc>
+        <w:tc>
+          <w:tcPr>
+            <w:tcW w:type="dxa" w:w="1191"/>
+          </w:tcPr>
+          <w:p>
+            <w:r>
+              <w:rPr>
+                <w:sz w:val="19"/>
+              </w:rPr>
+              <w:t>89.06 ± 0.99</w:t>
+            </w:r>
+          </w:p>
+        </w:tc>
+      </w:tr>
+      <w:tr>
+        <w:tc>
+          <w:tcPr>
+            <w:tcW w:type="dxa" w:w="1871"/>
+          </w:tcPr>
+          <w:p>
+            <w:r>
+              <w:rPr>
+                <w:sz w:val="19"/>
+              </w:rPr>
+              <w:t>MobileNetV2</w:t>
+            </w:r>
+          </w:p>
+        </w:tc>
+        <w:tc>
+          <w:tcPr>
+            <w:tcW w:type="dxa" w:w="964"/>
+          </w:tcPr>
+          <w:p>
+            <w:r>
+              <w:rPr>
+                <w:sz w:val="19"/>
+              </w:rPr>
+              <w:t>89.01</w:t>
+            </w:r>
+          </w:p>
+        </w:tc>
+        <w:tc>
+          <w:tcPr>
+            <w:tcW w:type="dxa" w:w="964"/>
+          </w:tcPr>
+          <w:p>
+            <w:r>
+              <w:rPr>
+                <w:sz w:val="19"/>
+              </w:rPr>
+              <w:t>89.04</w:t>
+            </w:r>
+          </w:p>
+        </w:tc>
+        <w:tc>
+          <w:tcPr>
+            <w:tcW w:type="dxa" w:w="1134"/>
+          </w:tcPr>
+          <w:p>
+            <w:r>
+              <w:rPr>
+                <w:sz w:val="19"/>
+              </w:rPr>
+              <w:t>89.01</w:t>
+            </w:r>
+          </w:p>
+        </w:tc>
+        <w:tc>
+          <w:tcPr>
+            <w:tcW w:type="dxa" w:w="907"/>
+          </w:tcPr>
+          <w:p>
+            <w:r>
+              <w:rPr>
+                <w:sz w:val="19"/>
+              </w:rPr>
+              <w:t>89.01</w:t>
+            </w:r>
+          </w:p>
+        </w:tc>
+        <w:tc>
+          <w:tcPr>
+            <w:tcW w:type="dxa" w:w="1191"/>
+          </w:tcPr>
+          <w:p>
+            <w:r>
+              <w:rPr>
+                <w:sz w:val="19"/>
+              </w:rPr>
+              <w:t>89.01</w:t>
+            </w:r>
+          </w:p>
+        </w:tc>
+        <w:tc>
+          <w:tcPr>
+            <w:tcW w:type="dxa" w:w="850"/>
+          </w:tcPr>
+          <w:p>
+            <w:r>
+              <w:rPr>
+                <w:sz w:val="19"/>
+              </w:rPr>
+              <w:t>0.9591</w:t>
+            </w:r>
+          </w:p>
+        </w:tc>
+        <w:tc>
+          <w:tcPr>
+            <w:tcW w:type="dxa" w:w="1191"/>
+          </w:tcPr>
+          <w:p>
+            <w:r>
+              <w:rPr>
+                <w:sz w:val="19"/>
+              </w:rPr>
+              <w:t>89.01 ± 0.17</w:t>
+            </w:r>
+          </w:p>
+        </w:tc>
+      </w:tr>
+      <w:tr>
+        <w:tc>
+          <w:tcPr>
+            <w:tcW w:type="dxa" w:w="1871"/>
+          </w:tcPr>
+          <w:p>
+            <w:r>
+              <w:rPr>
+                <w:sz w:val="19"/>
+              </w:rPr>
+              <w:t>MobileNetV1</w:t>
+            </w:r>
+          </w:p>
+        </w:tc>
+        <w:tc>
+          <w:tcPr>
+            <w:tcW w:type="dxa" w:w="964"/>
+          </w:tcPr>
+          <w:p>
+            <w:r>
+              <w:rPr>
+                <w:sz w:val="19"/>
+              </w:rPr>
+              <w:t>89.00</w:t>
+            </w:r>
+          </w:p>
+        </w:tc>
+        <w:tc>
+          <w:tcPr>
+            <w:tcW w:type="dxa" w:w="964"/>
+          </w:tcPr>
+          <w:p>
+            <w:r>
+              <w:rPr>
+                <w:sz w:val="19"/>
+              </w:rPr>
+              <w:t>89.01</w:t>
+            </w:r>
+          </w:p>
+        </w:tc>
+        <w:tc>
+          <w:tcPr>
+            <w:tcW w:type="dxa" w:w="1134"/>
+          </w:tcPr>
+          <w:p>
+            <w:r>
+              <w:rPr>
+                <w:sz w:val="19"/>
+              </w:rPr>
+              <w:t>89.00</w:t>
+            </w:r>
+          </w:p>
+        </w:tc>
+        <w:tc>
+          <w:tcPr>
+            <w:tcW w:type="dxa" w:w="907"/>
+          </w:tcPr>
+          <w:p>
+            <w:r>
+              <w:rPr>
+                <w:sz w:val="19"/>
+              </w:rPr>
+              <w:t>89.00</w:t>
+            </w:r>
+          </w:p>
+        </w:tc>
+        <w:tc>
+          <w:tcPr>
+            <w:tcW w:type="dxa" w:w="1191"/>
+          </w:tcPr>
+          <w:p>
+            <w:r>
+              <w:rPr>
+                <w:sz w:val="19"/>
+              </w:rPr>
+              <w:t>89.00</w:t>
+            </w:r>
+          </w:p>
+        </w:tc>
+        <w:tc>
+          <w:tcPr>
+            <w:tcW w:type="dxa" w:w="850"/>
+          </w:tcPr>
+          <w:p>
+            <w:r>
+              <w:rPr>
+                <w:sz w:val="19"/>
+              </w:rPr>
+              <w:t>0.9556</w:t>
+            </w:r>
+          </w:p>
+        </w:tc>
+        <w:tc>
+          <w:tcPr>
+            <w:tcW w:type="dxa" w:w="1191"/>
+          </w:tcPr>
+          <w:p>
+            <w:r>
+              <w:rPr>
+                <w:sz w:val="19"/>
+              </w:rPr>
+              <w:t>89.00 ± 1.63</w:t>
+            </w:r>
+          </w:p>
+        </w:tc>
+      </w:tr>
+    </w:tbl>
+    <w:p>
+      <w:r>
+        <w:rPr>
+          <w:sz w:val="18"/>
+        </w:rPr>
+        <w:t>Nota. Ordenado por F1 macro. Resaltados los modelos seleccionados en la sección 3.6. Fuente: 3_resultados_test_por_modelo/metricas_pooled_por_modelo.csv y 3_resultados_test_por_modelo/metricas_por_fold.csv.</w:t>
       </w:r>
     </w:p>
     <w:p>
@@ -532,98 +2320,7 @@
         <w:jc w:val="both"/>
       </w:pPr>
       <w:r>
-        <w:t>Durante cada epoch se calcula val_F1. Cuando el valor obtenido supera el mejor val_F1 observado previamente dentro de ese mismo fold, el checkpoint se sobrescribe y pasa a ser el nuevo «mejor modelo» de esa corrida. Si en los epochs siguientes el desempeño empeora, esos pesos no sustituyen al checkpoint guardado. Por ello, el modelo que finalmente se evalúa no es necesariamente el correspondiente al último epoch ejecutado.</w:t>
-      </w:r>
-    </w:p>
-    <w:p>
-      <w:pPr>
-        <w:jc w:val="both"/>
-      </w:pPr>
-      <w:r>
-        <w:t>Se incorpora early stopping con una paciencia de siete epochs sin mejora. Operativamente, esto significa que si el entrenamiento acumula siete epochs sin superar el mejor val_F1 registrado, se detiene antes de alcanzar los 30 epochs. Si aparece una nueva mejora, el contador de paciencia vuelve a iniciar. Este mecanismo reduce entrenamiento innecesario y, sobre todo, mantiene la selección del modelo ligada al desempeño de validación.</w:t>
-      </w:r>
-    </w:p>
-    <w:p>
-      <w:pPr>
-        <w:jc w:val="both"/>
-      </w:pPr>
-      <w:r>
-        <w:t>Es importante distinguir tres conceptos. Los pesos se aprenden con train; el checkpoint se selecciona con validation; y el desempeño final se mide con test. La separación de estas funciones evita utilizar el test para tomar decisiones durante el entrenamiento. Una vez finalizada la corrida, se recarga expresamente el mejor checkpoint almacenado.</w:t>
-      </w:r>
-    </w:p>
-    <w:p>
-      <w:pPr>
-        <w:pStyle w:val="ListBullet"/>
-        <w:jc w:val="both"/>
-      </w:pPr>
-      <w:r>
-        <w:rPr>
-          <w:b/>
-        </w:rPr>
-        <w:t xml:space="preserve">Cantidad máxima de entrenamientos: </w:t>
-      </w:r>
-      <w:r>
-        <w:t>10 modelos × 5 folds = 50 combinaciones modelo–fold.</w:t>
-      </w:r>
-    </w:p>
-    <w:p>
-      <w:pPr>
-        <w:pStyle w:val="ListBullet"/>
-        <w:jc w:val="both"/>
-      </w:pPr>
-      <w:r>
-        <w:rPr>
-          <w:b/>
-        </w:rPr>
-        <w:t xml:space="preserve">Máximo de epochs: </w:t>
-      </w:r>
-      <w:r>
-        <w:t>30 por combinación.</w:t>
-      </w:r>
-    </w:p>
-    <w:p>
-      <w:pPr>
-        <w:pStyle w:val="ListBullet"/>
-        <w:jc w:val="both"/>
-      </w:pPr>
-      <w:r>
-        <w:rPr>
-          <w:b/>
-        </w:rPr>
-        <w:t xml:space="preserve">Early stopping: </w:t>
-      </w:r>
-      <w:r>
-        <w:t>Paciencia de 7 epochs sin mejora.</w:t>
-      </w:r>
-    </w:p>
-    <w:p>
-      <w:pPr>
-        <w:pStyle w:val="ListBullet"/>
-        <w:jc w:val="both"/>
-      </w:pPr>
-      <w:r>
-        <w:rPr>
-          <w:b/>
-        </w:rPr>
-        <w:t xml:space="preserve">Criterio para guardar checkpoint: </w:t>
-      </w:r>
-      <w:r>
-        <w:t>Mejor val_F1 macro observado en el fold.</w:t>
-      </w:r>
-    </w:p>
-    <w:p>
-      <w:pPr>
-        <w:pStyle w:val="ListBullet"/>
-        <w:jc w:val="both"/>
-      </w:pPr>
-      <w:r>
-        <w:rPr>
-          <w:b/>
-        </w:rPr>
-        <w:t xml:space="preserve">Modelo que pasa a test: </w:t>
-      </w:r>
-      <w:r>
-        <w:t>El mejor checkpoint, no necesariamente el último epoch.</w:t>
+        <w:t>ViT-Base/16 obtiene el mayor F1 macro (96.96%) y DenseNet-121 el segundo (95.66%), con el mayor AUC de los diez (0.9906). Los cuatro mejores modelos quedan entre 95.4% y 97.0% de F1; los seis restantes, entre 89.0% y 94.3%. Como el conjunto está balanceado, exactitud, sensibilidad y especificidad coinciden prácticamente con el F1.</w:t>
       </w:r>
     </w:p>
     <w:p>
@@ -634,10 +2331,10 @@
         <w:rPr>
           <w:b/>
         </w:rPr>
-        <w:t xml:space="preserve">Alineación dentro del flujo. </w:t>
+        <w:t xml:space="preserve">Resultado de la sección. </w:t>
       </w:r>
       <w:r>
-        <w:t>La salida de esta etapa son cinco checkpoints seleccionados por modelo, uno por cada fold. Estos checkpoints son los únicos que pasan a la evaluación independiente de la etapa siguiente.</w:t>
+        <w:t>desempeño comparativo de los diez modelos candidatos. Comparación completa en Documentacion_Tecnica_10_Modelos.docx, sección 3.5; matrices de confusión, curvas ROC y cálculos por fold de cada modelo en su sección 3.4.</w:t>
       </w:r>
     </w:p>
     <w:p>
@@ -645,7 +2342,7 @@
         <w:pStyle w:val="Heading2"/>
       </w:pPr>
       <w:r>
-        <w:t>Etapa 5. Evaluación del mejor checkpoint sobre el test independiente de cada fold</w:t>
+        <w:t>3.6. Selección de los modelos de referencia</w:t>
       </w:r>
     </w:p>
     <w:p>
@@ -653,253 +2350,7 @@
         <w:jc w:val="both"/>
       </w:pPr>
       <w:r>
-        <w:t>Al concluir el entrenamiento de un fold se recarga el checkpoint que obtuvo el mejor val_F1. Recién en ese momento se utiliza el 20% de test correspondiente a la corrida. Ese conjunto de prueba no se utiliza ni para actualizar los pesos ni para seleccionar el checkpoint. Las métricas reportadas se obtuvieron recargando esos mismos checkpoints y repitiendo únicamente la inferencia sobre el mismo test, sin reentrenar ni tomar decisiones con él.</w:t>
-      </w:r>
-    </w:p>
-    <w:p>
-      <w:pPr>
-        <w:jc w:val="both"/>
-      </w:pPr>
-      <w:r>
-        <w:t>Para cada fold se generan predicciones de clase y probabilidades. A partir de las predicciones se construye la matriz de confusión y se identifican verdaderos positivos, falsos positivos, falsos negativos y verdaderos negativos. Sobre estos valores se calculan Accuracy, Precisión, Recall, F1 y Especificidad. Las probabilidades de salida (probabilidad softmax de la clase «no_fresco») se utilizan adicionalmente para construir la curva ROC y calcular el AUC.</w:t>
-      </w:r>
-    </w:p>
-    <w:p>
-      <w:pPr>
-        <w:jc w:val="both"/>
-      </w:pPr>
-      <w:r>
-        <w:t>Las métricas por clase se interpretan mediante un esquema one-vs-rest: primero se considera «fresco» como clase positiva y después «no_fresco». Las métricas macro promedian ambas clases, de modo que las dos tienen el mismo peso en el resultado reportado. El AUC agrega otra dimensión: mientras Accuracy o F1 reflejan el comportamiento bajo la decisión de clasificación aplicada, el AUC evalúa la capacidad de discriminación a través de distintos umbrales.</w:t>
-      </w:r>
-    </w:p>
-    <w:p>
-      <w:pPr>
-        <w:jc w:val="both"/>
-      </w:pPr>
-      <w:r>
-        <w:t>Al repetirse este procedimiento en los cinco folds, cada modelo obtiene cinco evaluaciones sobre conjuntos de prueba disjuntos. Estas evaluaciones permiten observar dos aspectos distintos: el desempeño alcanzado por el modelo y la variabilidad de dicho desempeño cuando cambia la partición de los datos.</w:t>
-      </w:r>
-    </w:p>
-    <w:p>
-      <w:pPr>
-        <w:pStyle w:val="ListBullet"/>
-        <w:jc w:val="both"/>
-      </w:pPr>
-      <w:r>
-        <w:rPr>
-          <w:b/>
-        </w:rPr>
-        <w:t xml:space="preserve">Productos por fold: </w:t>
-      </w:r>
-      <w:r>
-        <w:t>Predicciones, matriz de confusión, métricas y curva ROC.</w:t>
-      </w:r>
-    </w:p>
-    <w:p>
-      <w:pPr>
-        <w:pStyle w:val="ListBullet"/>
-        <w:jc w:val="both"/>
-      </w:pPr>
-      <w:r>
-        <w:rPr>
-          <w:b/>
-        </w:rPr>
-        <w:t xml:space="preserve">Uso del test: </w:t>
-      </w:r>
-      <w:r>
-        <w:t>Solo para medir el checkpoint ya seleccionado; nunca para tomar decisiones.</w:t>
-      </w:r>
-    </w:p>
-    <w:p>
-      <w:pPr>
-        <w:pStyle w:val="ListBullet"/>
-        <w:jc w:val="both"/>
-      </w:pPr>
-      <w:r>
-        <w:rPr>
-          <w:b/>
-        </w:rPr>
-        <w:t xml:space="preserve">Finalidad: </w:t>
-      </w:r>
-      <w:r>
-        <w:t>Obtener evidencia independiente de desempeño para cada fold.</w:t>
-      </w:r>
-    </w:p>
-    <w:p>
-      <w:pPr>
-        <w:jc w:val="both"/>
-      </w:pPr>
-      <w:r>
-        <w:rPr>
-          <w:b/>
-        </w:rPr>
-        <w:t xml:space="preserve">Alineación dentro del flujo. </w:t>
-      </w:r>
-      <w:r>
-        <w:t>Esta etapa convierte los checkpoints seleccionados en resultados de prueba por fold. Estos resultados permiten analizar el desempeño y su variabilidad entre particiones y, adicionalmente, construir una evaluación global mediante la consolidación de las predicciones out-of-fold.</w:t>
-      </w:r>
-    </w:p>
-    <w:p>
-      <w:pPr>
-        <w:pStyle w:val="Heading2"/>
-      </w:pPr>
-      <w:r>
-        <w:t>Etapa 6. Consolidación de predicciones out-of-fold (OOF) y métricas globales pooled</w:t>
-      </w:r>
-    </w:p>
-    <w:p>
-      <w:pPr>
-        <w:jc w:val="both"/>
-      </w:pPr>
-      <w:r>
-        <w:t>Después de evaluar los cinco checkpoints de un modelo, las predicciones obtenidas en los cinco conjuntos de test se concatenan. Debido a que los folds de prueba son disjuntos y, en conjunto, cubren las 8,000 imágenes, se obtienen 8,000 predicciones out-of-fold (OOF): cada imagen aparece exactamente una vez como observación de prueba y su predicción procede de un modelo entrenado sin utilizar esa imagen.</w:t>
-      </w:r>
-    </w:p>
-    <w:p>
-      <w:pPr>
-        <w:jc w:val="both"/>
-      </w:pPr>
-      <w:r>
-        <w:t>A partir de las predicciones OOF concatenadas se calculan métricas globales (pooled). Estas métricas constituyen un resumen complementario del comportamiento del modelo sobre el conjunto completo de predicciones fuera de muestra. No deben interpretarse como el promedio de las métricas de los cinco folds: métricas no lineales como F1 y AUC se recalculan directamente sobre las predicciones o puntuaciones concatenadas y, por tanto, pueden diferir del promedio aritmético de sus valores por fold. En el caso de la matriz de confusión, la matriz pooled equivale a la suma celda a celda de las cinco matrices de confusión.</w:t>
-      </w:r>
-    </w:p>
-    <w:p>
-      <w:pPr>
-        <w:jc w:val="both"/>
-      </w:pPr>
-      <w:r>
-        <w:t>Sobre las predicciones OOF se calculan las métricas globales conservando los valores obtenidos experimentalmente. Para ViT-Base/16, el resultado pooled es F1 macro de 96.96%, Accuracy de 96.96% y AUC de 0.9900. Para DenseNet-121, el resultado pooled es F1 macro de 95.66%, Accuracy de 95.66% y AUC de 0.9906. Estos valores proporcionan una visión global complementaria del desempeño de cada arquitectura.</w:t>
-      </w:r>
-    </w:p>
-    <w:p>
-      <w:pPr>
-        <w:jc w:val="both"/>
-      </w:pPr>
-      <w:r>
-        <w:t>Paralelamente, se conserva el F1 obtenido en cada uno de los cinco folds y se calcula su desviación estándar muestral. Esta información caracteriza la estabilidad del modelo frente a cambios en la partición. Por ello, la interpretación combina dos perspectivas: las métricas globales OOF/pooled resumen el comportamiento agregado de las predicciones fuera de muestra, mientras que la variabilidad entre folds informa sobre la consistencia del desempeño. La evaluación por folds se resume mediante el F1 macro medio de las cinco particiones acompañado de su desviación estándar (media ± DE), mientras que el F1 OOF/pooled se mantiene como una medida global complementaria calculada sobre las 8,000 predicciones fuera de muestra.</w:t>
-      </w:r>
-    </w:p>
-    <w:p>
-      <w:pPr>
-        <w:pStyle w:val="ListBullet"/>
-        <w:jc w:val="both"/>
-      </w:pPr>
-      <w:r>
-        <w:rPr>
-          <w:b/>
-        </w:rPr>
-        <w:t xml:space="preserve">Resultado OOF/pooled: </w:t>
-      </w:r>
-      <w:r>
-        <w:t>Métricas recalculadas sobre las 8,000 predicciones out-of-fold concatenadas.</w:t>
-      </w:r>
-    </w:p>
-    <w:p>
-      <w:pPr>
-        <w:pStyle w:val="ListBullet"/>
-        <w:jc w:val="both"/>
-      </w:pPr>
-      <w:r>
-        <w:rPr>
-          <w:b/>
-        </w:rPr>
-        <w:t xml:space="preserve">Matriz de confusión pooled: </w:t>
-      </w:r>
-      <w:r>
-        <w:t>Suma de las cinco matrices de confusión de test.</w:t>
-      </w:r>
-    </w:p>
-    <w:p>
-      <w:pPr>
-        <w:pStyle w:val="ListBullet"/>
-        <w:jc w:val="both"/>
-      </w:pPr>
-      <w:r>
-        <w:rPr>
-          <w:b/>
-        </w:rPr>
-        <w:t xml:space="preserve">Información por fold: </w:t>
-      </w:r>
-      <w:r>
-        <w:t>F1 de cada partición, resumido como media ± desviación estándar.</w:t>
-      </w:r>
-    </w:p>
-    <w:p>
-      <w:pPr>
-        <w:jc w:val="both"/>
-      </w:pPr>
-      <w:r>
-        <w:rPr>
-          <w:b/>
-        </w:rPr>
-        <w:t xml:space="preserve">Alineación dentro del flujo. </w:t>
-      </w:r>
-      <w:r>
-        <w:t>Esta etapa genera dos niveles de evidencia complementarios: resultados por fold para analizar la variabilidad del desempeño y resultados OOF/pooled para resumir globalmente las predicciones fuera de muestra. Ambos niveles, junto con la complejidad del modelo, alimentan la comparación multicriterio.</w:t>
-      </w:r>
-    </w:p>
-    <w:p>
-      <w:pPr>
-        <w:pStyle w:val="Heading2"/>
-      </w:pPr>
-      <w:r>
-        <w:t>Etapa 7. Comparación multicriterio de los diez modelos</w:t>
-      </w:r>
-    </w:p>
-    <w:p>
-      <w:pPr>
-        <w:jc w:val="both"/>
-      </w:pPr>
-      <w:r>
-        <w:t>Con los resultados consolidados, el flujo deja de ser puramente operativo y entra en la fase de decisión. La selección de los modelos no se realiza mediante una única métrica, sino mediante cinco criterios complementarios: desempeño, discriminación, estabilidad, eficiencia y diversidad arquitectónica.</w:t>
-      </w:r>
-    </w:p>
-    <w:p>
-      <w:pPr>
-        <w:jc w:val="both"/>
-      </w:pPr>
-      <w:r>
-        <w:t>El primer criterio es el desempeño predictivo. Se considera el F1 macro obtenido sobre las predicciones OOF/pooled, complementado por el comportamiento observado entre los cinco folds. Bajo el resultado pooled, ViT-Base/16 ocupa el primer lugar con 96.96% y DenseNet-121 el segundo con 95.66%. Swin-Base obtiene 95.56% y DINOv2-Small 95.44%.</w:t>
-      </w:r>
-    </w:p>
-    <w:p>
-      <w:pPr>
-        <w:jc w:val="both"/>
-      </w:pPr>
-      <w:r>
-        <w:t>El segundo criterio es la capacidad discriminativa medida mediante AUC. DenseNet-121 obtiene el mayor AUC pooled de los diez modelos, con 0.9906, y ViT-Base/16 ocupa el segundo lugar con 0.9900. El AUC se calcula a partir de las probabilidades de salida, no de las etiquetas de clase predichas, y resume la capacidad de discriminación a través de distintos umbrales. Al tratarse de un AUC calculado sobre predicciones OOF procedentes de cinco modelos entrenados en folds diferentes, se interpreta como una medida global complementaria al análisis por fold.</w:t>
-      </w:r>
-    </w:p>
-    <w:p>
-      <w:pPr>
-        <w:jc w:val="both"/>
-      </w:pPr>
-      <w:r>
-        <w:t>El tercer criterio es la estabilidad entre folds. Se utiliza la desviación estándar del F1 de las cinco evaluaciones. ViT-Base/16 presenta una desviación estándar de 0.28, lo que evidencia una alta estabilidad entre los candidatos de mayor desempeño. DenseNet-121 registra 0.79; aunque no es la desviación más baja de todo el conjunto, mantiene un nivel de desempeño alto y una estabilidad comparable con otros modelos líderes.</w:t>
-      </w:r>
-    </w:p>
-    <w:p>
-      <w:pPr>
-        <w:jc w:val="both"/>
-      </w:pPr>
-      <w:r>
-        <w:t>El cuarto criterio es la eficiencia, observada mediante la relación entre desempeño y número de parámetros. ViT-Base/16 tiene aproximadamente 85.8 millones de parámetros. DenseNet-121 alcanza un F1 macro de 95.66% con aproximadamente 7.0 millones. DenseNet-121 obtiene más del 98% del desempeño de ViT-Base/16 utilizando alrededor del 8% de sus parámetros. Por eso DenseNet no se selecciona simplemente por ser «más pequeño», sino porque combina tamaño reducido con desempeño y AUC muy altos.</w:t>
-      </w:r>
-    </w:p>
-    <w:p>
-      <w:pPr>
-        <w:jc w:val="both"/>
-      </w:pPr>
-      <w:r>
-        <w:t>El quinto criterio es la diversidad arquitectónica. La selección busca conservar un representante Transformer y un representante CNN. Esto evita que las siguientes fases se apoyen en dos modelos muy parecidos desde el punto de vista de paradigma. Así, aunque Swin-Base tiene un F1 muy cercano a DenseNet-121, pertenece a la misma gran familia Transformer que ViT-Base/16 y no añade la comparación ViT frente a CNN que sí aporta DenseNet-121.</w:t>
-      </w:r>
-    </w:p>
-    <w:p>
-      <w:pPr>
-        <w:jc w:val="both"/>
-      </w:pPr>
-      <w:r>
-        <w:t>La comparación de los otros modelos se interpreta con la misma lógica. EfficientNet-B0 presenta buen AUC y eficiencia, pero su F1 es inferior a DenseNet-121. MobileNetV3-Small es muy liviano, pero pierde desempeño. ResNet-50 posee más parámetros que DenseNet-121 y obtiene un F1 claramente menor. MobileNetV2 presenta una desviación estándar muy baja, pero su F1 de 89.01% no compensa la pérdida de desempeño. Por tanto, ningún criterio aislado determina la selección.</w:t>
+        <w:t>La selección no depende de una sola métrica, sino de cinco criterios complementarios:</w:t>
       </w:r>
     </w:p>
     <w:p>
@@ -914,7 +2365,7 @@
         <w:t xml:space="preserve">Desempeño: </w:t>
       </w:r>
       <w:r>
-        <w:t>F1 macro OOF/pooled y Accuracy, complementados con el comportamiento del F1 entre folds.</w:t>
+        <w:t>F1 macro pooled: ViT-Base/16 es primero (96.96%) y DenseNet-121 segundo (95.66%); Swin-Base (95.56%) y DINOv2-Small (95.44%) quedan después.</w:t>
       </w:r>
     </w:p>
     <w:p>
@@ -929,7 +2380,7 @@
         <w:t xml:space="preserve">Discriminación: </w:t>
       </w:r>
       <w:r>
-        <w:t>AUC OOF/pooled calculado a partir de las probabilidades de salida.</w:t>
+        <w:t>DenseNet-121 tiene el mayor AUC de los diez (0.9906) y ViT-Base/16 el segundo (0.9900).</w:t>
       </w:r>
     </w:p>
     <w:p>
@@ -944,7 +2395,7 @@
         <w:t xml:space="preserve">Estabilidad: </w:t>
       </w:r>
       <w:r>
-        <w:t>Desviación estándar del F1 entre los cinco folds.</w:t>
+        <w:t>desviación estándar del F1 entre folds: ViT-Base/16 0.28, la más baja entre los modelos de alto desempeño; DenseNet-121 0.79.</w:t>
       </w:r>
     </w:p>
     <w:p>
@@ -959,7 +2410,7 @@
         <w:t xml:space="preserve">Eficiencia: </w:t>
       </w:r>
       <w:r>
-        <w:t>Relación entre desempeño y cantidad de parámetros.</w:t>
+        <w:t>DenseNet-121 (~7.0M parámetros) logra más del 98% del F1 de ViT-Base/16 (~85.8M) con alrededor del 8% de sus parámetros.</w:t>
       </w:r>
     </w:p>
     <w:p>
@@ -971,10 +2422,18 @@
         <w:rPr>
           <w:b/>
         </w:rPr>
-        <w:t xml:space="preserve">Diversidad: </w:t>
+        <w:t xml:space="preserve">Diversidad arquitectónica: </w:t>
       </w:r>
       <w:r>
-        <w:t>Representación de las familias Transformer y CNN.</w:t>
+        <w:t>se busca un representante Transformer y uno CNN. Swin-Base tiene un F1 cercano a DenseNet-121, pero es Transformer como ViT-Base/16 y no aporta la comparación ViT frente a CNN.</w:t>
+      </w:r>
+    </w:p>
+    <w:p>
+      <w:pPr>
+        <w:jc w:val="both"/>
+      </w:pPr>
+      <w:r>
+        <w:t>Con estos criterios se seleccionan ViT-Base/16 (Transformer) y DenseNet-121 (CNN) como modelos de referencia. Ninguno de los dos es el modelo propuesto de la tesis: ambos forman la línea base experimental frente a la cual se comparará el modelo propuesto.</w:t>
       </w:r>
     </w:p>
     <w:p>
@@ -985,10 +2444,10 @@
         <w:rPr>
           <w:b/>
         </w:rPr>
-        <w:t xml:space="preserve">Alineación dentro del flujo. </w:t>
+        <w:t xml:space="preserve">Resultado de la sección. </w:t>
       </w:r>
       <w:r>
-        <w:t>Esta etapa transforma resultados experimentales en criterios explícitos de decisión. La selección final puede defenderse porque cada modelo elegido cumple un papel diferente y sustentado.</w:t>
+        <w:t>modelos de referencia ViT-Base/16 y DenseNet-121 (línea base experimental). Sustento detallado en Sustento_Seleccion_Modelos.docx (sección 3.6).</w:t>
       </w:r>
     </w:p>
     <w:p>
@@ -996,7 +2455,7 @@
         <w:pStyle w:val="Heading2"/>
       </w:pPr>
       <w:r>
-        <w:t>Etapa 8. Selección de ViT-Base/16 y DenseNet-121 como modelos de referencia</w:t>
+        <w:t>3.7. Evaluación cross-dataset de los modelos de referencia</w:t>
       </w:r>
     </w:p>
     <w:p>
@@ -1004,39 +2463,7 @@
         <w:jc w:val="both"/>
       </w:pPr>
       <w:r>
-        <w:t>La última etapa formaliza la decisión producida por todo el flujo. Se seleccionan dos de los diez modelos: ViT-Base/16 como representante de las arquitecturas Transformer y DenseNet-121 como representante de las arquitecturas convolucionales. La elección no se realiza antes del experimento; es el resultado de la evidencia acumulada en las etapas anteriores.</w:t>
-      </w:r>
-    </w:p>
-    <w:p>
-      <w:pPr>
-        <w:jc w:val="both"/>
-      </w:pPr>
-      <w:r>
-        <w:t>ViT-Base/16 queda seleccionado porque obtiene el mayor F1 macro OOF/pooled de los diez modelos, 96.96%, con Accuracy de 96.96% y AUC pooled de 0.9900. Además, presenta una desviación estándar del F1 de 0.28 entre folds, lo que evidencia baja variabilidad entre particiones dentro del grupo de modelos de alto desempeño. Su matriz de confusión pooled produce F1 de 96.95% para fresco y 96.98% para no_fresco, cuyo promedio corresponde, salvo efectos de redondeo, al F1 macro reportado.</w:t>
-      </w:r>
-    </w:p>
-    <w:p>
-      <w:pPr>
-        <w:jc w:val="both"/>
-      </w:pPr>
-      <w:r>
-        <w:t>DenseNet-121 queda seleccionado porque obtiene el segundo mayor F1 macro OOF/pooled, 95.66%, Accuracy de 95.66% y el mayor AUC pooled de todo el grupo, 0.9906. Su matriz de confusión pooled produce F1 de 95.62% para fresco y 95.70% para no_fresco, cuyo promedio es 95.66%. A esto se suma su menor número de parámetros, aproximadamente 7.0 millones, frente a 85.8 millones de ViT-Base/16.</w:t>
-      </w:r>
-    </w:p>
-    <w:p>
-      <w:pPr>
-        <w:jc w:val="both"/>
-      </w:pPr>
-      <w:r>
-        <w:t>La combinación final tiene, por tanto, una lógica complementaria. ViT-Base/16 representa el mayor desempeño y una baja variabilidad entre particiones dentro del grupo de modelos de alto desempeño; DenseNet-121 representa una CNN con desempeño muy cercano, el mayor AUC OOF/pooled entre los modelos evaluados y una relación desempeño–parámetros favorable. Incorporar un segundo modelo basado en arquitectura Transformer, como Swin-Base, no aportaría la misma diversidad de paradigma que la combinación ViT-CNN.</w:t>
-      </w:r>
-    </w:p>
-    <w:p>
-      <w:pPr>
-        <w:jc w:val="both"/>
-      </w:pPr>
-      <w:r>
-        <w:t>La salida metodológica del flujo no debe interpretarse como que uno de los dos modelos es el «modelo propuesto» de la tesis. Ambos constituyen modelos de referencia seleccionados a partir de la evaluación base. Su función es proporcionar una línea experimental sustentada para las fases siguientes del estudio.</w:t>
+        <w:t>Los dos modelos de referencia, entrenados con Mendeley, se llevan a los dominios objetivo con el método congelado (linear probe). El backbone conserva los pesos aprendidos en Mendeley y no se actualiza: sus parámetros no reciben gradiente y permanece en modo de evaluación, de modo que BatchNorm no cambia sus estadísticas. Solo se reentrena la cabeza de clasificación con imágenes del dominio objetivo. Así, el resultado mide cuán transferibles son las características aprendidas en Mendeley.</w:t>
       </w:r>
     </w:p>
     <w:p>
@@ -1048,10 +2475,10 @@
         <w:rPr>
           <w:b/>
         </w:rPr>
-        <w:t xml:space="preserve">ViT-Base/16: </w:t>
+        <w:t xml:space="preserve">Escenarios: </w:t>
       </w:r>
       <w:r>
-        <w:t>F1 macro OOF/pooled 96.96%; Accuracy OOF/pooled 96.96%; AUC OOF/pooled 0.9900; desviación estándar del F1 entre folds 0.28; 85.8M parámetros.</w:t>
+        <w:t>Mendeley → OneDrive (Trucha, 1,150 imágenes) y Mendeley → Kaggle (Rohu, 1,261 imágenes).</w:t>
       </w:r>
     </w:p>
     <w:p>
@@ -1063,10 +2490,10 @@
         <w:rPr>
           <w:b/>
         </w:rPr>
-        <w:t xml:space="preserve">DenseNet-121: </w:t>
+        <w:t xml:space="preserve">Partición: </w:t>
       </w:r>
       <w:r>
-        <w:t>F1 macro OOF/pooled 95.66%; Accuracy OOF/pooled 95.66%; AUC OOF/pooled 0.9906; desviación estándar del F1 entre folds 0.79; ~7.0M parámetros.</w:t>
+        <w:t>5 folds con semilla 42: StratifiedKFold en Trucha y StratifiedGroupKFold en Rohu, agrupando fotos casi idénticas para que no queden a la vez en entrenamiento y validación.</w:t>
       </w:r>
     </w:p>
     <w:p>
@@ -1078,10 +2505,493 @@
         <w:rPr>
           <w:b/>
         </w:rPr>
-        <w:t xml:space="preserve">Resultado del flujo: </w:t>
+        <w:t xml:space="preserve">Punto de partida: </w:t>
       </w:r>
       <w:r>
-        <w:t>Dos modelos de referencia de familias diferentes, seleccionados con evidencia cuantitativa y trazable.</w:t>
+        <w:t>en el fold k se carga el checkpoint de Mendeley del mismo fold k.</w:t>
+      </w:r>
+    </w:p>
+    <w:p>
+      <w:pPr>
+        <w:pStyle w:val="ListBullet"/>
+        <w:jc w:val="both"/>
+      </w:pPr>
+      <w:r>
+        <w:rPr>
+          <w:b/>
+        </w:rPr>
+        <w:t xml:space="preserve">Entrenamiento de la cabeza: </w:t>
+      </w:r>
+      <w:r>
+        <w:t>AdamW (learning rate 1e-4, weight decay 1e-4), scheduler coseno, entropía cruzada, máximo 30 epochs con early stopping de paciencia 8; data augmentation sin duplicar el conjunto de entrenamiento (sin x2).</w:t>
+      </w:r>
+    </w:p>
+    <w:p>
+      <w:pPr>
+        <w:pStyle w:val="ListBullet"/>
+        <w:jc w:val="both"/>
+      </w:pPr>
+      <w:r>
+        <w:rPr>
+          <w:b/>
+        </w:rPr>
+        <w:t xml:space="preserve">Evaluación: </w:t>
+      </w:r>
+      <w:r>
+        <w:t>sobre la validación del fold; el F1 oficial es la media de los cinco folds.</w:t>
+      </w:r>
+    </w:p>
+    <w:p>
+      <w:r>
+        <w:rPr>
+          <w:b/>
+        </w:rPr>
+        <w:t>Tabla 3.3</w:t>
+      </w:r>
+    </w:p>
+    <w:p>
+      <w:r>
+        <w:rPr>
+          <w:i/>
+        </w:rPr>
+        <w:t>Desempeño cross-dataset de los modelos de referencia (método congelado)</w:t>
+      </w:r>
+    </w:p>
+    <w:tbl>
+      <w:tblPr>
+        <w:tblStyle w:val="TableGrid"/>
+        <w:tblW w:type="auto" w:w="0"/>
+        <w:jc w:val="center"/>
+        <w:tblLayout w:type="fixed"/>
+        <w:tblLook w:firstColumn="1" w:firstRow="1" w:lastColumn="0" w:lastRow="0" w:noHBand="0" w:noVBand="1" w:val="04A0"/>
+      </w:tblPr>
+      <w:tblGrid>
+        <w:gridCol w:w="1701"/>
+        <w:gridCol w:w="1814"/>
+        <w:gridCol w:w="1587"/>
+        <w:gridCol w:w="1247"/>
+        <w:gridCol w:w="1474"/>
+        <w:gridCol w:w="1134"/>
+      </w:tblGrid>
+      <w:tr>
+        <w:tc>
+          <w:tcPr>
+            <w:tcW w:type="dxa" w:w="1701"/>
+            <w:shd w:val="clear" w:color="auto" w:fill="D9E2F3"/>
+          </w:tcPr>
+          <w:p>
+            <w:r>
+              <w:rPr>
+                <w:b/>
+                <w:sz w:val="19"/>
+              </w:rPr>
+              <w:t>Modelo</w:t>
+            </w:r>
+          </w:p>
+        </w:tc>
+        <w:tc>
+          <w:tcPr>
+            <w:tcW w:type="dxa" w:w="1814"/>
+            <w:shd w:val="clear" w:color="auto" w:fill="D9E2F3"/>
+          </w:tcPr>
+          <w:p>
+            <w:r>
+              <w:rPr>
+                <w:b/>
+                <w:sz w:val="19"/>
+              </w:rPr>
+              <w:t>Escenario</w:t>
+            </w:r>
+          </w:p>
+        </w:tc>
+        <w:tc>
+          <w:tcPr>
+            <w:tcW w:type="dxa" w:w="1587"/>
+            <w:shd w:val="clear" w:color="auto" w:fill="D9E2F3"/>
+          </w:tcPr>
+          <w:p>
+            <w:r>
+              <w:rPr>
+                <w:b/>
+                <w:sz w:val="19"/>
+              </w:rPr>
+              <w:t>F1 macro (%, media 5 folds)</w:t>
+            </w:r>
+          </w:p>
+        </w:tc>
+        <w:tc>
+          <w:tcPr>
+            <w:tcW w:type="dxa" w:w="1247"/>
+            <w:shd w:val="clear" w:color="auto" w:fill="D9E2F3"/>
+          </w:tcPr>
+          <w:p>
+            <w:r>
+              <w:rPr>
+                <w:b/>
+                <w:sz w:val="19"/>
+              </w:rPr>
+              <w:t>F1 pooled (%)</w:t>
+            </w:r>
+          </w:p>
+        </w:tc>
+        <w:tc>
+          <w:tcPr>
+            <w:tcW w:type="dxa" w:w="1474"/>
+            <w:shd w:val="clear" w:color="auto" w:fill="D9E2F3"/>
+          </w:tcPr>
+          <w:p>
+            <w:r>
+              <w:rPr>
+                <w:b/>
+                <w:sz w:val="19"/>
+              </w:rPr>
+              <w:t>Exactitud pooled (%)</w:t>
+            </w:r>
+          </w:p>
+        </w:tc>
+        <w:tc>
+          <w:tcPr>
+            <w:tcW w:type="dxa" w:w="1134"/>
+            <w:shd w:val="clear" w:color="auto" w:fill="D9E2F3"/>
+          </w:tcPr>
+          <w:p>
+            <w:r>
+              <w:rPr>
+                <w:b/>
+                <w:sz w:val="19"/>
+              </w:rPr>
+              <w:t>AUC pooled</w:t>
+            </w:r>
+          </w:p>
+        </w:tc>
+      </w:tr>
+      <w:tr>
+        <w:tc>
+          <w:tcPr>
+            <w:tcW w:type="dxa" w:w="1701"/>
+          </w:tcPr>
+          <w:p>
+            <w:r>
+              <w:rPr>
+                <w:sz w:val="19"/>
+              </w:rPr>
+              <w:t>ViT-Base/16</w:t>
+            </w:r>
+          </w:p>
+        </w:tc>
+        <w:tc>
+          <w:tcPr>
+            <w:tcW w:type="dxa" w:w="1814"/>
+          </w:tcPr>
+          <w:p>
+            <w:r>
+              <w:rPr>
+                <w:sz w:val="19"/>
+              </w:rPr>
+              <w:t>Mendeley → Trucha</w:t>
+            </w:r>
+          </w:p>
+        </w:tc>
+        <w:tc>
+          <w:tcPr>
+            <w:tcW w:type="dxa" w:w="1587"/>
+          </w:tcPr>
+          <w:p>
+            <w:r>
+              <w:rPr>
+                <w:sz w:val="19"/>
+              </w:rPr>
+              <w:t>86.11</w:t>
+            </w:r>
+          </w:p>
+        </w:tc>
+        <w:tc>
+          <w:tcPr>
+            <w:tcW w:type="dxa" w:w="1247"/>
+          </w:tcPr>
+          <w:p>
+            <w:r>
+              <w:rPr>
+                <w:sz w:val="19"/>
+              </w:rPr>
+              <w:t>86.18</w:t>
+            </w:r>
+          </w:p>
+        </w:tc>
+        <w:tc>
+          <w:tcPr>
+            <w:tcW w:type="dxa" w:w="1474"/>
+          </w:tcPr>
+          <w:p>
+            <w:r>
+              <w:rPr>
+                <w:sz w:val="19"/>
+              </w:rPr>
+              <w:t>86.87</w:t>
+            </w:r>
+          </w:p>
+        </w:tc>
+        <w:tc>
+          <w:tcPr>
+            <w:tcW w:type="dxa" w:w="1134"/>
+          </w:tcPr>
+          <w:p>
+            <w:r>
+              <w:rPr>
+                <w:sz w:val="19"/>
+              </w:rPr>
+              <w:t>0.9197</w:t>
+            </w:r>
+          </w:p>
+        </w:tc>
+      </w:tr>
+      <w:tr>
+        <w:tc>
+          <w:tcPr>
+            <w:tcW w:type="dxa" w:w="1701"/>
+          </w:tcPr>
+          <w:p>
+            <w:r>
+              <w:rPr>
+                <w:sz w:val="19"/>
+              </w:rPr>
+              <w:t>ViT-Base/16</w:t>
+            </w:r>
+          </w:p>
+        </w:tc>
+        <w:tc>
+          <w:tcPr>
+            <w:tcW w:type="dxa" w:w="1814"/>
+          </w:tcPr>
+          <w:p>
+            <w:r>
+              <w:rPr>
+                <w:sz w:val="19"/>
+              </w:rPr>
+              <w:t>Mendeley → Rohu</w:t>
+            </w:r>
+          </w:p>
+        </w:tc>
+        <w:tc>
+          <w:tcPr>
+            <w:tcW w:type="dxa" w:w="1587"/>
+          </w:tcPr>
+          <w:p>
+            <w:r>
+              <w:rPr>
+                <w:sz w:val="19"/>
+              </w:rPr>
+              <w:t>88.17</w:t>
+            </w:r>
+          </w:p>
+        </w:tc>
+        <w:tc>
+          <w:tcPr>
+            <w:tcW w:type="dxa" w:w="1247"/>
+          </w:tcPr>
+          <w:p>
+            <w:r>
+              <w:rPr>
+                <w:sz w:val="19"/>
+              </w:rPr>
+              <w:t>87.67</w:t>
+            </w:r>
+          </w:p>
+        </w:tc>
+        <w:tc>
+          <w:tcPr>
+            <w:tcW w:type="dxa" w:w="1474"/>
+          </w:tcPr>
+          <w:p>
+            <w:r>
+              <w:rPr>
+                <w:sz w:val="19"/>
+              </w:rPr>
+              <w:t>89.45</w:t>
+            </w:r>
+          </w:p>
+        </w:tc>
+        <w:tc>
+          <w:tcPr>
+            <w:tcW w:type="dxa" w:w="1134"/>
+          </w:tcPr>
+          <w:p>
+            <w:r>
+              <w:rPr>
+                <w:sz w:val="19"/>
+              </w:rPr>
+              <w:t>0.9514</w:t>
+            </w:r>
+          </w:p>
+        </w:tc>
+      </w:tr>
+      <w:tr>
+        <w:tc>
+          <w:tcPr>
+            <w:tcW w:type="dxa" w:w="1701"/>
+          </w:tcPr>
+          <w:p>
+            <w:r>
+              <w:rPr>
+                <w:sz w:val="19"/>
+              </w:rPr>
+              <w:t>DenseNet-121</w:t>
+            </w:r>
+          </w:p>
+        </w:tc>
+        <w:tc>
+          <w:tcPr>
+            <w:tcW w:type="dxa" w:w="1814"/>
+          </w:tcPr>
+          <w:p>
+            <w:r>
+              <w:rPr>
+                <w:sz w:val="19"/>
+              </w:rPr>
+              <w:t>Mendeley → Trucha</w:t>
+            </w:r>
+          </w:p>
+        </w:tc>
+        <w:tc>
+          <w:tcPr>
+            <w:tcW w:type="dxa" w:w="1587"/>
+          </w:tcPr>
+          <w:p>
+            <w:r>
+              <w:rPr>
+                <w:sz w:val="19"/>
+              </w:rPr>
+              <w:t>80.88</w:t>
+            </w:r>
+          </w:p>
+        </w:tc>
+        <w:tc>
+          <w:tcPr>
+            <w:tcW w:type="dxa" w:w="1247"/>
+          </w:tcPr>
+          <w:p>
+            <w:r>
+              <w:rPr>
+                <w:sz w:val="19"/>
+              </w:rPr>
+              <w:t>80.80</w:t>
+            </w:r>
+          </w:p>
+        </w:tc>
+        <w:tc>
+          <w:tcPr>
+            <w:tcW w:type="dxa" w:w="1474"/>
+          </w:tcPr>
+          <w:p>
+            <w:r>
+              <w:rPr>
+                <w:sz w:val="19"/>
+              </w:rPr>
+              <w:t>82.00</w:t>
+            </w:r>
+          </w:p>
+        </w:tc>
+        <w:tc>
+          <w:tcPr>
+            <w:tcW w:type="dxa" w:w="1134"/>
+          </w:tcPr>
+          <w:p>
+            <w:r>
+              <w:rPr>
+                <w:sz w:val="19"/>
+              </w:rPr>
+              <w:t>0.8973</w:t>
+            </w:r>
+          </w:p>
+        </w:tc>
+      </w:tr>
+      <w:tr>
+        <w:tc>
+          <w:tcPr>
+            <w:tcW w:type="dxa" w:w="1701"/>
+          </w:tcPr>
+          <w:p>
+            <w:r>
+              <w:rPr>
+                <w:sz w:val="19"/>
+              </w:rPr>
+              <w:t>DenseNet-121</w:t>
+            </w:r>
+          </w:p>
+        </w:tc>
+        <w:tc>
+          <w:tcPr>
+            <w:tcW w:type="dxa" w:w="1814"/>
+          </w:tcPr>
+          <w:p>
+            <w:r>
+              <w:rPr>
+                <w:sz w:val="19"/>
+              </w:rPr>
+              <w:t>Mendeley → Rohu</w:t>
+            </w:r>
+          </w:p>
+        </w:tc>
+        <w:tc>
+          <w:tcPr>
+            <w:tcW w:type="dxa" w:w="1587"/>
+          </w:tcPr>
+          <w:p>
+            <w:r>
+              <w:rPr>
+                <w:sz w:val="19"/>
+              </w:rPr>
+              <w:t>82.85</w:t>
+            </w:r>
+          </w:p>
+        </w:tc>
+        <w:tc>
+          <w:tcPr>
+            <w:tcW w:type="dxa" w:w="1247"/>
+          </w:tcPr>
+          <w:p>
+            <w:r>
+              <w:rPr>
+                <w:sz w:val="19"/>
+              </w:rPr>
+              <w:t>83.01</w:t>
+            </w:r>
+          </w:p>
+        </w:tc>
+        <w:tc>
+          <w:tcPr>
+            <w:tcW w:type="dxa" w:w="1474"/>
+          </w:tcPr>
+          <w:p>
+            <w:r>
+              <w:rPr>
+                <w:sz w:val="19"/>
+              </w:rPr>
+              <w:t>85.57</w:t>
+            </w:r>
+          </w:p>
+        </w:tc>
+        <w:tc>
+          <w:tcPr>
+            <w:tcW w:type="dxa" w:w="1134"/>
+          </w:tcPr>
+          <w:p>
+            <w:r>
+              <w:rPr>
+                <w:sz w:val="19"/>
+              </w:rPr>
+              <w:t>0.9140</w:t>
+            </w:r>
+          </w:p>
+        </w:tc>
+      </w:tr>
+    </w:tbl>
+    <w:p>
+      <w:r>
+        <w:rPr>
+          <w:sz w:val="18"/>
+        </w:rPr>
+        <w:t>Nota. Los valores pooled provienen de una corrida aparte con la misma configuración, por eso difieren levemente del F1 oficial. Fuente: repositorio Generalizacion_ViT_DenseNet (3_resultados/ y Documentacion_Tecnica_ViT_DenseNet.docx).</w:t>
       </w:r>
     </w:p>
     <w:p>
@@ -1092,10 +3002,1108 @@
         <w:rPr>
           <w:b/>
         </w:rPr>
-        <w:t xml:space="preserve">Alineación dentro del flujo. </w:t>
+        <w:t xml:space="preserve">Resultado de la sección. </w:t>
       </w:r>
       <w:r>
-        <w:t>La etapa cierra el proceso de evaluación base: las 8,000 imágenes originan cinco particiones; las particiones alimentan 50 entrenamientos modelo–fold; cada entrenamiento genera un mejor checkpoint; los checkpoints producen resultados de test; los resultados se consolidan y comparan; y esa comparación sustenta la selección final de ViT-Base/16 y DenseNet-121.</w:t>
+        <w:t>desempeño de los modelos de referencia frente a dominios no vistos durante el entrenamiento base.</w:t>
+      </w:r>
+    </w:p>
+    <w:p>
+      <w:pPr>
+        <w:pStyle w:val="Heading2"/>
+      </w:pPr>
+      <w:r>
+        <w:t>3.8. Análisis del efecto de la variabilidad visual entre conjuntos de datos</w:t>
+      </w:r>
+    </w:p>
+    <w:p>
+      <w:pPr>
+        <w:jc w:val="both"/>
+      </w:pPr>
+      <w:r>
+        <w:t>El efecto del cambio de dominio se cuantifica comparando el F1 macro de cada modelo en Mendeley (intra-dataset) con su F1 macro en cada dominio objetivo (cross-dataset), mediante tres indicadores de robustez:</w:t>
+      </w:r>
+    </w:p>
+    <w:p>
+      <w:pPr>
+        <w:pStyle w:val="ListBullet"/>
+        <w:jc w:val="both"/>
+      </w:pPr>
+      <w:r>
+        <w:rPr>
+          <w:b/>
+        </w:rPr>
+        <w:t xml:space="preserve">Tasa de Retención del Desempeño: </w:t>
+      </w:r>
+      <w:r>
+        <w:t>TRD = (F1_objetivo / F1_fuente) × 100. Porcentaje del desempeño de Mendeley que se conserva; 100% significa sin caída.</w:t>
+      </w:r>
+    </w:p>
+    <w:p>
+      <w:pPr>
+        <w:pStyle w:val="ListBullet"/>
+        <w:jc w:val="both"/>
+      </w:pPr>
+      <w:r>
+        <w:rPr>
+          <w:b/>
+        </w:rPr>
+        <w:t xml:space="preserve">Brecha de error: </w:t>
+      </w:r>
+      <w:r>
+        <w:t>Gap = Error_objetivo − Error_fuente, con Error = 1 − F1/100. Cuánto aumenta el error al cambiar de dominio.</w:t>
+      </w:r>
+    </w:p>
+    <w:p>
+      <w:pPr>
+        <w:pStyle w:val="ListBullet"/>
+        <w:jc w:val="both"/>
+      </w:pPr>
+      <w:r>
+        <w:rPr>
+          <w:b/>
+        </w:rPr>
+        <w:t xml:space="preserve">Reducción de la Brecha de Error: </w:t>
+      </w:r>
+      <w:r>
+        <w:t>RBE = (Gap_DenseNet − Gap_modelo) / Gap_DenseNet × 100. Cuánto reduce un modelo la brecha frente a DenseNet-121 (baseline CNN); RBE &gt; 0 indica mejor transferencia.</w:t>
+      </w:r>
+    </w:p>
+    <w:p>
+      <w:r>
+        <w:rPr>
+          <w:b/>
+        </w:rPr>
+        <w:t>Tabla 3.4</w:t>
+      </w:r>
+    </w:p>
+    <w:p>
+      <w:r>
+        <w:rPr>
+          <w:i/>
+        </w:rPr>
+        <w:t>Degradación y robustez de los modelos de referencia ante el cambio de dominio</w:t>
+      </w:r>
+    </w:p>
+    <w:tbl>
+      <w:tblPr>
+        <w:tblStyle w:val="TableGrid"/>
+        <w:tblW w:type="auto" w:w="0"/>
+        <w:jc w:val="center"/>
+        <w:tblLayout w:type="fixed"/>
+        <w:tblLook w:firstColumn="1" w:firstRow="1" w:lastColumn="0" w:lastRow="0" w:noHBand="0" w:noVBand="1" w:val="04A0"/>
+      </w:tblPr>
+      <w:tblGrid>
+        <w:gridCol w:w="1587"/>
+        <w:gridCol w:w="1134"/>
+        <w:gridCol w:w="1134"/>
+        <w:gridCol w:w="1134"/>
+        <w:gridCol w:w="1077"/>
+        <w:gridCol w:w="964"/>
+        <w:gridCol w:w="907"/>
+        <w:gridCol w:w="907"/>
+      </w:tblGrid>
+      <w:tr>
+        <w:tc>
+          <w:tcPr>
+            <w:tcW w:type="dxa" w:w="1587"/>
+            <w:shd w:val="clear" w:color="auto" w:fill="D9E2F3"/>
+          </w:tcPr>
+          <w:p>
+            <w:r>
+              <w:rPr>
+                <w:b/>
+                <w:sz w:val="19"/>
+              </w:rPr>
+              <w:t>Modelo</w:t>
+            </w:r>
+          </w:p>
+        </w:tc>
+        <w:tc>
+          <w:tcPr>
+            <w:tcW w:type="dxa" w:w="1134"/>
+            <w:shd w:val="clear" w:color="auto" w:fill="D9E2F3"/>
+          </w:tcPr>
+          <w:p>
+            <w:r>
+              <w:rPr>
+                <w:b/>
+                <w:sz w:val="19"/>
+              </w:rPr>
+              <w:t>Dominio objetivo</w:t>
+            </w:r>
+          </w:p>
+        </w:tc>
+        <w:tc>
+          <w:tcPr>
+            <w:tcW w:type="dxa" w:w="1134"/>
+            <w:shd w:val="clear" w:color="auto" w:fill="D9E2F3"/>
+          </w:tcPr>
+          <w:p>
+            <w:r>
+              <w:rPr>
+                <w:b/>
+                <w:sz w:val="19"/>
+              </w:rPr>
+              <w:t>F1 Mendeley (%)</w:t>
+            </w:r>
+          </w:p>
+        </w:tc>
+        <w:tc>
+          <w:tcPr>
+            <w:tcW w:type="dxa" w:w="1134"/>
+            <w:shd w:val="clear" w:color="auto" w:fill="D9E2F3"/>
+          </w:tcPr>
+          <w:p>
+            <w:r>
+              <w:rPr>
+                <w:b/>
+                <w:sz w:val="19"/>
+              </w:rPr>
+              <w:t>F1 objetivo (%)</w:t>
+            </w:r>
+          </w:p>
+        </w:tc>
+        <w:tc>
+          <w:tcPr>
+            <w:tcW w:type="dxa" w:w="1077"/>
+            <w:shd w:val="clear" w:color="auto" w:fill="D9E2F3"/>
+          </w:tcPr>
+          <w:p>
+            <w:r>
+              <w:rPr>
+                <w:b/>
+                <w:sz w:val="19"/>
+              </w:rPr>
+              <w:t>Variación (pp)</w:t>
+            </w:r>
+          </w:p>
+        </w:tc>
+        <w:tc>
+          <w:tcPr>
+            <w:tcW w:type="dxa" w:w="964"/>
+            <w:shd w:val="clear" w:color="auto" w:fill="D9E2F3"/>
+          </w:tcPr>
+          <w:p>
+            <w:r>
+              <w:rPr>
+                <w:b/>
+                <w:sz w:val="19"/>
+              </w:rPr>
+              <w:t>TRD (%)</w:t>
+            </w:r>
+          </w:p>
+        </w:tc>
+        <w:tc>
+          <w:tcPr>
+            <w:tcW w:type="dxa" w:w="907"/>
+            <w:shd w:val="clear" w:color="auto" w:fill="D9E2F3"/>
+          </w:tcPr>
+          <w:p>
+            <w:r>
+              <w:rPr>
+                <w:b/>
+                <w:sz w:val="19"/>
+              </w:rPr>
+              <w:t>Gap</w:t>
+            </w:r>
+          </w:p>
+        </w:tc>
+        <w:tc>
+          <w:tcPr>
+            <w:tcW w:type="dxa" w:w="907"/>
+            <w:shd w:val="clear" w:color="auto" w:fill="D9E2F3"/>
+          </w:tcPr>
+          <w:p>
+            <w:r>
+              <w:rPr>
+                <w:b/>
+                <w:sz w:val="19"/>
+              </w:rPr>
+              <w:t>RBE (%)</w:t>
+            </w:r>
+          </w:p>
+        </w:tc>
+      </w:tr>
+      <w:tr>
+        <w:tc>
+          <w:tcPr>
+            <w:tcW w:type="dxa" w:w="1587"/>
+          </w:tcPr>
+          <w:p>
+            <w:r>
+              <w:rPr>
+                <w:sz w:val="19"/>
+              </w:rPr>
+              <w:t>ViT-Base/16</w:t>
+            </w:r>
+          </w:p>
+        </w:tc>
+        <w:tc>
+          <w:tcPr>
+            <w:tcW w:type="dxa" w:w="1134"/>
+          </w:tcPr>
+          <w:p>
+            <w:r>
+              <w:rPr>
+                <w:sz w:val="19"/>
+              </w:rPr>
+              <w:t>Trucha</w:t>
+            </w:r>
+          </w:p>
+        </w:tc>
+        <w:tc>
+          <w:tcPr>
+            <w:tcW w:type="dxa" w:w="1134"/>
+          </w:tcPr>
+          <w:p>
+            <w:r>
+              <w:rPr>
+                <w:sz w:val="19"/>
+              </w:rPr>
+              <w:t>96.96</w:t>
+            </w:r>
+          </w:p>
+        </w:tc>
+        <w:tc>
+          <w:tcPr>
+            <w:tcW w:type="dxa" w:w="1134"/>
+          </w:tcPr>
+          <w:p>
+            <w:r>
+              <w:rPr>
+                <w:sz w:val="19"/>
+              </w:rPr>
+              <w:t>86.11</w:t>
+            </w:r>
+          </w:p>
+        </w:tc>
+        <w:tc>
+          <w:tcPr>
+            <w:tcW w:type="dxa" w:w="1077"/>
+          </w:tcPr>
+          <w:p>
+            <w:r>
+              <w:rPr>
+                <w:sz w:val="19"/>
+              </w:rPr>
+              <w:t>-10.85</w:t>
+            </w:r>
+          </w:p>
+        </w:tc>
+        <w:tc>
+          <w:tcPr>
+            <w:tcW w:type="dxa" w:w="964"/>
+          </w:tcPr>
+          <w:p>
+            <w:r>
+              <w:rPr>
+                <w:sz w:val="19"/>
+              </w:rPr>
+              <w:t>88.81</w:t>
+            </w:r>
+          </w:p>
+        </w:tc>
+        <w:tc>
+          <w:tcPr>
+            <w:tcW w:type="dxa" w:w="907"/>
+          </w:tcPr>
+          <w:p>
+            <w:r>
+              <w:rPr>
+                <w:sz w:val="19"/>
+              </w:rPr>
+              <w:t>0.1085</w:t>
+            </w:r>
+          </w:p>
+        </w:tc>
+        <w:tc>
+          <w:tcPr>
+            <w:tcW w:type="dxa" w:w="907"/>
+          </w:tcPr>
+          <w:p>
+            <w:r>
+              <w:rPr>
+                <w:sz w:val="19"/>
+              </w:rPr>
+              <w:t>26.59</w:t>
+            </w:r>
+          </w:p>
+        </w:tc>
+      </w:tr>
+      <w:tr>
+        <w:tc>
+          <w:tcPr>
+            <w:tcW w:type="dxa" w:w="1587"/>
+          </w:tcPr>
+          <w:p>
+            <w:r>
+              <w:rPr>
+                <w:sz w:val="19"/>
+              </w:rPr>
+              <w:t>ViT-Base/16</w:t>
+            </w:r>
+          </w:p>
+        </w:tc>
+        <w:tc>
+          <w:tcPr>
+            <w:tcW w:type="dxa" w:w="1134"/>
+          </w:tcPr>
+          <w:p>
+            <w:r>
+              <w:rPr>
+                <w:sz w:val="19"/>
+              </w:rPr>
+              <w:t>Rohu</w:t>
+            </w:r>
+          </w:p>
+        </w:tc>
+        <w:tc>
+          <w:tcPr>
+            <w:tcW w:type="dxa" w:w="1134"/>
+          </w:tcPr>
+          <w:p>
+            <w:r>
+              <w:rPr>
+                <w:sz w:val="19"/>
+              </w:rPr>
+              <w:t>96.96</w:t>
+            </w:r>
+          </w:p>
+        </w:tc>
+        <w:tc>
+          <w:tcPr>
+            <w:tcW w:type="dxa" w:w="1134"/>
+          </w:tcPr>
+          <w:p>
+            <w:r>
+              <w:rPr>
+                <w:sz w:val="19"/>
+              </w:rPr>
+              <w:t>88.17</w:t>
+            </w:r>
+          </w:p>
+        </w:tc>
+        <w:tc>
+          <w:tcPr>
+            <w:tcW w:type="dxa" w:w="1077"/>
+          </w:tcPr>
+          <w:p>
+            <w:r>
+              <w:rPr>
+                <w:sz w:val="19"/>
+              </w:rPr>
+              <w:t>-8.79</w:t>
+            </w:r>
+          </w:p>
+        </w:tc>
+        <w:tc>
+          <w:tcPr>
+            <w:tcW w:type="dxa" w:w="964"/>
+          </w:tcPr>
+          <w:p>
+            <w:r>
+              <w:rPr>
+                <w:sz w:val="19"/>
+              </w:rPr>
+              <w:t>90.93</w:t>
+            </w:r>
+          </w:p>
+        </w:tc>
+        <w:tc>
+          <w:tcPr>
+            <w:tcW w:type="dxa" w:w="907"/>
+          </w:tcPr>
+          <w:p>
+            <w:r>
+              <w:rPr>
+                <w:sz w:val="19"/>
+              </w:rPr>
+              <w:t>0.0879</w:t>
+            </w:r>
+          </w:p>
+        </w:tc>
+        <w:tc>
+          <w:tcPr>
+            <w:tcW w:type="dxa" w:w="907"/>
+          </w:tcPr>
+          <w:p>
+            <w:r>
+              <w:rPr>
+                <w:sz w:val="19"/>
+              </w:rPr>
+              <w:t>31.38</w:t>
+            </w:r>
+          </w:p>
+        </w:tc>
+      </w:tr>
+      <w:tr>
+        <w:tc>
+          <w:tcPr>
+            <w:tcW w:type="dxa" w:w="1587"/>
+          </w:tcPr>
+          <w:p>
+            <w:r>
+              <w:rPr>
+                <w:sz w:val="19"/>
+              </w:rPr>
+              <w:t>DenseNet-121</w:t>
+            </w:r>
+          </w:p>
+        </w:tc>
+        <w:tc>
+          <w:tcPr>
+            <w:tcW w:type="dxa" w:w="1134"/>
+          </w:tcPr>
+          <w:p>
+            <w:r>
+              <w:rPr>
+                <w:sz w:val="19"/>
+              </w:rPr>
+              <w:t>Trucha</w:t>
+            </w:r>
+          </w:p>
+        </w:tc>
+        <w:tc>
+          <w:tcPr>
+            <w:tcW w:type="dxa" w:w="1134"/>
+          </w:tcPr>
+          <w:p>
+            <w:r>
+              <w:rPr>
+                <w:sz w:val="19"/>
+              </w:rPr>
+              <w:t>95.66</w:t>
+            </w:r>
+          </w:p>
+        </w:tc>
+        <w:tc>
+          <w:tcPr>
+            <w:tcW w:type="dxa" w:w="1134"/>
+          </w:tcPr>
+          <w:p>
+            <w:r>
+              <w:rPr>
+                <w:sz w:val="19"/>
+              </w:rPr>
+              <w:t>80.88</w:t>
+            </w:r>
+          </w:p>
+        </w:tc>
+        <w:tc>
+          <w:tcPr>
+            <w:tcW w:type="dxa" w:w="1077"/>
+          </w:tcPr>
+          <w:p>
+            <w:r>
+              <w:rPr>
+                <w:sz w:val="19"/>
+              </w:rPr>
+              <w:t>-14.78</w:t>
+            </w:r>
+          </w:p>
+        </w:tc>
+        <w:tc>
+          <w:tcPr>
+            <w:tcW w:type="dxa" w:w="964"/>
+          </w:tcPr>
+          <w:p>
+            <w:r>
+              <w:rPr>
+                <w:sz w:val="19"/>
+              </w:rPr>
+              <w:t>84.55</w:t>
+            </w:r>
+          </w:p>
+        </w:tc>
+        <w:tc>
+          <w:tcPr>
+            <w:tcW w:type="dxa" w:w="907"/>
+          </w:tcPr>
+          <w:p>
+            <w:r>
+              <w:rPr>
+                <w:sz w:val="19"/>
+              </w:rPr>
+              <w:t>0.1478</w:t>
+            </w:r>
+          </w:p>
+        </w:tc>
+        <w:tc>
+          <w:tcPr>
+            <w:tcW w:type="dxa" w:w="907"/>
+          </w:tcPr>
+          <w:p>
+            <w:r>
+              <w:rPr>
+                <w:sz w:val="19"/>
+              </w:rPr>
+              <w:t>—</w:t>
+            </w:r>
+          </w:p>
+        </w:tc>
+      </w:tr>
+      <w:tr>
+        <w:tc>
+          <w:tcPr>
+            <w:tcW w:type="dxa" w:w="1587"/>
+          </w:tcPr>
+          <w:p>
+            <w:r>
+              <w:rPr>
+                <w:sz w:val="19"/>
+              </w:rPr>
+              <w:t>DenseNet-121</w:t>
+            </w:r>
+          </w:p>
+        </w:tc>
+        <w:tc>
+          <w:tcPr>
+            <w:tcW w:type="dxa" w:w="1134"/>
+          </w:tcPr>
+          <w:p>
+            <w:r>
+              <w:rPr>
+                <w:sz w:val="19"/>
+              </w:rPr>
+              <w:t>Rohu</w:t>
+            </w:r>
+          </w:p>
+        </w:tc>
+        <w:tc>
+          <w:tcPr>
+            <w:tcW w:type="dxa" w:w="1134"/>
+          </w:tcPr>
+          <w:p>
+            <w:r>
+              <w:rPr>
+                <w:sz w:val="19"/>
+              </w:rPr>
+              <w:t>95.66</w:t>
+            </w:r>
+          </w:p>
+        </w:tc>
+        <w:tc>
+          <w:tcPr>
+            <w:tcW w:type="dxa" w:w="1134"/>
+          </w:tcPr>
+          <w:p>
+            <w:r>
+              <w:rPr>
+                <w:sz w:val="19"/>
+              </w:rPr>
+              <w:t>82.85</w:t>
+            </w:r>
+          </w:p>
+        </w:tc>
+        <w:tc>
+          <w:tcPr>
+            <w:tcW w:type="dxa" w:w="1077"/>
+          </w:tcPr>
+          <w:p>
+            <w:r>
+              <w:rPr>
+                <w:sz w:val="19"/>
+              </w:rPr>
+              <w:t>-12.81</w:t>
+            </w:r>
+          </w:p>
+        </w:tc>
+        <w:tc>
+          <w:tcPr>
+            <w:tcW w:type="dxa" w:w="964"/>
+          </w:tcPr>
+          <w:p>
+            <w:r>
+              <w:rPr>
+                <w:sz w:val="19"/>
+              </w:rPr>
+              <w:t>86.61</w:t>
+            </w:r>
+          </w:p>
+        </w:tc>
+        <w:tc>
+          <w:tcPr>
+            <w:tcW w:type="dxa" w:w="907"/>
+          </w:tcPr>
+          <w:p>
+            <w:r>
+              <w:rPr>
+                <w:sz w:val="19"/>
+              </w:rPr>
+              <w:t>0.1281</w:t>
+            </w:r>
+          </w:p>
+        </w:tc>
+        <w:tc>
+          <w:tcPr>
+            <w:tcW w:type="dxa" w:w="907"/>
+          </w:tcPr>
+          <w:p>
+            <w:r>
+              <w:rPr>
+                <w:sz w:val="19"/>
+              </w:rPr>
+              <w:t>—</w:t>
+            </w:r>
+          </w:p>
+        </w:tc>
+      </w:tr>
+    </w:tbl>
+    <w:p>
+      <w:r>
+        <w:rPr>
+          <w:sz w:val="18"/>
+        </w:rPr>
+        <w:t>Nota. RBE se calcula respecto a DenseNet-121, por lo que no aplica al propio baseline. Fuente: Indicadores_Robustez_TRD_Gap_RBE.docx (repositorio Generalizacion_ViT_DenseNet).</w:t>
+      </w:r>
+    </w:p>
+    <w:p>
+      <w:pPr>
+        <w:jc w:val="both"/>
+      </w:pPr>
+      <w:r>
+        <w:t>Ambos modelos pierden desempeño al cambiar de dominio. ViT-Base/16 cae de 96.96% a 86.11% en Trucha y a 88.17% en Rohu; DenseNet-121 cae de 95.66% a 80.88% y 82.85%. Como el procesamiento de la sección 3.2 iguala el encuadre y la resolución, esa pérdida se asocia a la variabilidad visual entre conjuntos (iluminación, cámara, fondo y especie).</w:t>
+      </w:r>
+    </w:p>
+    <w:p>
+      <w:pPr>
+        <w:jc w:val="both"/>
+      </w:pPr>
+      <w:r>
+        <w:t>ViT-Base/16 es más robusto que DenseNet-121 en los dos dominios: retiene más desempeño (TRD 88.81% frente a 84.55% en Trucha y 90.93% frente a 86.61% en Rohu), tiene una brecha de error menor y su RBE es positivo (26.59% en Trucha y 31.38% en Rohu). Para los dos modelos, la caída es mayor en Trucha que en Rohu.</w:t>
+      </w:r>
+    </w:p>
+    <w:p>
+      <w:pPr>
+        <w:jc w:val="both"/>
+      </w:pPr>
+      <w:r>
+        <w:t>El cambio de dominio incluye también una diferencia de especie (Mendeley reúne 8 especies de Indonesia; OneDrive es trucha de Perú y Kaggle es rohu de India). Por ello, la degradación medida combina variabilidad de adquisición y diferencias propias de cada especie.</w:t>
+      </w:r>
+    </w:p>
+    <w:p>
+      <w:pPr>
+        <w:jc w:val="both"/>
+      </w:pPr>
+      <w:r>
+        <w:rPr>
+          <w:b/>
+        </w:rPr>
+        <w:t xml:space="preserve">Resultado de la sección. </w:t>
+      </w:r>
+      <w:r>
+        <w:t>magnitud del efecto del cambio de dominio y robustez comparada de los modelos de referencia.</w:t>
+      </w:r>
+    </w:p>
+    <w:p>
+      <w:pPr>
+        <w:pStyle w:val="Heading2"/>
+      </w:pPr>
+      <w:r>
+        <w:t>3.9. Consolidación de la línea base experimental</w:t>
+      </w:r>
+    </w:p>
+    <w:p>
+      <w:pPr>
+        <w:jc w:val="both"/>
+      </w:pPr>
+      <w:r>
+        <w:t>La Tabla 3.5 reúne los resultados de ambas fases para los dos modelos de referencia. Constituye la línea base experimental frente a la cual se comparará el modelo propuesto en el Capítulo IV y se validará en el Capítulo V.</w:t>
+      </w:r>
+    </w:p>
+    <w:p>
+      <w:r>
+        <w:rPr>
+          <w:b/>
+        </w:rPr>
+        <w:t>Tabla 3.5</w:t>
+      </w:r>
+    </w:p>
+    <w:p>
+      <w:r>
+        <w:rPr>
+          <w:i/>
+        </w:rPr>
+        <w:t>Línea base experimental: resultados intra-dataset, cross-dataset y de retención</w:t>
+      </w:r>
+    </w:p>
+    <w:tbl>
+      <w:tblPr>
+        <w:tblStyle w:val="TableGrid"/>
+        <w:tblW w:type="auto" w:w="0"/>
+        <w:jc w:val="center"/>
+        <w:tblLayout w:type="fixed"/>
+        <w:tblLook w:firstColumn="1" w:firstRow="1" w:lastColumn="0" w:lastRow="0" w:noHBand="0" w:noVBand="1" w:val="04A0"/>
+      </w:tblPr>
+      <w:tblGrid>
+        <w:gridCol w:w="1701"/>
+        <w:gridCol w:w="1304"/>
+        <w:gridCol w:w="1134"/>
+        <w:gridCol w:w="1247"/>
+        <w:gridCol w:w="1247"/>
+        <w:gridCol w:w="1247"/>
+        <w:gridCol w:w="1191"/>
+      </w:tblGrid>
+      <w:tr>
+        <w:tc>
+          <w:tcPr>
+            <w:tcW w:type="dxa" w:w="1701"/>
+            <w:shd w:val="clear" w:color="auto" w:fill="D9E2F3"/>
+          </w:tcPr>
+          <w:p>
+            <w:r>
+              <w:rPr>
+                <w:b/>
+                <w:sz w:val="19"/>
+              </w:rPr>
+              <w:t>Modelo</w:t>
+            </w:r>
+          </w:p>
+        </w:tc>
+        <w:tc>
+          <w:tcPr>
+            <w:tcW w:type="dxa" w:w="1304"/>
+            <w:shd w:val="clear" w:color="auto" w:fill="D9E2F3"/>
+          </w:tcPr>
+          <w:p>
+            <w:r>
+              <w:rPr>
+                <w:b/>
+                <w:sz w:val="19"/>
+              </w:rPr>
+              <w:t>F1 Mendeley (%)</w:t>
+            </w:r>
+          </w:p>
+        </w:tc>
+        <w:tc>
+          <w:tcPr>
+            <w:tcW w:type="dxa" w:w="1134"/>
+            <w:shd w:val="clear" w:color="auto" w:fill="D9E2F3"/>
+          </w:tcPr>
+          <w:p>
+            <w:r>
+              <w:rPr>
+                <w:b/>
+                <w:sz w:val="19"/>
+              </w:rPr>
+              <w:t>AUC Mendeley</w:t>
+            </w:r>
+          </w:p>
+        </w:tc>
+        <w:tc>
+          <w:tcPr>
+            <w:tcW w:type="dxa" w:w="1247"/>
+            <w:shd w:val="clear" w:color="auto" w:fill="D9E2F3"/>
+          </w:tcPr>
+          <w:p>
+            <w:r>
+              <w:rPr>
+                <w:b/>
+                <w:sz w:val="19"/>
+              </w:rPr>
+              <w:t>F1 Trucha (%)</w:t>
+            </w:r>
+          </w:p>
+        </w:tc>
+        <w:tc>
+          <w:tcPr>
+            <w:tcW w:type="dxa" w:w="1247"/>
+            <w:shd w:val="clear" w:color="auto" w:fill="D9E2F3"/>
+          </w:tcPr>
+          <w:p>
+            <w:r>
+              <w:rPr>
+                <w:b/>
+                <w:sz w:val="19"/>
+              </w:rPr>
+              <w:t>F1 Rohu (%)</w:t>
+            </w:r>
+          </w:p>
+        </w:tc>
+        <w:tc>
+          <w:tcPr>
+            <w:tcW w:type="dxa" w:w="1247"/>
+            <w:shd w:val="clear" w:color="auto" w:fill="D9E2F3"/>
+          </w:tcPr>
+          <w:p>
+            <w:r>
+              <w:rPr>
+                <w:b/>
+                <w:sz w:val="19"/>
+              </w:rPr>
+              <w:t>TRD Trucha (%)</w:t>
+            </w:r>
+          </w:p>
+        </w:tc>
+        <w:tc>
+          <w:tcPr>
+            <w:tcW w:type="dxa" w:w="1191"/>
+            <w:shd w:val="clear" w:color="auto" w:fill="D9E2F3"/>
+          </w:tcPr>
+          <w:p>
+            <w:r>
+              <w:rPr>
+                <w:b/>
+                <w:sz w:val="19"/>
+              </w:rPr>
+              <w:t>TRD Rohu (%)</w:t>
+            </w:r>
+          </w:p>
+        </w:tc>
+      </w:tr>
+      <w:tr>
+        <w:tc>
+          <w:tcPr>
+            <w:tcW w:type="dxa" w:w="1701"/>
+          </w:tcPr>
+          <w:p>
+            <w:r>
+              <w:rPr>
+                <w:sz w:val="19"/>
+              </w:rPr>
+              <w:t>ViT-Base/16</w:t>
+            </w:r>
+          </w:p>
+        </w:tc>
+        <w:tc>
+          <w:tcPr>
+            <w:tcW w:type="dxa" w:w="1304"/>
+          </w:tcPr>
+          <w:p>
+            <w:r>
+              <w:rPr>
+                <w:sz w:val="19"/>
+              </w:rPr>
+              <w:t>96.96</w:t>
+            </w:r>
+          </w:p>
+        </w:tc>
+        <w:tc>
+          <w:tcPr>
+            <w:tcW w:type="dxa" w:w="1134"/>
+          </w:tcPr>
+          <w:p>
+            <w:r>
+              <w:rPr>
+                <w:sz w:val="19"/>
+              </w:rPr>
+              <w:t>0.9900</w:t>
+            </w:r>
+          </w:p>
+        </w:tc>
+        <w:tc>
+          <w:tcPr>
+            <w:tcW w:type="dxa" w:w="1247"/>
+          </w:tcPr>
+          <w:p>
+            <w:r>
+              <w:rPr>
+                <w:sz w:val="19"/>
+              </w:rPr>
+              <w:t>86.11</w:t>
+            </w:r>
+          </w:p>
+        </w:tc>
+        <w:tc>
+          <w:tcPr>
+            <w:tcW w:type="dxa" w:w="1247"/>
+          </w:tcPr>
+          <w:p>
+            <w:r>
+              <w:rPr>
+                <w:sz w:val="19"/>
+              </w:rPr>
+              <w:t>88.17</w:t>
+            </w:r>
+          </w:p>
+        </w:tc>
+        <w:tc>
+          <w:tcPr>
+            <w:tcW w:type="dxa" w:w="1247"/>
+          </w:tcPr>
+          <w:p>
+            <w:r>
+              <w:rPr>
+                <w:sz w:val="19"/>
+              </w:rPr>
+              <w:t>88.81</w:t>
+            </w:r>
+          </w:p>
+        </w:tc>
+        <w:tc>
+          <w:tcPr>
+            <w:tcW w:type="dxa" w:w="1191"/>
+          </w:tcPr>
+          <w:p>
+            <w:r>
+              <w:rPr>
+                <w:sz w:val="19"/>
+              </w:rPr>
+              <w:t>90.93</w:t>
+            </w:r>
+          </w:p>
+        </w:tc>
+      </w:tr>
+      <w:tr>
+        <w:tc>
+          <w:tcPr>
+            <w:tcW w:type="dxa" w:w="1701"/>
+          </w:tcPr>
+          <w:p>
+            <w:r>
+              <w:rPr>
+                <w:sz w:val="19"/>
+              </w:rPr>
+              <w:t>DenseNet-121</w:t>
+            </w:r>
+          </w:p>
+        </w:tc>
+        <w:tc>
+          <w:tcPr>
+            <w:tcW w:type="dxa" w:w="1304"/>
+          </w:tcPr>
+          <w:p>
+            <w:r>
+              <w:rPr>
+                <w:sz w:val="19"/>
+              </w:rPr>
+              <w:t>95.66</w:t>
+            </w:r>
+          </w:p>
+        </w:tc>
+        <w:tc>
+          <w:tcPr>
+            <w:tcW w:type="dxa" w:w="1134"/>
+          </w:tcPr>
+          <w:p>
+            <w:r>
+              <w:rPr>
+                <w:sz w:val="19"/>
+              </w:rPr>
+              <w:t>0.9906</w:t>
+            </w:r>
+          </w:p>
+        </w:tc>
+        <w:tc>
+          <w:tcPr>
+            <w:tcW w:type="dxa" w:w="1247"/>
+          </w:tcPr>
+          <w:p>
+            <w:r>
+              <w:rPr>
+                <w:sz w:val="19"/>
+              </w:rPr>
+              <w:t>80.88</w:t>
+            </w:r>
+          </w:p>
+        </w:tc>
+        <w:tc>
+          <w:tcPr>
+            <w:tcW w:type="dxa" w:w="1247"/>
+          </w:tcPr>
+          <w:p>
+            <w:r>
+              <w:rPr>
+                <w:sz w:val="19"/>
+              </w:rPr>
+              <w:t>82.85</w:t>
+            </w:r>
+          </w:p>
+        </w:tc>
+        <w:tc>
+          <w:tcPr>
+            <w:tcW w:type="dxa" w:w="1247"/>
+          </w:tcPr>
+          <w:p>
+            <w:r>
+              <w:rPr>
+                <w:sz w:val="19"/>
+              </w:rPr>
+              <w:t>84.55</w:t>
+            </w:r>
+          </w:p>
+        </w:tc>
+        <w:tc>
+          <w:tcPr>
+            <w:tcW w:type="dxa" w:w="1191"/>
+          </w:tcPr>
+          <w:p>
+            <w:r>
+              <w:rPr>
+                <w:sz w:val="19"/>
+              </w:rPr>
+              <w:t>86.61</w:t>
+            </w:r>
+          </w:p>
+        </w:tc>
+      </w:tr>
+    </w:tbl>
+    <w:p>
+      <w:r>
+        <w:rPr>
+          <w:sz w:val="18"/>
+        </w:rPr>
+        <w:t>Fuente: Elaboración propia.</w:t>
+      </w:r>
+    </w:p>
+    <w:p>
+      <w:pPr>
+        <w:pStyle w:val="ListBullet"/>
+        <w:jc w:val="both"/>
+      </w:pPr>
+      <w:r>
+        <w:rPr>
+          <w:b/>
+        </w:rPr>
+        <w:t xml:space="preserve">Producto de la Fase 1: </w:t>
+      </w:r>
+      <w:r>
+        <w:t>ViT-Base/16 y DenseNet-121 como modelos de referencia, con F1 macro de 96.96% y 95.66% en el dominio fuente.</w:t>
+      </w:r>
+    </w:p>
+    <w:p>
+      <w:pPr>
+        <w:pStyle w:val="ListBullet"/>
+        <w:jc w:val="both"/>
+      </w:pPr>
+      <w:r>
+        <w:rPr>
+          <w:b/>
+        </w:rPr>
+        <w:t xml:space="preserve">Producto de la Fase 2: </w:t>
+      </w:r>
+      <w:r>
+        <w:t>diagnóstico del problema: los modelos pierden entre 8.79 y 14.78 puntos de F1 al cambiar de dominio, y ViT-Base/16 transfiere mejor que DenseNet-121.</w:t>
+      </w:r>
+    </w:p>
+    <w:p>
+      <w:pPr>
+        <w:pStyle w:val="ListBullet"/>
+        <w:jc w:val="both"/>
+      </w:pPr>
+      <w:r>
+        <w:rPr>
+          <w:b/>
+        </w:rPr>
+        <w:t xml:space="preserve">Uso posterior: </w:t>
+      </w:r>
+      <w:r>
+        <w:t>el modelo propuesto deberá superar esta línea base, en especial en los escenarios cross-dataset.</w:t>
+      </w:r>
+    </w:p>
+    <w:p>
+      <w:pPr>
+        <w:jc w:val="both"/>
+      </w:pPr>
+      <w:r>
+        <w:rPr>
+          <w:b/>
+        </w:rPr>
+        <w:t xml:space="preserve">Resultado de la sección. </w:t>
+      </w:r>
+      <w:r>
+        <w:t>línea base experimental consolidada y diagnóstico del efecto de la variabilidad visual.</w:t>
       </w:r>
     </w:p>
     <w:sectPr>

</xml_diff>

<commit_message>
Revierte Documentacion_Tecnica_10_Modelos, Sustento_Seleccion_Modelos y Tabla_Mendeley_10_Modelos a la documentacion original de los 10 modelos; ajusta las referencias del Capitulo III y del README a su numeracion original
Co-Authored-By: Claude Opus 5.5 <noreply@anthropic.com>
Claude-Session: https://claude.ai/code/session_0153ECmVtHffrApi7B7wry8e
</commit_message>
<xml_diff>
--- a/6_documentacion/Flujo_Metodologico_Capitulo_III.docx
+++ b/6_documentacion/Flujo_Metodologico_Capitulo_III.docx
@@ -1025,7 +1025,7 @@
         <w:t xml:space="preserve">Detalle por modelo: </w:t>
       </w:r>
       <w:r>
-        <w:t>curvas de val_F1 por epoch y resultados por fold en Documentacion_Tecnica_10_Modelos.docx, sección 3.4.</w:t>
+        <w:t>curvas de val_F1 por epoch y resultados por fold en Documentacion_Tecnica_10_Modelos.docx, sección 4.</w:t>
       </w:r>
     </w:p>
     <w:p>
@@ -2334,7 +2334,7 @@
         <w:t xml:space="preserve">Resultado de la sección. </w:t>
       </w:r>
       <w:r>
-        <w:t>desempeño comparativo de los diez modelos candidatos. Comparación completa en Documentacion_Tecnica_10_Modelos.docx, sección 3.5; matrices de confusión, curvas ROC y cálculos por fold de cada modelo en su sección 3.4.</w:t>
+        <w:t>desempeño comparativo de los diez modelos candidatos. Comparación completa en Documentacion_Tecnica_10_Modelos.docx, sección 3; matrices de confusión, curvas ROC y cálculos por fold de cada modelo en su sección 4.</w:t>
       </w:r>
     </w:p>
     <w:p>
@@ -2447,7 +2447,7 @@
         <w:t xml:space="preserve">Resultado de la sección. </w:t>
       </w:r>
       <w:r>
-        <w:t>modelos de referencia ViT-Base/16 y DenseNet-121 (línea base experimental). Sustento detallado en Sustento_Seleccion_Modelos.docx (sección 3.6).</w:t>
+        <w:t>modelos de referencia ViT-Base/16 y DenseNet-121 (línea base experimental). Sustento detallado en Sustento_Seleccion_Modelos.docx.</w:t>
       </w:r>
     </w:p>
     <w:p>

</xml_diff>

<commit_message>
Agrega la tabla de corridas experimentales por modelo (corridas, epochs ejecutados, evaluaciones de test y predicciones OOF) al Capitulo III (Tabla 3.2, calculada desde el log) y a Documentacion_Tecnica_10_Modelos (seccion 1.2), con nota sobre los folds sin log
Co-Authored-By: Claude Opus 5.5 <noreply@anthropic.com>
Claude-Session: https://claude.ai/code/session_0153ECmVtHffrApi7B7wry8e
</commit_message>
<xml_diff>
--- a/6_documentacion/Flujo_Metodologico_Capitulo_III.docx
+++ b/6_documentacion/Flujo_Metodologico_Capitulo_III.docx
@@ -985,6 +985,878 @@
     </w:p>
     <w:p>
       <w:pPr>
+        <w:jc w:val="both"/>
+      </w:pPr>
+      <w:r>
+        <w:t>Cada corrida experimental corresponde a un fold: el modelo se entrena con cuatro folds (entrenamiento + validación) y se evalúa una vez sobre el fold restante (prueba). La Tabla 3.2 resume las corridas de cada modelo.</w:t>
+      </w:r>
+    </w:p>
+    <w:p>
+      <w:r>
+        <w:rPr>
+          <w:b/>
+        </w:rPr>
+        <w:t>Tabla 3.2</w:t>
+      </w:r>
+    </w:p>
+    <w:p>
+      <w:r>
+        <w:rPr>
+          <w:i/>
+        </w:rPr>
+        <w:t>Corridas experimentales por modelo candidato</w:t>
+      </w:r>
+    </w:p>
+    <w:tbl>
+      <w:tblPr>
+        <w:tblStyle w:val="TableGrid"/>
+        <w:tblW w:type="auto" w:w="0"/>
+        <w:jc w:val="center"/>
+        <w:tblLayout w:type="fixed"/>
+        <w:tblLook w:firstColumn="1" w:firstRow="1" w:lastColumn="0" w:lastRow="0" w:noHBand="0" w:noVBand="1" w:val="04A0"/>
+      </w:tblPr>
+      <w:tblGrid>
+        <w:gridCol w:w="1984"/>
+        <w:gridCol w:w="1247"/>
+        <w:gridCol w:w="2494"/>
+        <w:gridCol w:w="1474"/>
+        <w:gridCol w:w="1871"/>
+      </w:tblGrid>
+      <w:tr>
+        <w:tc>
+          <w:tcPr>
+            <w:tcW w:type="dxa" w:w="1984"/>
+            <w:shd w:val="clear" w:color="auto" w:fill="D9E2F3"/>
+          </w:tcPr>
+          <w:p>
+            <w:r>
+              <w:rPr>
+                <w:b/>
+                <w:sz w:val="19"/>
+              </w:rPr>
+              <w:t>Modelo</w:t>
+            </w:r>
+          </w:p>
+        </w:tc>
+        <w:tc>
+          <w:tcPr>
+            <w:tcW w:type="dxa" w:w="1247"/>
+            <w:shd w:val="clear" w:color="auto" w:fill="D9E2F3"/>
+          </w:tcPr>
+          <w:p>
+            <w:r>
+              <w:rPr>
+                <w:b/>
+                <w:sz w:val="19"/>
+              </w:rPr>
+              <w:t>Corridas (folds)</w:t>
+            </w:r>
+          </w:p>
+        </w:tc>
+        <w:tc>
+          <w:tcPr>
+            <w:tcW w:type="dxa" w:w="2494"/>
+            <w:shd w:val="clear" w:color="auto" w:fill="D9E2F3"/>
+          </w:tcPr>
+          <w:p>
+            <w:r>
+              <w:rPr>
+                <w:b/>
+                <w:sz w:val="19"/>
+              </w:rPr>
+              <w:t>Epochs ejecutados</w:t>
+            </w:r>
+          </w:p>
+        </w:tc>
+        <w:tc>
+          <w:tcPr>
+            <w:tcW w:type="dxa" w:w="1474"/>
+            <w:shd w:val="clear" w:color="auto" w:fill="D9E2F3"/>
+          </w:tcPr>
+          <w:p>
+            <w:r>
+              <w:rPr>
+                <w:b/>
+                <w:sz w:val="19"/>
+              </w:rPr>
+              <w:t>Evaluaciones de prueba</w:t>
+            </w:r>
+          </w:p>
+        </w:tc>
+        <w:tc>
+          <w:tcPr>
+            <w:tcW w:type="dxa" w:w="1871"/>
+            <w:shd w:val="clear" w:color="auto" w:fill="D9E2F3"/>
+          </w:tcPr>
+          <w:p>
+            <w:r>
+              <w:rPr>
+                <w:b/>
+                <w:sz w:val="19"/>
+              </w:rPr>
+              <w:t>Predicciones OOF</w:t>
+            </w:r>
+          </w:p>
+        </w:tc>
+      </w:tr>
+      <w:tr>
+        <w:tc>
+          <w:tcPr>
+            <w:tcW w:type="dxa" w:w="1984"/>
+          </w:tcPr>
+          <w:p>
+            <w:r>
+              <w:rPr>
+                <w:sz w:val="19"/>
+              </w:rPr>
+              <w:t>ViT-Base/16</w:t>
+            </w:r>
+          </w:p>
+        </w:tc>
+        <w:tc>
+          <w:tcPr>
+            <w:tcW w:type="dxa" w:w="1247"/>
+          </w:tcPr>
+          <w:p>
+            <w:r>
+              <w:rPr>
+                <w:sz w:val="19"/>
+              </w:rPr>
+              <w:t>5</w:t>
+            </w:r>
+          </w:p>
+        </w:tc>
+        <w:tc>
+          <w:tcPr>
+            <w:tcW w:type="dxa" w:w="2494"/>
+          </w:tcPr>
+          <w:p>
+            <w:r>
+              <w:rPr>
+                <w:sz w:val="19"/>
+              </w:rPr>
+              <w:t>90 documentados (folds 3–5)</w:t>
+            </w:r>
+          </w:p>
+        </w:tc>
+        <w:tc>
+          <w:tcPr>
+            <w:tcW w:type="dxa" w:w="1474"/>
+          </w:tcPr>
+          <w:p>
+            <w:r>
+              <w:rPr>
+                <w:sz w:val="19"/>
+              </w:rPr>
+              <w:t>5</w:t>
+            </w:r>
+          </w:p>
+        </w:tc>
+        <w:tc>
+          <w:tcPr>
+            <w:tcW w:type="dxa" w:w="1871"/>
+          </w:tcPr>
+          <w:p>
+            <w:r>
+              <w:rPr>
+                <w:sz w:val="19"/>
+              </w:rPr>
+              <w:t>1,600 × 5 = 8,000</w:t>
+            </w:r>
+          </w:p>
+        </w:tc>
+      </w:tr>
+      <w:tr>
+        <w:tc>
+          <w:tcPr>
+            <w:tcW w:type="dxa" w:w="1984"/>
+          </w:tcPr>
+          <w:p>
+            <w:r>
+              <w:rPr>
+                <w:sz w:val="19"/>
+              </w:rPr>
+              <w:t>DenseNet-121</w:t>
+            </w:r>
+          </w:p>
+        </w:tc>
+        <w:tc>
+          <w:tcPr>
+            <w:tcW w:type="dxa" w:w="1247"/>
+          </w:tcPr>
+          <w:p>
+            <w:r>
+              <w:rPr>
+                <w:sz w:val="19"/>
+              </w:rPr>
+              <w:t>5</w:t>
+            </w:r>
+          </w:p>
+        </w:tc>
+        <w:tc>
+          <w:tcPr>
+            <w:tcW w:type="dxa" w:w="2494"/>
+          </w:tcPr>
+          <w:p>
+            <w:r>
+              <w:rPr>
+                <w:sz w:val="19"/>
+              </w:rPr>
+              <w:t>150</w:t>
+            </w:r>
+          </w:p>
+        </w:tc>
+        <w:tc>
+          <w:tcPr>
+            <w:tcW w:type="dxa" w:w="1474"/>
+          </w:tcPr>
+          <w:p>
+            <w:r>
+              <w:rPr>
+                <w:sz w:val="19"/>
+              </w:rPr>
+              <w:t>5</w:t>
+            </w:r>
+          </w:p>
+        </w:tc>
+        <w:tc>
+          <w:tcPr>
+            <w:tcW w:type="dxa" w:w="1871"/>
+          </w:tcPr>
+          <w:p>
+            <w:r>
+              <w:rPr>
+                <w:sz w:val="19"/>
+              </w:rPr>
+              <w:t>1,600 × 5 = 8,000</w:t>
+            </w:r>
+          </w:p>
+        </w:tc>
+      </w:tr>
+      <w:tr>
+        <w:tc>
+          <w:tcPr>
+            <w:tcW w:type="dxa" w:w="1984"/>
+          </w:tcPr>
+          <w:p>
+            <w:r>
+              <w:rPr>
+                <w:sz w:val="19"/>
+              </w:rPr>
+              <w:t>Swin-Base</w:t>
+            </w:r>
+          </w:p>
+        </w:tc>
+        <w:tc>
+          <w:tcPr>
+            <w:tcW w:type="dxa" w:w="1247"/>
+          </w:tcPr>
+          <w:p>
+            <w:r>
+              <w:rPr>
+                <w:sz w:val="19"/>
+              </w:rPr>
+              <w:t>5</w:t>
+            </w:r>
+          </w:p>
+        </w:tc>
+        <w:tc>
+          <w:tcPr>
+            <w:tcW w:type="dxa" w:w="2494"/>
+          </w:tcPr>
+          <w:p>
+            <w:r>
+              <w:rPr>
+                <w:sz w:val="19"/>
+              </w:rPr>
+              <w:t>145</w:t>
+            </w:r>
+          </w:p>
+        </w:tc>
+        <w:tc>
+          <w:tcPr>
+            <w:tcW w:type="dxa" w:w="1474"/>
+          </w:tcPr>
+          <w:p>
+            <w:r>
+              <w:rPr>
+                <w:sz w:val="19"/>
+              </w:rPr>
+              <w:t>5</w:t>
+            </w:r>
+          </w:p>
+        </w:tc>
+        <w:tc>
+          <w:tcPr>
+            <w:tcW w:type="dxa" w:w="1871"/>
+          </w:tcPr>
+          <w:p>
+            <w:r>
+              <w:rPr>
+                <w:sz w:val="19"/>
+              </w:rPr>
+              <w:t>1,600 × 5 = 8,000</w:t>
+            </w:r>
+          </w:p>
+        </w:tc>
+      </w:tr>
+      <w:tr>
+        <w:tc>
+          <w:tcPr>
+            <w:tcW w:type="dxa" w:w="1984"/>
+          </w:tcPr>
+          <w:p>
+            <w:r>
+              <w:rPr>
+                <w:sz w:val="19"/>
+              </w:rPr>
+              <w:t>DINOv2-Small</w:t>
+            </w:r>
+          </w:p>
+        </w:tc>
+        <w:tc>
+          <w:tcPr>
+            <w:tcW w:type="dxa" w:w="1247"/>
+          </w:tcPr>
+          <w:p>
+            <w:r>
+              <w:rPr>
+                <w:sz w:val="19"/>
+              </w:rPr>
+              <w:t>5</w:t>
+            </w:r>
+          </w:p>
+        </w:tc>
+        <w:tc>
+          <w:tcPr>
+            <w:tcW w:type="dxa" w:w="2494"/>
+          </w:tcPr>
+          <w:p>
+            <w:r>
+              <w:rPr>
+                <w:sz w:val="19"/>
+              </w:rPr>
+              <w:t>150</w:t>
+            </w:r>
+          </w:p>
+        </w:tc>
+        <w:tc>
+          <w:tcPr>
+            <w:tcW w:type="dxa" w:w="1474"/>
+          </w:tcPr>
+          <w:p>
+            <w:r>
+              <w:rPr>
+                <w:sz w:val="19"/>
+              </w:rPr>
+              <w:t>5</w:t>
+            </w:r>
+          </w:p>
+        </w:tc>
+        <w:tc>
+          <w:tcPr>
+            <w:tcW w:type="dxa" w:w="1871"/>
+          </w:tcPr>
+          <w:p>
+            <w:r>
+              <w:rPr>
+                <w:sz w:val="19"/>
+              </w:rPr>
+              <w:t>1,600 × 5 = 8,000</w:t>
+            </w:r>
+          </w:p>
+        </w:tc>
+      </w:tr>
+      <w:tr>
+        <w:tc>
+          <w:tcPr>
+            <w:tcW w:type="dxa" w:w="1984"/>
+          </w:tcPr>
+          <w:p>
+            <w:r>
+              <w:rPr>
+                <w:sz w:val="19"/>
+              </w:rPr>
+              <w:t>EfficientNet-B0</w:t>
+            </w:r>
+          </w:p>
+        </w:tc>
+        <w:tc>
+          <w:tcPr>
+            <w:tcW w:type="dxa" w:w="1247"/>
+          </w:tcPr>
+          <w:p>
+            <w:r>
+              <w:rPr>
+                <w:sz w:val="19"/>
+              </w:rPr>
+              <w:t>5</w:t>
+            </w:r>
+          </w:p>
+        </w:tc>
+        <w:tc>
+          <w:tcPr>
+            <w:tcW w:type="dxa" w:w="2494"/>
+          </w:tcPr>
+          <w:p>
+            <w:r>
+              <w:rPr>
+                <w:sz w:val="19"/>
+              </w:rPr>
+              <w:t>150</w:t>
+            </w:r>
+          </w:p>
+        </w:tc>
+        <w:tc>
+          <w:tcPr>
+            <w:tcW w:type="dxa" w:w="1474"/>
+          </w:tcPr>
+          <w:p>
+            <w:r>
+              <w:rPr>
+                <w:sz w:val="19"/>
+              </w:rPr>
+              <w:t>5</w:t>
+            </w:r>
+          </w:p>
+        </w:tc>
+        <w:tc>
+          <w:tcPr>
+            <w:tcW w:type="dxa" w:w="1871"/>
+          </w:tcPr>
+          <w:p>
+            <w:r>
+              <w:rPr>
+                <w:sz w:val="19"/>
+              </w:rPr>
+              <w:t>1,600 × 5 = 8,000</w:t>
+            </w:r>
+          </w:p>
+        </w:tc>
+      </w:tr>
+      <w:tr>
+        <w:tc>
+          <w:tcPr>
+            <w:tcW w:type="dxa" w:w="1984"/>
+          </w:tcPr>
+          <w:p>
+            <w:r>
+              <w:rPr>
+                <w:sz w:val="19"/>
+              </w:rPr>
+              <w:t>EfficientNet-Lite0</w:t>
+            </w:r>
+          </w:p>
+        </w:tc>
+        <w:tc>
+          <w:tcPr>
+            <w:tcW w:type="dxa" w:w="1247"/>
+          </w:tcPr>
+          <w:p>
+            <w:r>
+              <w:rPr>
+                <w:sz w:val="19"/>
+              </w:rPr>
+              <w:t>5</w:t>
+            </w:r>
+          </w:p>
+        </w:tc>
+        <w:tc>
+          <w:tcPr>
+            <w:tcW w:type="dxa" w:w="2494"/>
+          </w:tcPr>
+          <w:p>
+            <w:r>
+              <w:rPr>
+                <w:sz w:val="19"/>
+              </w:rPr>
+              <w:t>sin registro en el log</w:t>
+            </w:r>
+          </w:p>
+        </w:tc>
+        <w:tc>
+          <w:tcPr>
+            <w:tcW w:type="dxa" w:w="1474"/>
+          </w:tcPr>
+          <w:p>
+            <w:r>
+              <w:rPr>
+                <w:sz w:val="19"/>
+              </w:rPr>
+              <w:t>5</w:t>
+            </w:r>
+          </w:p>
+        </w:tc>
+        <w:tc>
+          <w:tcPr>
+            <w:tcW w:type="dxa" w:w="1871"/>
+          </w:tcPr>
+          <w:p>
+            <w:r>
+              <w:rPr>
+                <w:sz w:val="19"/>
+              </w:rPr>
+              <w:t>1,600 × 5 = 8,000</w:t>
+            </w:r>
+          </w:p>
+        </w:tc>
+      </w:tr>
+      <w:tr>
+        <w:tc>
+          <w:tcPr>
+            <w:tcW w:type="dxa" w:w="1984"/>
+          </w:tcPr>
+          <w:p>
+            <w:r>
+              <w:rPr>
+                <w:sz w:val="19"/>
+              </w:rPr>
+              <w:t>MobileNetV3-Small</w:t>
+            </w:r>
+          </w:p>
+        </w:tc>
+        <w:tc>
+          <w:tcPr>
+            <w:tcW w:type="dxa" w:w="1247"/>
+          </w:tcPr>
+          <w:p>
+            <w:r>
+              <w:rPr>
+                <w:sz w:val="19"/>
+              </w:rPr>
+              <w:t>5</w:t>
+            </w:r>
+          </w:p>
+        </w:tc>
+        <w:tc>
+          <w:tcPr>
+            <w:tcW w:type="dxa" w:w="2494"/>
+          </w:tcPr>
+          <w:p>
+            <w:r>
+              <w:rPr>
+                <w:sz w:val="19"/>
+              </w:rPr>
+              <w:t>sin registro en el log</w:t>
+            </w:r>
+          </w:p>
+        </w:tc>
+        <w:tc>
+          <w:tcPr>
+            <w:tcW w:type="dxa" w:w="1474"/>
+          </w:tcPr>
+          <w:p>
+            <w:r>
+              <w:rPr>
+                <w:sz w:val="19"/>
+              </w:rPr>
+              <w:t>5</w:t>
+            </w:r>
+          </w:p>
+        </w:tc>
+        <w:tc>
+          <w:tcPr>
+            <w:tcW w:type="dxa" w:w="1871"/>
+          </w:tcPr>
+          <w:p>
+            <w:r>
+              <w:rPr>
+                <w:sz w:val="19"/>
+              </w:rPr>
+              <w:t>1,600 × 5 = 8,000</w:t>
+            </w:r>
+          </w:p>
+        </w:tc>
+      </w:tr>
+      <w:tr>
+        <w:tc>
+          <w:tcPr>
+            <w:tcW w:type="dxa" w:w="1984"/>
+          </w:tcPr>
+          <w:p>
+            <w:r>
+              <w:rPr>
+                <w:sz w:val="19"/>
+              </w:rPr>
+              <w:t>ResNet-50</w:t>
+            </w:r>
+          </w:p>
+        </w:tc>
+        <w:tc>
+          <w:tcPr>
+            <w:tcW w:type="dxa" w:w="1247"/>
+          </w:tcPr>
+          <w:p>
+            <w:r>
+              <w:rPr>
+                <w:sz w:val="19"/>
+              </w:rPr>
+              <w:t>5</w:t>
+            </w:r>
+          </w:p>
+        </w:tc>
+        <w:tc>
+          <w:tcPr>
+            <w:tcW w:type="dxa" w:w="2494"/>
+          </w:tcPr>
+          <w:p>
+            <w:r>
+              <w:rPr>
+                <w:sz w:val="19"/>
+              </w:rPr>
+              <w:t>148</w:t>
+            </w:r>
+          </w:p>
+        </w:tc>
+        <w:tc>
+          <w:tcPr>
+            <w:tcW w:type="dxa" w:w="1474"/>
+          </w:tcPr>
+          <w:p>
+            <w:r>
+              <w:rPr>
+                <w:sz w:val="19"/>
+              </w:rPr>
+              <w:t>5</w:t>
+            </w:r>
+          </w:p>
+        </w:tc>
+        <w:tc>
+          <w:tcPr>
+            <w:tcW w:type="dxa" w:w="1871"/>
+          </w:tcPr>
+          <w:p>
+            <w:r>
+              <w:rPr>
+                <w:sz w:val="19"/>
+              </w:rPr>
+              <w:t>1,600 × 5 = 8,000</w:t>
+            </w:r>
+          </w:p>
+        </w:tc>
+      </w:tr>
+      <w:tr>
+        <w:tc>
+          <w:tcPr>
+            <w:tcW w:type="dxa" w:w="1984"/>
+          </w:tcPr>
+          <w:p>
+            <w:r>
+              <w:rPr>
+                <w:sz w:val="19"/>
+              </w:rPr>
+              <w:t>MobileNetV2</w:t>
+            </w:r>
+          </w:p>
+        </w:tc>
+        <w:tc>
+          <w:tcPr>
+            <w:tcW w:type="dxa" w:w="1247"/>
+          </w:tcPr>
+          <w:p>
+            <w:r>
+              <w:rPr>
+                <w:sz w:val="19"/>
+              </w:rPr>
+              <w:t>5</w:t>
+            </w:r>
+          </w:p>
+        </w:tc>
+        <w:tc>
+          <w:tcPr>
+            <w:tcW w:type="dxa" w:w="2494"/>
+          </w:tcPr>
+          <w:p>
+            <w:r>
+              <w:rPr>
+                <w:sz w:val="19"/>
+              </w:rPr>
+              <w:t>150</w:t>
+            </w:r>
+          </w:p>
+        </w:tc>
+        <w:tc>
+          <w:tcPr>
+            <w:tcW w:type="dxa" w:w="1474"/>
+          </w:tcPr>
+          <w:p>
+            <w:r>
+              <w:rPr>
+                <w:sz w:val="19"/>
+              </w:rPr>
+              <w:t>5</w:t>
+            </w:r>
+          </w:p>
+        </w:tc>
+        <w:tc>
+          <w:tcPr>
+            <w:tcW w:type="dxa" w:w="1871"/>
+          </w:tcPr>
+          <w:p>
+            <w:r>
+              <w:rPr>
+                <w:sz w:val="19"/>
+              </w:rPr>
+              <w:t>1,600 × 5 = 8,000</w:t>
+            </w:r>
+          </w:p>
+        </w:tc>
+      </w:tr>
+      <w:tr>
+        <w:tc>
+          <w:tcPr>
+            <w:tcW w:type="dxa" w:w="1984"/>
+          </w:tcPr>
+          <w:p>
+            <w:r>
+              <w:rPr>
+                <w:sz w:val="19"/>
+              </w:rPr>
+              <w:t>MobileNetV1</w:t>
+            </w:r>
+          </w:p>
+        </w:tc>
+        <w:tc>
+          <w:tcPr>
+            <w:tcW w:type="dxa" w:w="1247"/>
+          </w:tcPr>
+          <w:p>
+            <w:r>
+              <w:rPr>
+                <w:sz w:val="19"/>
+              </w:rPr>
+              <w:t>5</w:t>
+            </w:r>
+          </w:p>
+        </w:tc>
+        <w:tc>
+          <w:tcPr>
+            <w:tcW w:type="dxa" w:w="2494"/>
+          </w:tcPr>
+          <w:p>
+            <w:r>
+              <w:rPr>
+                <w:sz w:val="19"/>
+              </w:rPr>
+              <w:t>150</w:t>
+            </w:r>
+          </w:p>
+        </w:tc>
+        <w:tc>
+          <w:tcPr>
+            <w:tcW w:type="dxa" w:w="1474"/>
+          </w:tcPr>
+          <w:p>
+            <w:r>
+              <w:rPr>
+                <w:sz w:val="19"/>
+              </w:rPr>
+              <w:t>5</w:t>
+            </w:r>
+          </w:p>
+        </w:tc>
+        <w:tc>
+          <w:tcPr>
+            <w:tcW w:type="dxa" w:w="1871"/>
+          </w:tcPr>
+          <w:p>
+            <w:r>
+              <w:rPr>
+                <w:sz w:val="19"/>
+              </w:rPr>
+              <w:t>1,600 × 5 = 8,000</w:t>
+            </w:r>
+          </w:p>
+        </w:tc>
+      </w:tr>
+      <w:tr>
+        <w:tc>
+          <w:tcPr>
+            <w:tcW w:type="dxa" w:w="1984"/>
+            <w:shd w:val="clear" w:color="auto" w:fill="FFF2CC"/>
+          </w:tcPr>
+          <w:p>
+            <w:r>
+              <w:rPr>
+                <w:b/>
+                <w:sz w:val="19"/>
+              </w:rPr>
+              <w:t>Total</w:t>
+            </w:r>
+          </w:p>
+        </w:tc>
+        <w:tc>
+          <w:tcPr>
+            <w:tcW w:type="dxa" w:w="1247"/>
+            <w:shd w:val="clear" w:color="auto" w:fill="FFF2CC"/>
+          </w:tcPr>
+          <w:p>
+            <w:r>
+              <w:rPr>
+                <w:b/>
+                <w:sz w:val="19"/>
+              </w:rPr>
+              <w:t>50</w:t>
+            </w:r>
+          </w:p>
+        </w:tc>
+        <w:tc>
+          <w:tcPr>
+            <w:tcW w:type="dxa" w:w="2494"/>
+            <w:shd w:val="clear" w:color="auto" w:fill="FFF2CC"/>
+          </w:tcPr>
+          <w:p>
+            <w:r>
+              <w:rPr>
+                <w:b/>
+                <w:sz w:val="19"/>
+              </w:rPr>
+              <w:t>—</w:t>
+            </w:r>
+          </w:p>
+        </w:tc>
+        <w:tc>
+          <w:tcPr>
+            <w:tcW w:type="dxa" w:w="1474"/>
+            <w:shd w:val="clear" w:color="auto" w:fill="FFF2CC"/>
+          </w:tcPr>
+          <w:p>
+            <w:r>
+              <w:rPr>
+                <w:b/>
+                <w:sz w:val="19"/>
+              </w:rPr>
+              <w:t>50</w:t>
+            </w:r>
+          </w:p>
+        </w:tc>
+        <w:tc>
+          <w:tcPr>
+            <w:tcW w:type="dxa" w:w="1871"/>
+            <w:shd w:val="clear" w:color="auto" w:fill="FFF2CC"/>
+          </w:tcPr>
+          <w:p>
+            <w:r>
+              <w:rPr>
+                <w:b/>
+                <w:sz w:val="19"/>
+              </w:rPr>
+              <w:t>80,000</w:t>
+            </w:r>
+          </w:p>
+        </w:tc>
+      </w:tr>
+    </w:tbl>
+    <w:p>
+      <w:r>
+        <w:rPr>
+          <w:sz w:val="18"/>
+        </w:rPr>
+        <w:t>Nota. Epochs ejecutados = suma de los 5 folds (máximo 30 por fold; menos de 150 indica early stopping: Swin-Base se detuvo en el epoch 25 del fold 4 y ResNet-50 en el 28 del fold 3). El entrenamiento se interrumpió y se reanudó; el log conservado (2_logs_entrenamiento/dnc_5fold_resume.log) no incluye ViT-Base/16 folds 1 y 2 ni EfficientNet-Lite0 y MobileNetV3-Small. Sus checkpoints y resultados de prueba sí existen y forman parte de las Tablas 3.3 y siguientes; solo falta la curva de val_F1 por epoch.</w:t>
+      </w:r>
+    </w:p>
+    <w:p>
+      <w:pPr>
         <w:pStyle w:val="ListBullet"/>
         <w:jc w:val="both"/>
       </w:pPr>
@@ -1063,7 +1935,7 @@
         <w:rPr>
           <w:b/>
         </w:rPr>
-        <w:t>Tabla 3.2</w:t>
+        <w:t>Tabla 3.3</w:t>
       </w:r>
     </w:p>
     <w:p>
@@ -2546,7 +3418,7 @@
         <w:rPr>
           <w:b/>
         </w:rPr>
-        <w:t>Tabla 3.3</w:t>
+        <w:t>Tabla 3.4</w:t>
       </w:r>
     </w:p>
     <w:p>
@@ -3074,7 +3946,7 @@
         <w:rPr>
           <w:b/>
         </w:rPr>
-        <w:t>Tabla 3.4</w:t>
+        <w:t>Tabla 3.5</w:t>
       </w:r>
     </w:p>
     <w:p>
@@ -3709,7 +4581,7 @@
         <w:jc w:val="both"/>
       </w:pPr>
       <w:r>
-        <w:t>La Tabla 3.5 reúne los resultados de ambas fases para los dos modelos de referencia. Constituye la línea base experimental frente a la cual se comparará el modelo propuesto en el Capítulo IV y se validará en el Capítulo V.</w:t>
+        <w:t>La Tabla 3.6 reúne los resultados de ambas fases para los dos modelos de referencia. Constituye la línea base experimental frente a la cual se comparará el modelo propuesto en el Capítulo IV y se validará en el Capítulo V.</w:t>
       </w:r>
     </w:p>
     <w:p>
@@ -3717,7 +4589,7 @@
         <w:rPr>
           <w:b/>
         </w:rPr>
-        <w:t>Tabla 3.5</w:t>
+        <w:t>Tabla 3.6</w:t>
       </w:r>
     </w:p>
     <w:p>

</xml_diff>

<commit_message>
Agrega las curvas de val_F1 por epoch que faltaban (ViT-Base/16 folds 1-2, EfficientNet-Lite0 y MobileNetV3-Small) y los 10 modelos candidatos en la metodologia
- Reentreno de los 12 folds sin curva con el mismo codigo, datos y semilla, guardado aparte
  (dnc_5fold_full_metrics.py acepta un dir_salida opcional). Reprodujo exactamente el mejor
  val_F1 y el F1 de test originales; las metricas reportadas siguen siendo las originales.
- Log del reentreno: 2_logs_entrenamiento/dnc_reentreno_curvas.log
- Documentacion_Tecnica_10_Modelos: subseccion "Modelos candidatos" con tabla en 1. Metodologia,
  figura del flujo con "10 modelos candidatos", epochs completos en la tabla de corridas y
  secciones 4.1.1 (5 folds), 4.6.1 y 4.7.1 con la misma estructura que los otros 7 modelos.
- Capitulo III: Tabla 3.2 con los epochs de los 10 modelos (total 1,479).

Co-Authored-By: Claude Opus 5.5 <noreply@anthropic.com>
Claude-Session: https://claude.ai/code/session_0153ECmVtHffrApi7B7wry8e
</commit_message>
<xml_diff>
--- a/6_documentacion/Flujo_Metodologico_Capitulo_III.docx
+++ b/6_documentacion/Flujo_Metodologico_Capitulo_III.docx
@@ -1135,7 +1135,7 @@
               <w:rPr>
                 <w:sz w:val="19"/>
               </w:rPr>
-              <w:t>90 documentados (folds 3–5)</w:t>
+              <w:t>143</w:t>
             </w:r>
           </w:p>
         </w:tc>
@@ -1470,7 +1470,7 @@
               <w:rPr>
                 <w:sz w:val="19"/>
               </w:rPr>
-              <w:t>sin registro en el log</w:t>
+              <w:t>143</w:t>
             </w:r>
           </w:p>
         </w:tc>
@@ -1537,7 +1537,7 @@
               <w:rPr>
                 <w:sz w:val="19"/>
               </w:rPr>
-              <w:t>sin registro en el log</w:t>
+              <w:t>150</w:t>
             </w:r>
           </w:p>
         </w:tc>
@@ -1811,7 +1811,7 @@
                 <w:b/>
                 <w:sz w:val="19"/>
               </w:rPr>
-              <w:t>—</w:t>
+              <w:t>1,479</w:t>
             </w:r>
           </w:p>
         </w:tc>
@@ -1852,7 +1852,7 @@
         <w:rPr>
           <w:sz w:val="18"/>
         </w:rPr>
-        <w:t>Nota. Epochs ejecutados = suma de los 5 folds (máximo 30 por fold; menos de 150 indica early stopping: Swin-Base se detuvo en el epoch 25 del fold 4 y ResNet-50 en el 28 del fold 3). El entrenamiento se interrumpió y se reanudó; el log conservado (2_logs_entrenamiento/dnc_5fold_resume.log) no incluye ViT-Base/16 folds 1 y 2 ni EfficientNet-Lite0 y MobileNetV3-Small. Sus checkpoints y resultados de prueba sí existen y forman parte de las Tablas 3.3 y siguientes; solo falta la curva de val_F1 por epoch.</w:t>
+        <w:t>Nota. Epochs ejecutados = suma de los 5 folds (máximo 30 por fold; menos de 150 indica early stopping: Swin-Base se detuvo en el epoch 25 del fold 4, ResNet-50 en el 28 del fold 3, ViT-Base/16 en el 23 del fold 2 y EfficientNet-Lite0 en el 23 del fold 3). El entrenamiento se interrumpió y se reanudó; el log de la corrida reanudada (2_logs_entrenamiento/dnc_5fold_resume.log) no incluye ViT-Base/16 folds 1 y 2 ni EfficientNet-Lite0 y MobileNetV3-Small. Esos 12 folds se reentrenaron con el mismo código, datos y semilla solo para recuperar su curva de val_F1 por epoch (2_logs_entrenamiento/dnc_reentreno_curvas.log). El reentreno reprodujo exactamente el mejor val_F1 y el F1 de prueba de los 12 folds originales. Las métricas de las Tablas 3.3 y siguientes son las originales; el reentreno no las reemplaza.</w:t>
       </w:r>
     </w:p>
     <w:p>

</xml_diff>